<commit_message>
feat(expenses): add expenses page with CRUD, filters, and modal
</commit_message>
<xml_diff>
--- a/Spendwise Important Points.docx
+++ b/Spendwise Important Points.docx
@@ -741,23 +741,13 @@
           <w:szCs w:val="28"/>
         </w:rPr>
       </w:pPr>
-      <w:proofErr w:type="gramStart"/>
-      <w:r>
-        <w:rPr>
-          <w:rFonts w:ascii="Times New Roman" w:hAnsi="Times New Roman" w:cs="Times New Roman"/>
-          <w:sz w:val="28"/>
-          <w:szCs w:val="28"/>
-        </w:rPr>
-        <w:t>│  →</w:t>
-      </w:r>
-      <w:proofErr w:type="gramEnd"/>
-      <w:r>
-        <w:rPr>
-          <w:rFonts w:ascii="Times New Roman" w:hAnsi="Times New Roman" w:cs="Times New Roman"/>
-          <w:sz w:val="28"/>
-          <w:szCs w:val="28"/>
-        </w:rPr>
-        <w:t xml:space="preserve"> Attaches to every API request automatically  </w:t>
+      <w:r>
+        <w:rPr>
+          <w:rFonts w:ascii="Times New Roman" w:hAnsi="Times New Roman" w:cs="Times New Roman"/>
+          <w:sz w:val="28"/>
+          <w:szCs w:val="28"/>
+        </w:rPr>
+        <w:t xml:space="preserve">│  → Attaches to every API request automatically  </w:t>
       </w:r>
     </w:p>
     <w:p>
@@ -811,23 +801,13 @@
           <w:szCs w:val="28"/>
         </w:rPr>
       </w:pPr>
-      <w:proofErr w:type="gramStart"/>
-      <w:r>
-        <w:rPr>
-          <w:rFonts w:ascii="Times New Roman" w:hAnsi="Times New Roman" w:cs="Times New Roman"/>
-          <w:sz w:val="28"/>
-          <w:szCs w:val="28"/>
-        </w:rPr>
-        <w:t>│  Cookie</w:t>
-      </w:r>
-      <w:proofErr w:type="gramEnd"/>
-      <w:r>
-        <w:rPr>
-          <w:rFonts w:ascii="Times New Roman" w:hAnsi="Times New Roman" w:cs="Times New Roman"/>
-          <w:sz w:val="28"/>
-          <w:szCs w:val="28"/>
-        </w:rPr>
-        <w:t>['</w:t>
+      <w:r>
+        <w:rPr>
+          <w:rFonts w:ascii="Times New Roman" w:hAnsi="Times New Roman" w:cs="Times New Roman"/>
+          <w:sz w:val="28"/>
+          <w:szCs w:val="28"/>
+        </w:rPr>
+        <w:t>│  Cookie['</w:t>
       </w:r>
       <w:proofErr w:type="spellStart"/>
       <w:r>
@@ -874,23 +854,13 @@
           <w:szCs w:val="28"/>
         </w:rPr>
       </w:pPr>
-      <w:proofErr w:type="gramStart"/>
-      <w:r>
-        <w:rPr>
-          <w:rFonts w:ascii="Times New Roman" w:hAnsi="Times New Roman" w:cs="Times New Roman"/>
-          <w:sz w:val="28"/>
-          <w:szCs w:val="28"/>
-        </w:rPr>
-        <w:t>│  →</w:t>
-      </w:r>
-      <w:proofErr w:type="gramEnd"/>
-      <w:r>
-        <w:rPr>
-          <w:rFonts w:ascii="Times New Roman" w:hAnsi="Times New Roman" w:cs="Times New Roman"/>
-          <w:sz w:val="28"/>
-          <w:szCs w:val="28"/>
-        </w:rPr>
-        <w:t xml:space="preserve"> Used by: </w:t>
+      <w:r>
+        <w:rPr>
+          <w:rFonts w:ascii="Times New Roman" w:hAnsi="Times New Roman" w:cs="Times New Roman"/>
+          <w:sz w:val="28"/>
+          <w:szCs w:val="28"/>
+        </w:rPr>
+        <w:t xml:space="preserve">│  → Used by: </w:t>
       </w:r>
       <w:proofErr w:type="spellStart"/>
       <w:r>
@@ -919,23 +889,13 @@
           <w:szCs w:val="28"/>
         </w:rPr>
       </w:pPr>
-      <w:proofErr w:type="gramStart"/>
-      <w:r>
-        <w:rPr>
-          <w:rFonts w:ascii="Times New Roman" w:hAnsi="Times New Roman" w:cs="Times New Roman"/>
-          <w:sz w:val="28"/>
-          <w:szCs w:val="28"/>
-        </w:rPr>
-        <w:t>│  →</w:t>
-      </w:r>
-      <w:proofErr w:type="gramEnd"/>
-      <w:r>
-        <w:rPr>
-          <w:rFonts w:ascii="Times New Roman" w:hAnsi="Times New Roman" w:cs="Times New Roman"/>
-          <w:sz w:val="28"/>
-          <w:szCs w:val="28"/>
-        </w:rPr>
-        <w:t xml:space="preserve"> Protects /dashboard, /expenses etc.          </w:t>
+      <w:r>
+        <w:rPr>
+          <w:rFonts w:ascii="Times New Roman" w:hAnsi="Times New Roman" w:cs="Times New Roman"/>
+          <w:sz w:val="28"/>
+          <w:szCs w:val="28"/>
+        </w:rPr>
+        <w:t xml:space="preserve">│  → Protects /dashboard, /expenses etc.          </w:t>
       </w:r>
     </w:p>
     <w:p>
@@ -996,6 +956,32 @@
           <w:szCs w:val="28"/>
         </w:rPr>
         <w:t xml:space="preserve">  Both are deleted → user is completely signed out</w:t>
+      </w:r>
+    </w:p>
+    <w:p>
+      <w:pPr>
+        <w:rPr>
+          <w:rFonts w:ascii="Times New Roman" w:hAnsi="Times New Roman" w:cs="Times New Roman"/>
+          <w:sz w:val="28"/>
+          <w:szCs w:val="28"/>
+        </w:rPr>
+      </w:pPr>
+    </w:p>
+    <w:p>
+      <w:pPr>
+        <w:rPr>
+          <w:rFonts w:ascii="Times New Roman" w:hAnsi="Times New Roman" w:cs="Times New Roman"/>
+          <w:sz w:val="28"/>
+          <w:szCs w:val="28"/>
+        </w:rPr>
+      </w:pPr>
+      <w:r>
+        <w:rPr>
+          <w:rFonts w:ascii="Times New Roman" w:hAnsi="Times New Roman" w:cs="Times New Roman"/>
+          <w:sz w:val="28"/>
+          <w:szCs w:val="28"/>
+        </w:rPr>
+        <w:t>Why put API calls in a hook instead of directly in the page? Because the page component stays clean and readable. The hook handles loading, error, and data state in one place. Multiple components can reuse the same hook.</w:t>
       </w:r>
     </w:p>
     <w:p>

</xml_diff>

<commit_message>
feat(budgets): add budgets page with progress bars and alert system
</commit_message>
<xml_diff>
--- a/Spendwise Important Points.docx
+++ b/Spendwise Important Points.docx
@@ -16,25 +16,7 @@
           <w:sz w:val="28"/>
           <w:szCs w:val="28"/>
         </w:rPr>
-        <w:t xml:space="preserve">           </w:t>
-      </w:r>
-      <w:proofErr w:type="spellStart"/>
-      <w:r>
-        <w:rPr>
-          <w:rFonts w:ascii="Times New Roman" w:hAnsi="Times New Roman" w:cs="Times New Roman"/>
-          <w:sz w:val="28"/>
-          <w:szCs w:val="28"/>
-        </w:rPr>
-        <w:t>Spendwise</w:t>
-      </w:r>
-      <w:proofErr w:type="spellEnd"/>
-      <w:r>
-        <w:rPr>
-          <w:rFonts w:ascii="Times New Roman" w:hAnsi="Times New Roman" w:cs="Times New Roman"/>
-          <w:sz w:val="28"/>
-          <w:szCs w:val="28"/>
-        </w:rPr>
-        <w:t xml:space="preserve"> Important Points</w:t>
+        <w:t xml:space="preserve">           Spendwise Important Points</w:t>
       </w:r>
     </w:p>
     <w:p>
@@ -94,95 +76,41 @@
           <w:sz w:val="28"/>
           <w:szCs w:val="28"/>
         </w:rPr>
-        <w:t xml:space="preserve">  </w:t>
-      </w:r>
-      <w:proofErr w:type="spellStart"/>
-      <w:r>
-        <w:rPr>
-          <w:rFonts w:ascii="Times New Roman" w:hAnsi="Times New Roman" w:cs="Times New Roman"/>
-          <w:sz w:val="28"/>
-          <w:szCs w:val="28"/>
-        </w:rPr>
-        <w:t>middleware.ts</w:t>
-      </w:r>
-      <w:proofErr w:type="spellEnd"/>
-      <w:r>
-        <w:rPr>
-          <w:rFonts w:ascii="Times New Roman" w:hAnsi="Times New Roman" w:cs="Times New Roman"/>
-          <w:sz w:val="28"/>
-          <w:szCs w:val="28"/>
-        </w:rPr>
-        <w:t xml:space="preserve"> runs on the SERVER</w:t>
-      </w:r>
-    </w:p>
-    <w:p>
-      <w:pPr>
-        <w:rPr>
-          <w:rFonts w:ascii="Times New Roman" w:hAnsi="Times New Roman" w:cs="Times New Roman"/>
-          <w:sz w:val="28"/>
-          <w:szCs w:val="28"/>
-        </w:rPr>
-      </w:pPr>
-      <w:r>
-        <w:rPr>
-          <w:rFonts w:ascii="Times New Roman" w:hAnsi="Times New Roman" w:cs="Times New Roman"/>
-          <w:sz w:val="28"/>
-          <w:szCs w:val="28"/>
-        </w:rPr>
-        <w:t xml:space="preserve">  </w:t>
-      </w:r>
-      <w:proofErr w:type="spellStart"/>
-      <w:r>
-        <w:rPr>
-          <w:rFonts w:ascii="Times New Roman" w:hAnsi="Times New Roman" w:cs="Times New Roman"/>
-          <w:sz w:val="28"/>
-          <w:szCs w:val="28"/>
-        </w:rPr>
-        <w:t>localStorage</w:t>
-      </w:r>
-      <w:proofErr w:type="spellEnd"/>
-      <w:r>
-        <w:rPr>
-          <w:rFonts w:ascii="Times New Roman" w:hAnsi="Times New Roman" w:cs="Times New Roman"/>
-          <w:sz w:val="28"/>
-          <w:szCs w:val="28"/>
-        </w:rPr>
-        <w:t xml:space="preserve"> exists only in the BROWSER</w:t>
-      </w:r>
-    </w:p>
-    <w:p>
-      <w:pPr>
-        <w:rPr>
-          <w:rFonts w:ascii="Times New Roman" w:hAnsi="Times New Roman" w:cs="Times New Roman"/>
-          <w:sz w:val="28"/>
-          <w:szCs w:val="28"/>
-        </w:rPr>
-      </w:pPr>
-      <w:r>
-        <w:rPr>
-          <w:rFonts w:ascii="Times New Roman" w:hAnsi="Times New Roman" w:cs="Times New Roman"/>
-          <w:sz w:val="28"/>
-          <w:szCs w:val="28"/>
-        </w:rPr>
-        <w:t xml:space="preserve">  Server cannot read </w:t>
-      </w:r>
-      <w:proofErr w:type="spellStart"/>
-      <w:r>
-        <w:rPr>
-          <w:rFonts w:ascii="Times New Roman" w:hAnsi="Times New Roman" w:cs="Times New Roman"/>
-          <w:sz w:val="28"/>
-          <w:szCs w:val="28"/>
-        </w:rPr>
-        <w:t>localStorage</w:t>
-      </w:r>
-      <w:proofErr w:type="spellEnd"/>
-      <w:r>
-        <w:rPr>
-          <w:rFonts w:ascii="Times New Roman" w:hAnsi="Times New Roman" w:cs="Times New Roman"/>
-          <w:sz w:val="28"/>
-          <w:szCs w:val="28"/>
-        </w:rPr>
-        <w:t>!</w:t>
+        <w:t xml:space="preserve">  middleware.ts runs on the SERVER</w:t>
+      </w:r>
+    </w:p>
+    <w:p>
+      <w:pPr>
+        <w:rPr>
+          <w:rFonts w:ascii="Times New Roman" w:hAnsi="Times New Roman" w:cs="Times New Roman"/>
+          <w:sz w:val="28"/>
+          <w:szCs w:val="28"/>
+        </w:rPr>
+      </w:pPr>
+      <w:r>
+        <w:rPr>
+          <w:rFonts w:ascii="Times New Roman" w:hAnsi="Times New Roman" w:cs="Times New Roman"/>
+          <w:sz w:val="28"/>
+          <w:szCs w:val="28"/>
+        </w:rPr>
+        <w:t xml:space="preserve">  localStorage exists only in the BROWSER</w:t>
+      </w:r>
+    </w:p>
+    <w:p>
+      <w:pPr>
+        <w:rPr>
+          <w:rFonts w:ascii="Times New Roman" w:hAnsi="Times New Roman" w:cs="Times New Roman"/>
+          <w:sz w:val="28"/>
+          <w:szCs w:val="28"/>
+        </w:rPr>
+      </w:pPr>
+      <w:r>
+        <w:rPr>
+          <w:rFonts w:ascii="Times New Roman" w:hAnsi="Times New Roman" w:cs="Times New Roman"/>
+          <w:sz w:val="28"/>
+          <w:szCs w:val="28"/>
+        </w:rPr>
+        <w:t xml:space="preserve">  Server cannot read localStorage!</w:t>
       </w:r>
     </w:p>
     <w:p>
@@ -225,25 +153,7 @@
           <w:sz w:val="28"/>
           <w:szCs w:val="28"/>
         </w:rPr>
-        <w:t xml:space="preserve">  Save token in BOTH </w:t>
-      </w:r>
-      <w:proofErr w:type="spellStart"/>
-      <w:r>
-        <w:rPr>
-          <w:rFonts w:ascii="Times New Roman" w:hAnsi="Times New Roman" w:cs="Times New Roman"/>
-          <w:sz w:val="28"/>
-          <w:szCs w:val="28"/>
-        </w:rPr>
-        <w:t>localStorage</w:t>
-      </w:r>
-      <w:proofErr w:type="spellEnd"/>
-      <w:r>
-        <w:rPr>
-          <w:rFonts w:ascii="Times New Roman" w:hAnsi="Times New Roman" w:cs="Times New Roman"/>
-          <w:sz w:val="28"/>
-          <w:szCs w:val="28"/>
-        </w:rPr>
-        <w:t xml:space="preserve"> AND cookie</w:t>
+        <w:t xml:space="preserve">  Save token in BOTH localStorage AND cookie</w:t>
       </w:r>
     </w:p>
     <w:p>
@@ -337,35 +247,7 @@
           <w:sz w:val="28"/>
           <w:szCs w:val="28"/>
         </w:rPr>
-        <w:t xml:space="preserve">Save token to </w:t>
-      </w:r>
-      <w:proofErr w:type="spellStart"/>
-      <w:proofErr w:type="gramStart"/>
-      <w:r>
-        <w:rPr>
-          <w:rFonts w:ascii="Times New Roman" w:hAnsi="Times New Roman" w:cs="Times New Roman"/>
-          <w:sz w:val="28"/>
-          <w:szCs w:val="28"/>
-        </w:rPr>
-        <w:t>localStorage</w:t>
-      </w:r>
-      <w:proofErr w:type="spellEnd"/>
-      <w:r>
-        <w:rPr>
-          <w:rFonts w:ascii="Times New Roman" w:hAnsi="Times New Roman" w:cs="Times New Roman"/>
-          <w:sz w:val="28"/>
-          <w:szCs w:val="28"/>
-        </w:rPr>
-        <w:t xml:space="preserve">  ←</w:t>
-      </w:r>
-      <w:proofErr w:type="gramEnd"/>
-      <w:r>
-        <w:rPr>
-          <w:rFonts w:ascii="Times New Roman" w:hAnsi="Times New Roman" w:cs="Times New Roman"/>
-          <w:sz w:val="28"/>
-          <w:szCs w:val="28"/>
-        </w:rPr>
-        <w:t xml:space="preserve"> for browser JS (Axios interceptor)</w:t>
+        <w:t>Save token to localStorage  ← for browser JS (Axios interceptor)</w:t>
       </w:r>
     </w:p>
     <w:p>
@@ -444,23 +326,13 @@
           <w:szCs w:val="28"/>
         </w:rPr>
       </w:pPr>
-      <w:proofErr w:type="spellStart"/>
-      <w:r>
-        <w:rPr>
-          <w:rFonts w:ascii="Times New Roman" w:hAnsi="Times New Roman" w:cs="Times New Roman"/>
-          <w:sz w:val="28"/>
-          <w:szCs w:val="28"/>
-        </w:rPr>
-        <w:t>middleware.ts</w:t>
-      </w:r>
-      <w:proofErr w:type="spellEnd"/>
-      <w:r>
-        <w:rPr>
-          <w:rFonts w:ascii="Times New Roman" w:hAnsi="Times New Roman" w:cs="Times New Roman"/>
-          <w:sz w:val="28"/>
-          <w:szCs w:val="28"/>
-        </w:rPr>
-        <w:t xml:space="preserve"> runs on server</w:t>
+      <w:r>
+        <w:rPr>
+          <w:rFonts w:ascii="Times New Roman" w:hAnsi="Times New Roman" w:cs="Times New Roman"/>
+          <w:sz w:val="28"/>
+          <w:szCs w:val="28"/>
+        </w:rPr>
+        <w:t>middleware.ts runs on server</w:t>
       </w:r>
     </w:p>
     <w:p>
@@ -542,43 +414,7 @@
           <w:sz w:val="28"/>
           <w:szCs w:val="28"/>
         </w:rPr>
-        <w:t xml:space="preserve">We already wrote the cookie helpers in </w:t>
-      </w:r>
-      <w:proofErr w:type="spellStart"/>
-      <w:r>
-        <w:rPr>
-          <w:rFonts w:ascii="Times New Roman" w:hAnsi="Times New Roman" w:cs="Times New Roman"/>
-          <w:sz w:val="28"/>
-          <w:szCs w:val="28"/>
-        </w:rPr>
-        <w:t>useAuthStore.ts</w:t>
-      </w:r>
-      <w:proofErr w:type="spellEnd"/>
-      <w:r>
-        <w:rPr>
-          <w:rFonts w:ascii="Times New Roman" w:hAnsi="Times New Roman" w:cs="Times New Roman"/>
-          <w:sz w:val="28"/>
-          <w:szCs w:val="28"/>
-        </w:rPr>
-        <w:t>. But let me make sure they are correctly implemented. Open apps/web/store/</w:t>
-      </w:r>
-      <w:proofErr w:type="spellStart"/>
-      <w:r>
-        <w:rPr>
-          <w:rFonts w:ascii="Times New Roman" w:hAnsi="Times New Roman" w:cs="Times New Roman"/>
-          <w:sz w:val="28"/>
-          <w:szCs w:val="28"/>
-        </w:rPr>
-        <w:t>useAuthStore.ts</w:t>
-      </w:r>
-      <w:proofErr w:type="spellEnd"/>
-      <w:r>
-        <w:rPr>
-          <w:rFonts w:ascii="Times New Roman" w:hAnsi="Times New Roman" w:cs="Times New Roman"/>
-          <w:sz w:val="28"/>
-          <w:szCs w:val="28"/>
-        </w:rPr>
-        <w:t xml:space="preserve"> and verify these two helper functions exist at the top:</w:t>
+        <w:t>We already wrote the cookie helpers in useAuthStore.ts. But let me make sure they are correctly implemented. Open apps/web/store/useAuthStore.ts and verify these two helper functions exist at the top:</w:t>
       </w:r>
     </w:p>
     <w:p>
@@ -623,114 +459,30 @@
           <w:szCs w:val="28"/>
         </w:rPr>
       </w:pPr>
-      <w:proofErr w:type="gramStart"/>
-      <w:r>
-        <w:rPr>
-          <w:rFonts w:ascii="Times New Roman" w:hAnsi="Times New Roman" w:cs="Times New Roman"/>
-          <w:sz w:val="28"/>
-          <w:szCs w:val="28"/>
-        </w:rPr>
-        <w:t xml:space="preserve">│  </w:t>
-      </w:r>
-      <w:proofErr w:type="spellStart"/>
-      <w:r>
-        <w:rPr>
-          <w:rFonts w:ascii="Times New Roman" w:hAnsi="Times New Roman" w:cs="Times New Roman"/>
-          <w:sz w:val="28"/>
-          <w:szCs w:val="28"/>
-        </w:rPr>
-        <w:t>localStorage</w:t>
-      </w:r>
-      <w:proofErr w:type="spellEnd"/>
-      <w:proofErr w:type="gramEnd"/>
-      <w:r>
-        <w:rPr>
-          <w:rFonts w:ascii="Times New Roman" w:hAnsi="Times New Roman" w:cs="Times New Roman"/>
-          <w:sz w:val="28"/>
-          <w:szCs w:val="28"/>
-        </w:rPr>
-        <w:t>['</w:t>
-      </w:r>
-      <w:proofErr w:type="spellStart"/>
-      <w:r>
-        <w:rPr>
-          <w:rFonts w:ascii="Times New Roman" w:hAnsi="Times New Roman" w:cs="Times New Roman"/>
-          <w:sz w:val="28"/>
-          <w:szCs w:val="28"/>
-        </w:rPr>
-        <w:t>spendwise_token</w:t>
-      </w:r>
-      <w:proofErr w:type="spellEnd"/>
-      <w:r>
-        <w:rPr>
-          <w:rFonts w:ascii="Times New Roman" w:hAnsi="Times New Roman" w:cs="Times New Roman"/>
-          <w:sz w:val="28"/>
-          <w:szCs w:val="28"/>
-        </w:rPr>
-        <w:t>'] = "</w:t>
-      </w:r>
-      <w:proofErr w:type="spellStart"/>
-      <w:r>
-        <w:rPr>
-          <w:rFonts w:ascii="Times New Roman" w:hAnsi="Times New Roman" w:cs="Times New Roman"/>
-          <w:sz w:val="28"/>
-          <w:szCs w:val="28"/>
-        </w:rPr>
-        <w:t>eyJ</w:t>
-      </w:r>
-      <w:proofErr w:type="spellEnd"/>
-      <w:r>
-        <w:rPr>
-          <w:rFonts w:ascii="Times New Roman" w:hAnsi="Times New Roman" w:cs="Times New Roman"/>
-          <w:sz w:val="28"/>
-          <w:szCs w:val="28"/>
-        </w:rPr>
-        <w:t xml:space="preserve">..."     </w:t>
-      </w:r>
-    </w:p>
-    <w:p>
-      <w:pPr>
-        <w:rPr>
-          <w:rFonts w:ascii="Times New Roman" w:hAnsi="Times New Roman" w:cs="Times New Roman"/>
-          <w:sz w:val="28"/>
-          <w:szCs w:val="28"/>
-        </w:rPr>
-      </w:pPr>
-      <w:proofErr w:type="gramStart"/>
-      <w:r>
-        <w:rPr>
-          <w:rFonts w:ascii="Times New Roman" w:hAnsi="Times New Roman" w:cs="Times New Roman"/>
-          <w:sz w:val="28"/>
-          <w:szCs w:val="28"/>
-        </w:rPr>
-        <w:t>│  →</w:t>
-      </w:r>
-      <w:proofErr w:type="gramEnd"/>
-      <w:r>
-        <w:rPr>
-          <w:rFonts w:ascii="Times New Roman" w:hAnsi="Times New Roman" w:cs="Times New Roman"/>
-          <w:sz w:val="28"/>
-          <w:szCs w:val="28"/>
-        </w:rPr>
-        <w:t xml:space="preserve"> Used by: Axios interceptor (</w:t>
-      </w:r>
-      <w:proofErr w:type="spellStart"/>
-      <w:r>
-        <w:rPr>
-          <w:rFonts w:ascii="Times New Roman" w:hAnsi="Times New Roman" w:cs="Times New Roman"/>
-          <w:sz w:val="28"/>
-          <w:szCs w:val="28"/>
-        </w:rPr>
-        <w:t>api.ts</w:t>
-      </w:r>
-      <w:proofErr w:type="spellEnd"/>
-      <w:r>
-        <w:rPr>
-          <w:rFonts w:ascii="Times New Roman" w:hAnsi="Times New Roman" w:cs="Times New Roman"/>
-          <w:sz w:val="28"/>
-          <w:szCs w:val="28"/>
-        </w:rPr>
-        <w:t xml:space="preserve">)          </w:t>
+      <w:r>
+        <w:rPr>
+          <w:rFonts w:ascii="Times New Roman" w:hAnsi="Times New Roman" w:cs="Times New Roman"/>
+          <w:sz w:val="28"/>
+          <w:szCs w:val="28"/>
+        </w:rPr>
+        <w:t xml:space="preserve">│  localStorage['spendwise_token'] = "eyJ..."     </w:t>
+      </w:r>
+    </w:p>
+    <w:p>
+      <w:pPr>
+        <w:rPr>
+          <w:rFonts w:ascii="Times New Roman" w:hAnsi="Times New Roman" w:cs="Times New Roman"/>
+          <w:sz w:val="28"/>
+          <w:szCs w:val="28"/>
+        </w:rPr>
+      </w:pPr>
+      <w:r>
+        <w:rPr>
+          <w:rFonts w:ascii="Times New Roman" w:hAnsi="Times New Roman" w:cs="Times New Roman"/>
+          <w:sz w:val="28"/>
+          <w:szCs w:val="28"/>
+        </w:rPr>
+        <w:t xml:space="preserve">│  → Used by: Axios interceptor (api.ts)          </w:t>
       </w:r>
     </w:p>
     <w:p>
@@ -807,78 +559,24 @@
           <w:sz w:val="28"/>
           <w:szCs w:val="28"/>
         </w:rPr>
-        <w:t>│  Cookie['</w:t>
-      </w:r>
-      <w:proofErr w:type="spellStart"/>
-      <w:r>
-        <w:rPr>
-          <w:rFonts w:ascii="Times New Roman" w:hAnsi="Times New Roman" w:cs="Times New Roman"/>
-          <w:sz w:val="28"/>
-          <w:szCs w:val="28"/>
-        </w:rPr>
-        <w:t>spendwise_token</w:t>
-      </w:r>
-      <w:proofErr w:type="spellEnd"/>
-      <w:r>
-        <w:rPr>
-          <w:rFonts w:ascii="Times New Roman" w:hAnsi="Times New Roman" w:cs="Times New Roman"/>
-          <w:sz w:val="28"/>
-          <w:szCs w:val="28"/>
-        </w:rPr>
-        <w:t>'] = "</w:t>
-      </w:r>
-      <w:proofErr w:type="spellStart"/>
-      <w:r>
-        <w:rPr>
-          <w:rFonts w:ascii="Times New Roman" w:hAnsi="Times New Roman" w:cs="Times New Roman"/>
-          <w:sz w:val="28"/>
-          <w:szCs w:val="28"/>
-        </w:rPr>
-        <w:t>eyJ</w:t>
-      </w:r>
-      <w:proofErr w:type="spellEnd"/>
-      <w:r>
-        <w:rPr>
-          <w:rFonts w:ascii="Times New Roman" w:hAnsi="Times New Roman" w:cs="Times New Roman"/>
-          <w:sz w:val="28"/>
-          <w:szCs w:val="28"/>
-        </w:rPr>
-        <w:t xml:space="preserve">..."           </w:t>
-      </w:r>
-    </w:p>
-    <w:p>
-      <w:pPr>
-        <w:rPr>
-          <w:rFonts w:ascii="Times New Roman" w:hAnsi="Times New Roman" w:cs="Times New Roman"/>
-          <w:sz w:val="28"/>
-          <w:szCs w:val="28"/>
-        </w:rPr>
-      </w:pPr>
-      <w:r>
-        <w:rPr>
-          <w:rFonts w:ascii="Times New Roman" w:hAnsi="Times New Roman" w:cs="Times New Roman"/>
-          <w:sz w:val="28"/>
-          <w:szCs w:val="28"/>
-        </w:rPr>
-        <w:t xml:space="preserve">│  → Used by: </w:t>
-      </w:r>
-      <w:proofErr w:type="spellStart"/>
-      <w:r>
-        <w:rPr>
-          <w:rFonts w:ascii="Times New Roman" w:hAnsi="Times New Roman" w:cs="Times New Roman"/>
-          <w:sz w:val="28"/>
-          <w:szCs w:val="28"/>
-        </w:rPr>
-        <w:t>middleware.ts</w:t>
-      </w:r>
-      <w:proofErr w:type="spellEnd"/>
-      <w:r>
-        <w:rPr>
-          <w:rFonts w:ascii="Times New Roman" w:hAnsi="Times New Roman" w:cs="Times New Roman"/>
-          <w:sz w:val="28"/>
-          <w:szCs w:val="28"/>
-        </w:rPr>
-        <w:t xml:space="preserve">                       </w:t>
+        <w:t xml:space="preserve">│  Cookie['spendwise_token'] = "eyJ..."           </w:t>
+      </w:r>
+    </w:p>
+    <w:p>
+      <w:pPr>
+        <w:rPr>
+          <w:rFonts w:ascii="Times New Roman" w:hAnsi="Times New Roman" w:cs="Times New Roman"/>
+          <w:sz w:val="28"/>
+          <w:szCs w:val="28"/>
+        </w:rPr>
+      </w:pPr>
+      <w:r>
+        <w:rPr>
+          <w:rFonts w:ascii="Times New Roman" w:hAnsi="Times New Roman" w:cs="Times New Roman"/>
+          <w:sz w:val="28"/>
+          <w:szCs w:val="28"/>
+        </w:rPr>
+        <w:t xml:space="preserve">│  → Used by: middleware.ts                       </w:t>
       </w:r>
     </w:p>
     <w:p>
@@ -982,6 +680,65 @@
           <w:szCs w:val="28"/>
         </w:rPr>
         <w:t>Why put API calls in a hook instead of directly in the page? Because the page component stays clean and readable. The hook handles loading, error, and data state in one place. Multiple components can reuse the same hook.</w:t>
+      </w:r>
+    </w:p>
+    <w:p>
+      <w:pPr>
+        <w:rPr>
+          <w:rFonts w:ascii="Times New Roman" w:hAnsi="Times New Roman" w:cs="Times New Roman"/>
+          <w:sz w:val="28"/>
+          <w:szCs w:val="28"/>
+        </w:rPr>
+      </w:pPr>
+    </w:p>
+    <w:p>
+      <w:pPr>
+        <w:rPr>
+          <w:rFonts w:ascii="Times New Roman" w:hAnsi="Times New Roman" w:cs="Times New Roman"/>
+          <w:sz w:val="28"/>
+          <w:szCs w:val="28"/>
+        </w:rPr>
+      </w:pPr>
+      <w:r>
+        <w:rPr>
+          <w:noProof/>
+        </w:rPr>
+        <w:lastRenderedPageBreak/>
+        <w:drawing>
+          <wp:inline distT="0" distB="0" distL="0" distR="0" wp14:anchorId="4134CD0F" wp14:editId="1A2DFF60">
+            <wp:extent cx="5943600" cy="3356610"/>
+            <wp:effectExtent l="0" t="0" r="0" b="0"/>
+            <wp:docPr id="100869141" name="Picture 1"/>
+            <wp:cNvGraphicFramePr>
+              <a:graphicFrameLocks xmlns:a="http://schemas.openxmlformats.org/drawingml/2006/main" noChangeAspect="1"/>
+            </wp:cNvGraphicFramePr>
+            <a:graphic xmlns:a="http://schemas.openxmlformats.org/drawingml/2006/main">
+              <a:graphicData uri="http://schemas.openxmlformats.org/drawingml/2006/picture">
+                <pic:pic xmlns:pic="http://schemas.openxmlformats.org/drawingml/2006/picture">
+                  <pic:nvPicPr>
+                    <pic:cNvPr id="100869141" name=""/>
+                    <pic:cNvPicPr/>
+                  </pic:nvPicPr>
+                  <pic:blipFill>
+                    <a:blip r:embed="rId4"/>
+                    <a:stretch>
+                      <a:fillRect/>
+                    </a:stretch>
+                  </pic:blipFill>
+                  <pic:spPr>
+                    <a:xfrm>
+                      <a:off x="0" y="0"/>
+                      <a:ext cx="5943600" cy="3356610"/>
+                    </a:xfrm>
+                    <a:prstGeom prst="rect">
+                      <a:avLst/>
+                    </a:prstGeom>
+                  </pic:spPr>
+                </pic:pic>
+              </a:graphicData>
+            </a:graphic>
+          </wp:inline>
+        </w:drawing>
       </w:r>
     </w:p>
     <w:p>
@@ -1615,6 +1372,7 @@
   <w:style w:type="character" w:default="1" w:styleId="DefaultParagraphFont">
     <w:name w:val="Default Paragraph Font"/>
     <w:uiPriority w:val="1"/>
+    <w:semiHidden/>
     <w:unhideWhenUsed/>
   </w:style>
   <w:style w:type="table" w:default="1" w:styleId="TableNormal">

</xml_diff>

<commit_message>
develop backend for ai insight page
</commit_message>
<xml_diff>
--- a/Spendwise Important Points.docx
+++ b/Spendwise Important Points.docx
@@ -16,7 +16,25 @@
           <w:sz w:val="28"/>
           <w:szCs w:val="28"/>
         </w:rPr>
-        <w:t xml:space="preserve">           Spendwise Important Points</w:t>
+        <w:t xml:space="preserve">           </w:t>
+      </w:r>
+      <w:proofErr w:type="spellStart"/>
+      <w:r>
+        <w:rPr>
+          <w:rFonts w:ascii="Times New Roman" w:hAnsi="Times New Roman" w:cs="Times New Roman"/>
+          <w:sz w:val="28"/>
+          <w:szCs w:val="28"/>
+        </w:rPr>
+        <w:t>Spendwise</w:t>
+      </w:r>
+      <w:proofErr w:type="spellEnd"/>
+      <w:r>
+        <w:rPr>
+          <w:rFonts w:ascii="Times New Roman" w:hAnsi="Times New Roman" w:cs="Times New Roman"/>
+          <w:sz w:val="28"/>
+          <w:szCs w:val="28"/>
+        </w:rPr>
+        <w:t xml:space="preserve"> Important Points</w:t>
       </w:r>
     </w:p>
     <w:p>
@@ -76,41 +94,95 @@
           <w:sz w:val="28"/>
           <w:szCs w:val="28"/>
         </w:rPr>
-        <w:t xml:space="preserve">  middleware.ts runs on the SERVER</w:t>
-      </w:r>
-    </w:p>
-    <w:p>
-      <w:pPr>
-        <w:rPr>
-          <w:rFonts w:ascii="Times New Roman" w:hAnsi="Times New Roman" w:cs="Times New Roman"/>
-          <w:sz w:val="28"/>
-          <w:szCs w:val="28"/>
-        </w:rPr>
-      </w:pPr>
-      <w:r>
-        <w:rPr>
-          <w:rFonts w:ascii="Times New Roman" w:hAnsi="Times New Roman" w:cs="Times New Roman"/>
-          <w:sz w:val="28"/>
-          <w:szCs w:val="28"/>
-        </w:rPr>
-        <w:t xml:space="preserve">  localStorage exists only in the BROWSER</w:t>
-      </w:r>
-    </w:p>
-    <w:p>
-      <w:pPr>
-        <w:rPr>
-          <w:rFonts w:ascii="Times New Roman" w:hAnsi="Times New Roman" w:cs="Times New Roman"/>
-          <w:sz w:val="28"/>
-          <w:szCs w:val="28"/>
-        </w:rPr>
-      </w:pPr>
-      <w:r>
-        <w:rPr>
-          <w:rFonts w:ascii="Times New Roman" w:hAnsi="Times New Roman" w:cs="Times New Roman"/>
-          <w:sz w:val="28"/>
-          <w:szCs w:val="28"/>
-        </w:rPr>
-        <w:t xml:space="preserve">  Server cannot read localStorage!</w:t>
+        <w:t xml:space="preserve">  </w:t>
+      </w:r>
+      <w:proofErr w:type="spellStart"/>
+      <w:r>
+        <w:rPr>
+          <w:rFonts w:ascii="Times New Roman" w:hAnsi="Times New Roman" w:cs="Times New Roman"/>
+          <w:sz w:val="28"/>
+          <w:szCs w:val="28"/>
+        </w:rPr>
+        <w:t>middleware.ts</w:t>
+      </w:r>
+      <w:proofErr w:type="spellEnd"/>
+      <w:r>
+        <w:rPr>
+          <w:rFonts w:ascii="Times New Roman" w:hAnsi="Times New Roman" w:cs="Times New Roman"/>
+          <w:sz w:val="28"/>
+          <w:szCs w:val="28"/>
+        </w:rPr>
+        <w:t xml:space="preserve"> runs on the SERVER</w:t>
+      </w:r>
+    </w:p>
+    <w:p>
+      <w:pPr>
+        <w:rPr>
+          <w:rFonts w:ascii="Times New Roman" w:hAnsi="Times New Roman" w:cs="Times New Roman"/>
+          <w:sz w:val="28"/>
+          <w:szCs w:val="28"/>
+        </w:rPr>
+      </w:pPr>
+      <w:r>
+        <w:rPr>
+          <w:rFonts w:ascii="Times New Roman" w:hAnsi="Times New Roman" w:cs="Times New Roman"/>
+          <w:sz w:val="28"/>
+          <w:szCs w:val="28"/>
+        </w:rPr>
+        <w:t xml:space="preserve">  </w:t>
+      </w:r>
+      <w:proofErr w:type="spellStart"/>
+      <w:r>
+        <w:rPr>
+          <w:rFonts w:ascii="Times New Roman" w:hAnsi="Times New Roman" w:cs="Times New Roman"/>
+          <w:sz w:val="28"/>
+          <w:szCs w:val="28"/>
+        </w:rPr>
+        <w:t>localStorage</w:t>
+      </w:r>
+      <w:proofErr w:type="spellEnd"/>
+      <w:r>
+        <w:rPr>
+          <w:rFonts w:ascii="Times New Roman" w:hAnsi="Times New Roman" w:cs="Times New Roman"/>
+          <w:sz w:val="28"/>
+          <w:szCs w:val="28"/>
+        </w:rPr>
+        <w:t xml:space="preserve"> exists only in the BROWSER</w:t>
+      </w:r>
+    </w:p>
+    <w:p>
+      <w:pPr>
+        <w:rPr>
+          <w:rFonts w:ascii="Times New Roman" w:hAnsi="Times New Roman" w:cs="Times New Roman"/>
+          <w:sz w:val="28"/>
+          <w:szCs w:val="28"/>
+        </w:rPr>
+      </w:pPr>
+      <w:r>
+        <w:rPr>
+          <w:rFonts w:ascii="Times New Roman" w:hAnsi="Times New Roman" w:cs="Times New Roman"/>
+          <w:sz w:val="28"/>
+          <w:szCs w:val="28"/>
+        </w:rPr>
+        <w:t xml:space="preserve">  Server cannot read </w:t>
+      </w:r>
+      <w:proofErr w:type="spellStart"/>
+      <w:r>
+        <w:rPr>
+          <w:rFonts w:ascii="Times New Roman" w:hAnsi="Times New Roman" w:cs="Times New Roman"/>
+          <w:sz w:val="28"/>
+          <w:szCs w:val="28"/>
+        </w:rPr>
+        <w:t>localStorage</w:t>
+      </w:r>
+      <w:proofErr w:type="spellEnd"/>
+      <w:r>
+        <w:rPr>
+          <w:rFonts w:ascii="Times New Roman" w:hAnsi="Times New Roman" w:cs="Times New Roman"/>
+          <w:sz w:val="28"/>
+          <w:szCs w:val="28"/>
+        </w:rPr>
+        <w:t>!</w:t>
       </w:r>
     </w:p>
     <w:p>
@@ -153,7 +225,25 @@
           <w:sz w:val="28"/>
           <w:szCs w:val="28"/>
         </w:rPr>
-        <w:t xml:space="preserve">  Save token in BOTH localStorage AND cookie</w:t>
+        <w:t xml:space="preserve">  Save token in BOTH </w:t>
+      </w:r>
+      <w:proofErr w:type="spellStart"/>
+      <w:r>
+        <w:rPr>
+          <w:rFonts w:ascii="Times New Roman" w:hAnsi="Times New Roman" w:cs="Times New Roman"/>
+          <w:sz w:val="28"/>
+          <w:szCs w:val="28"/>
+        </w:rPr>
+        <w:t>localStorage</w:t>
+      </w:r>
+      <w:proofErr w:type="spellEnd"/>
+      <w:r>
+        <w:rPr>
+          <w:rFonts w:ascii="Times New Roman" w:hAnsi="Times New Roman" w:cs="Times New Roman"/>
+          <w:sz w:val="28"/>
+          <w:szCs w:val="28"/>
+        </w:rPr>
+        <w:t xml:space="preserve"> AND cookie</w:t>
       </w:r>
     </w:p>
     <w:p>
@@ -247,7 +337,35 @@
           <w:sz w:val="28"/>
           <w:szCs w:val="28"/>
         </w:rPr>
-        <w:t>Save token to localStorage  ← for browser JS (Axios interceptor)</w:t>
+        <w:t xml:space="preserve">Save token to </w:t>
+      </w:r>
+      <w:proofErr w:type="spellStart"/>
+      <w:proofErr w:type="gramStart"/>
+      <w:r>
+        <w:rPr>
+          <w:rFonts w:ascii="Times New Roman" w:hAnsi="Times New Roman" w:cs="Times New Roman"/>
+          <w:sz w:val="28"/>
+          <w:szCs w:val="28"/>
+        </w:rPr>
+        <w:t>localStorage</w:t>
+      </w:r>
+      <w:proofErr w:type="spellEnd"/>
+      <w:r>
+        <w:rPr>
+          <w:rFonts w:ascii="Times New Roman" w:hAnsi="Times New Roman" w:cs="Times New Roman"/>
+          <w:sz w:val="28"/>
+          <w:szCs w:val="28"/>
+        </w:rPr>
+        <w:t xml:space="preserve">  ←</w:t>
+      </w:r>
+      <w:proofErr w:type="gramEnd"/>
+      <w:r>
+        <w:rPr>
+          <w:rFonts w:ascii="Times New Roman" w:hAnsi="Times New Roman" w:cs="Times New Roman"/>
+          <w:sz w:val="28"/>
+          <w:szCs w:val="28"/>
+        </w:rPr>
+        <w:t xml:space="preserve"> for browser JS (Axios interceptor)</w:t>
       </w:r>
     </w:p>
     <w:p>
@@ -326,13 +444,23 @@
           <w:szCs w:val="28"/>
         </w:rPr>
       </w:pPr>
-      <w:r>
-        <w:rPr>
-          <w:rFonts w:ascii="Times New Roman" w:hAnsi="Times New Roman" w:cs="Times New Roman"/>
-          <w:sz w:val="28"/>
-          <w:szCs w:val="28"/>
-        </w:rPr>
-        <w:t>middleware.ts runs on server</w:t>
+      <w:proofErr w:type="spellStart"/>
+      <w:r>
+        <w:rPr>
+          <w:rFonts w:ascii="Times New Roman" w:hAnsi="Times New Roman" w:cs="Times New Roman"/>
+          <w:sz w:val="28"/>
+          <w:szCs w:val="28"/>
+        </w:rPr>
+        <w:t>middleware.ts</w:t>
+      </w:r>
+      <w:proofErr w:type="spellEnd"/>
+      <w:r>
+        <w:rPr>
+          <w:rFonts w:ascii="Times New Roman" w:hAnsi="Times New Roman" w:cs="Times New Roman"/>
+          <w:sz w:val="28"/>
+          <w:szCs w:val="28"/>
+        </w:rPr>
+        <w:t xml:space="preserve"> runs on server</w:t>
       </w:r>
     </w:p>
     <w:p>
@@ -414,7 +542,43 @@
           <w:sz w:val="28"/>
           <w:szCs w:val="28"/>
         </w:rPr>
-        <w:t>We already wrote the cookie helpers in useAuthStore.ts. But let me make sure they are correctly implemented. Open apps/web/store/useAuthStore.ts and verify these two helper functions exist at the top:</w:t>
+        <w:t xml:space="preserve">We already wrote the cookie helpers in </w:t>
+      </w:r>
+      <w:proofErr w:type="spellStart"/>
+      <w:r>
+        <w:rPr>
+          <w:rFonts w:ascii="Times New Roman" w:hAnsi="Times New Roman" w:cs="Times New Roman"/>
+          <w:sz w:val="28"/>
+          <w:szCs w:val="28"/>
+        </w:rPr>
+        <w:t>useAuthStore.ts</w:t>
+      </w:r>
+      <w:proofErr w:type="spellEnd"/>
+      <w:r>
+        <w:rPr>
+          <w:rFonts w:ascii="Times New Roman" w:hAnsi="Times New Roman" w:cs="Times New Roman"/>
+          <w:sz w:val="28"/>
+          <w:szCs w:val="28"/>
+        </w:rPr>
+        <w:t>. But let me make sure they are correctly implemented. Open apps/web/store/</w:t>
+      </w:r>
+      <w:proofErr w:type="spellStart"/>
+      <w:r>
+        <w:rPr>
+          <w:rFonts w:ascii="Times New Roman" w:hAnsi="Times New Roman" w:cs="Times New Roman"/>
+          <w:sz w:val="28"/>
+          <w:szCs w:val="28"/>
+        </w:rPr>
+        <w:t>useAuthStore.ts</w:t>
+      </w:r>
+      <w:proofErr w:type="spellEnd"/>
+      <w:r>
+        <w:rPr>
+          <w:rFonts w:ascii="Times New Roman" w:hAnsi="Times New Roman" w:cs="Times New Roman"/>
+          <w:sz w:val="28"/>
+          <w:szCs w:val="28"/>
+        </w:rPr>
+        <w:t xml:space="preserve"> and verify these two helper functions exist at the top:</w:t>
       </w:r>
     </w:p>
     <w:p>
@@ -459,30 +623,114 @@
           <w:szCs w:val="28"/>
         </w:rPr>
       </w:pPr>
-      <w:r>
-        <w:rPr>
-          <w:rFonts w:ascii="Times New Roman" w:hAnsi="Times New Roman" w:cs="Times New Roman"/>
-          <w:sz w:val="28"/>
-          <w:szCs w:val="28"/>
-        </w:rPr>
-        <w:t xml:space="preserve">│  localStorage['spendwise_token'] = "eyJ..."     </w:t>
-      </w:r>
-    </w:p>
-    <w:p>
-      <w:pPr>
-        <w:rPr>
-          <w:rFonts w:ascii="Times New Roman" w:hAnsi="Times New Roman" w:cs="Times New Roman"/>
-          <w:sz w:val="28"/>
-          <w:szCs w:val="28"/>
-        </w:rPr>
-      </w:pPr>
-      <w:r>
-        <w:rPr>
-          <w:rFonts w:ascii="Times New Roman" w:hAnsi="Times New Roman" w:cs="Times New Roman"/>
-          <w:sz w:val="28"/>
-          <w:szCs w:val="28"/>
-        </w:rPr>
-        <w:t xml:space="preserve">│  → Used by: Axios interceptor (api.ts)          </w:t>
+      <w:proofErr w:type="gramStart"/>
+      <w:r>
+        <w:rPr>
+          <w:rFonts w:ascii="Times New Roman" w:hAnsi="Times New Roman" w:cs="Times New Roman"/>
+          <w:sz w:val="28"/>
+          <w:szCs w:val="28"/>
+        </w:rPr>
+        <w:t xml:space="preserve">│  </w:t>
+      </w:r>
+      <w:proofErr w:type="spellStart"/>
+      <w:r>
+        <w:rPr>
+          <w:rFonts w:ascii="Times New Roman" w:hAnsi="Times New Roman" w:cs="Times New Roman"/>
+          <w:sz w:val="28"/>
+          <w:szCs w:val="28"/>
+        </w:rPr>
+        <w:t>localStorage</w:t>
+      </w:r>
+      <w:proofErr w:type="spellEnd"/>
+      <w:proofErr w:type="gramEnd"/>
+      <w:r>
+        <w:rPr>
+          <w:rFonts w:ascii="Times New Roman" w:hAnsi="Times New Roman" w:cs="Times New Roman"/>
+          <w:sz w:val="28"/>
+          <w:szCs w:val="28"/>
+        </w:rPr>
+        <w:t>['</w:t>
+      </w:r>
+      <w:proofErr w:type="spellStart"/>
+      <w:r>
+        <w:rPr>
+          <w:rFonts w:ascii="Times New Roman" w:hAnsi="Times New Roman" w:cs="Times New Roman"/>
+          <w:sz w:val="28"/>
+          <w:szCs w:val="28"/>
+        </w:rPr>
+        <w:t>spendwise_token</w:t>
+      </w:r>
+      <w:proofErr w:type="spellEnd"/>
+      <w:r>
+        <w:rPr>
+          <w:rFonts w:ascii="Times New Roman" w:hAnsi="Times New Roman" w:cs="Times New Roman"/>
+          <w:sz w:val="28"/>
+          <w:szCs w:val="28"/>
+        </w:rPr>
+        <w:t>'] = "</w:t>
+      </w:r>
+      <w:proofErr w:type="spellStart"/>
+      <w:r>
+        <w:rPr>
+          <w:rFonts w:ascii="Times New Roman" w:hAnsi="Times New Roman" w:cs="Times New Roman"/>
+          <w:sz w:val="28"/>
+          <w:szCs w:val="28"/>
+        </w:rPr>
+        <w:t>eyJ</w:t>
+      </w:r>
+      <w:proofErr w:type="spellEnd"/>
+      <w:r>
+        <w:rPr>
+          <w:rFonts w:ascii="Times New Roman" w:hAnsi="Times New Roman" w:cs="Times New Roman"/>
+          <w:sz w:val="28"/>
+          <w:szCs w:val="28"/>
+        </w:rPr>
+        <w:t xml:space="preserve">..."     </w:t>
+      </w:r>
+    </w:p>
+    <w:p>
+      <w:pPr>
+        <w:rPr>
+          <w:rFonts w:ascii="Times New Roman" w:hAnsi="Times New Roman" w:cs="Times New Roman"/>
+          <w:sz w:val="28"/>
+          <w:szCs w:val="28"/>
+        </w:rPr>
+      </w:pPr>
+      <w:proofErr w:type="gramStart"/>
+      <w:r>
+        <w:rPr>
+          <w:rFonts w:ascii="Times New Roman" w:hAnsi="Times New Roman" w:cs="Times New Roman"/>
+          <w:sz w:val="28"/>
+          <w:szCs w:val="28"/>
+        </w:rPr>
+        <w:t>│  →</w:t>
+      </w:r>
+      <w:proofErr w:type="gramEnd"/>
+      <w:r>
+        <w:rPr>
+          <w:rFonts w:ascii="Times New Roman" w:hAnsi="Times New Roman" w:cs="Times New Roman"/>
+          <w:sz w:val="28"/>
+          <w:szCs w:val="28"/>
+        </w:rPr>
+        <w:t xml:space="preserve"> Used by: Axios interceptor (</w:t>
+      </w:r>
+      <w:proofErr w:type="spellStart"/>
+      <w:r>
+        <w:rPr>
+          <w:rFonts w:ascii="Times New Roman" w:hAnsi="Times New Roman" w:cs="Times New Roman"/>
+          <w:sz w:val="28"/>
+          <w:szCs w:val="28"/>
+        </w:rPr>
+        <w:t>api.ts</w:t>
+      </w:r>
+      <w:proofErr w:type="spellEnd"/>
+      <w:r>
+        <w:rPr>
+          <w:rFonts w:ascii="Times New Roman" w:hAnsi="Times New Roman" w:cs="Times New Roman"/>
+          <w:sz w:val="28"/>
+          <w:szCs w:val="28"/>
+        </w:rPr>
+        <w:t xml:space="preserve">)          </w:t>
       </w:r>
     </w:p>
     <w:p>
@@ -559,24 +807,78 @@
           <w:sz w:val="28"/>
           <w:szCs w:val="28"/>
         </w:rPr>
-        <w:t xml:space="preserve">│  Cookie['spendwise_token'] = "eyJ..."           </w:t>
-      </w:r>
-    </w:p>
-    <w:p>
-      <w:pPr>
-        <w:rPr>
-          <w:rFonts w:ascii="Times New Roman" w:hAnsi="Times New Roman" w:cs="Times New Roman"/>
-          <w:sz w:val="28"/>
-          <w:szCs w:val="28"/>
-        </w:rPr>
-      </w:pPr>
-      <w:r>
-        <w:rPr>
-          <w:rFonts w:ascii="Times New Roman" w:hAnsi="Times New Roman" w:cs="Times New Roman"/>
-          <w:sz w:val="28"/>
-          <w:szCs w:val="28"/>
-        </w:rPr>
-        <w:t xml:space="preserve">│  → Used by: middleware.ts                       </w:t>
+        <w:t>│  Cookie['</w:t>
+      </w:r>
+      <w:proofErr w:type="spellStart"/>
+      <w:r>
+        <w:rPr>
+          <w:rFonts w:ascii="Times New Roman" w:hAnsi="Times New Roman" w:cs="Times New Roman"/>
+          <w:sz w:val="28"/>
+          <w:szCs w:val="28"/>
+        </w:rPr>
+        <w:t>spendwise_token</w:t>
+      </w:r>
+      <w:proofErr w:type="spellEnd"/>
+      <w:r>
+        <w:rPr>
+          <w:rFonts w:ascii="Times New Roman" w:hAnsi="Times New Roman" w:cs="Times New Roman"/>
+          <w:sz w:val="28"/>
+          <w:szCs w:val="28"/>
+        </w:rPr>
+        <w:t>'] = "</w:t>
+      </w:r>
+      <w:proofErr w:type="spellStart"/>
+      <w:r>
+        <w:rPr>
+          <w:rFonts w:ascii="Times New Roman" w:hAnsi="Times New Roman" w:cs="Times New Roman"/>
+          <w:sz w:val="28"/>
+          <w:szCs w:val="28"/>
+        </w:rPr>
+        <w:t>eyJ</w:t>
+      </w:r>
+      <w:proofErr w:type="spellEnd"/>
+      <w:r>
+        <w:rPr>
+          <w:rFonts w:ascii="Times New Roman" w:hAnsi="Times New Roman" w:cs="Times New Roman"/>
+          <w:sz w:val="28"/>
+          <w:szCs w:val="28"/>
+        </w:rPr>
+        <w:t xml:space="preserve">..."           </w:t>
+      </w:r>
+    </w:p>
+    <w:p>
+      <w:pPr>
+        <w:rPr>
+          <w:rFonts w:ascii="Times New Roman" w:hAnsi="Times New Roman" w:cs="Times New Roman"/>
+          <w:sz w:val="28"/>
+          <w:szCs w:val="28"/>
+        </w:rPr>
+      </w:pPr>
+      <w:r>
+        <w:rPr>
+          <w:rFonts w:ascii="Times New Roman" w:hAnsi="Times New Roman" w:cs="Times New Roman"/>
+          <w:sz w:val="28"/>
+          <w:szCs w:val="28"/>
+        </w:rPr>
+        <w:t xml:space="preserve">│  → Used by: </w:t>
+      </w:r>
+      <w:proofErr w:type="spellStart"/>
+      <w:r>
+        <w:rPr>
+          <w:rFonts w:ascii="Times New Roman" w:hAnsi="Times New Roman" w:cs="Times New Roman"/>
+          <w:sz w:val="28"/>
+          <w:szCs w:val="28"/>
+        </w:rPr>
+        <w:t>middleware.ts</w:t>
+      </w:r>
+      <w:proofErr w:type="spellEnd"/>
+      <w:r>
+        <w:rPr>
+          <w:rFonts w:ascii="Times New Roman" w:hAnsi="Times New Roman" w:cs="Times New Roman"/>
+          <w:sz w:val="28"/>
+          <w:szCs w:val="28"/>
+        </w:rPr>
+        <w:t xml:space="preserve">                       </w:t>
       </w:r>
     </w:p>
     <w:p>
@@ -739,6 +1041,50 @@
             </a:graphic>
           </wp:inline>
         </w:drawing>
+      </w:r>
+    </w:p>
+    <w:p>
+      <w:pPr>
+        <w:rPr>
+          <w:rFonts w:ascii="Times New Roman" w:hAnsi="Times New Roman" w:cs="Times New Roman"/>
+          <w:sz w:val="28"/>
+          <w:szCs w:val="28"/>
+        </w:rPr>
+      </w:pPr>
+    </w:p>
+    <w:p>
+      <w:pPr>
+        <w:rPr>
+          <w:rFonts w:ascii="Times New Roman" w:hAnsi="Times New Roman" w:cs="Times New Roman"/>
+          <w:sz w:val="28"/>
+          <w:szCs w:val="28"/>
+        </w:rPr>
+      </w:pPr>
+      <w:r>
+        <w:rPr>
+          <w:rFonts w:ascii="Times New Roman" w:hAnsi="Times New Roman" w:cs="Times New Roman"/>
+          <w:sz w:val="28"/>
+          <w:szCs w:val="28"/>
+        </w:rPr>
+        <w:t xml:space="preserve">Gemini API Key = </w:t>
+      </w:r>
+      <w:proofErr w:type="gramStart"/>
+      <w:r>
+        <w:rPr>
+          <w:rFonts w:ascii="Times New Roman" w:hAnsi="Times New Roman" w:cs="Times New Roman"/>
+          <w:sz w:val="28"/>
+          <w:szCs w:val="28"/>
+        </w:rPr>
+        <w:t>AQ.Ab</w:t>
+      </w:r>
+      <w:proofErr w:type="gramEnd"/>
+      <w:r>
+        <w:rPr>
+          <w:rFonts w:ascii="Times New Roman" w:hAnsi="Times New Roman" w:cs="Times New Roman"/>
+          <w:sz w:val="28"/>
+          <w:szCs w:val="28"/>
+        </w:rPr>
+        <w:t>8RN6JtLpHr-X399xMdltMeKN98-xivIbtH6waSS6Jb4CRDzA</w:t>
       </w:r>
     </w:p>
     <w:p>

</xml_diff>

<commit_message>
fixed profile image succesfully upload and saved in cloudinary
</commit_message>
<xml_diff>
--- a/Spendwise Important Points.docx
+++ b/Spendwise Important Points.docx
@@ -1,6 +1,6 @@
 
 <file path=word/document.xml><?xml version="1.0" encoding="utf-8"?>
-<w:document xmlns:wpc="http://schemas.microsoft.com/office/word/2010/wordprocessingCanvas" xmlns:cx="http://schemas.microsoft.com/office/drawing/2014/chartex" xmlns:cx1="http://schemas.microsoft.com/office/drawing/2015/9/8/chartex" xmlns:cx2="http://schemas.microsoft.com/office/drawing/2015/10/21/chartex" xmlns:cx3="http://schemas.microsoft.com/office/drawing/2016/5/9/chartex" xmlns:cx4="http://schemas.microsoft.com/office/drawing/2016/5/10/chartex" xmlns:cx5="http://schemas.microsoft.com/office/drawing/2016/5/11/chartex" xmlns:cx6="http://schemas.microsoft.com/office/drawing/2016/5/12/chartex" xmlns:cx7="http://schemas.microsoft.com/office/drawing/2016/5/13/chartex" xmlns:cx8="http://schemas.microsoft.com/office/drawing/2016/5/14/chartex" xmlns:mc="http://schemas.openxmlformats.org/markup-compatibility/2006" xmlns:aink="http://schemas.microsoft.com/office/drawing/2016/ink" xmlns:am3d="http://schemas.microsoft.com/office/drawing/2017/model3d" xmlns:o="urn:schemas-microsoft-com:office:office" xmlns:oel="http://schemas.microsoft.com/office/2019/extlst" xmlns:r="http://schemas.openxmlformats.org/officeDocument/2006/relationships" xmlns:m="http://schemas.openxmlformats.org/officeDocument/2006/math" xmlns:v="urn:schemas-microsoft-com:vml" xmlns:wp14="http://schemas.microsoft.com/office/word/2010/wordprocessingDrawing" xmlns:wp="http://schemas.openxmlformats.org/drawingml/2006/wordprocessingDrawing" xmlns:w10="urn:schemas-microsoft-com:office:word" xmlns:w="http://schemas.openxmlformats.org/wordprocessingml/2006/main" xmlns:w14="http://schemas.microsoft.com/office/word/2010/wordml" xmlns:w15="http://schemas.microsoft.com/office/word/2012/wordml" xmlns:w16cex="http://schemas.microsoft.com/office/word/2018/wordml/cex" xmlns:w16cid="http://schemas.microsoft.com/office/word/2016/wordml/cid" xmlns:w16="http://schemas.microsoft.com/office/word/2018/wordml" xmlns:w16du="http://schemas.microsoft.com/office/word/2023/wordml/word16du" xmlns:w16sdtdh="http://schemas.microsoft.com/office/word/2020/wordml/sdtdatahash" xmlns:w16sdtfl="http://schemas.microsoft.com/office/word/2024/wordml/sdtformatlock" xmlns:w16se="http://schemas.microsoft.com/office/word/2015/wordml/symex" xmlns:wpg="http://schemas.microsoft.com/office/word/2010/wordprocessingGroup" xmlns:wpi="http://schemas.microsoft.com/office/word/2010/wordprocessingInk" xmlns:wne="http://schemas.microsoft.com/office/word/2006/wordml" xmlns:wps="http://schemas.microsoft.com/office/word/2010/wordprocessingShape" mc:Ignorable="w14 w15 w16se w16cid w16 w16cex w16sdtdh w16sdtfl w16du wp14">
+<w:document xmlns:wpc="http://schemas.microsoft.com/office/word/2010/wordprocessingCanvas" xmlns:cx="http://schemas.microsoft.com/office/drawing/2014/chartex" xmlns:cx1="http://schemas.microsoft.com/office/drawing/2015/9/8/chartex" xmlns:cx2="http://schemas.microsoft.com/office/drawing/2015/10/21/chartex" xmlns:cx3="http://schemas.microsoft.com/office/drawing/2016/5/9/chartex" xmlns:cx4="http://schemas.microsoft.com/office/drawing/2016/5/10/chartex" xmlns:cx5="http://schemas.microsoft.com/office/drawing/2016/5/11/chartex" xmlns:cx6="http://schemas.microsoft.com/office/drawing/2016/5/12/chartex" xmlns:cx7="http://schemas.microsoft.com/office/drawing/2016/5/13/chartex" xmlns:cx8="http://schemas.microsoft.com/office/drawing/2016/5/14/chartex" xmlns:mc="http://schemas.openxmlformats.org/markup-compatibility/2006" xmlns:aink="http://schemas.microsoft.com/office/drawing/2016/ink" xmlns:am3d="http://schemas.microsoft.com/office/drawing/2017/model3d" xmlns:o="urn:schemas-microsoft-com:office:office" xmlns:oel="http://schemas.microsoft.com/office/2019/extlst" xmlns:r="http://schemas.openxmlformats.org/officeDocument/2006/relationships" xmlns:m="http://schemas.openxmlformats.org/officeDocument/2006/math" xmlns:v="urn:schemas-microsoft-com:vml" xmlns:wp14="http://schemas.microsoft.com/office/word/2010/wordprocessingDrawing" xmlns:wp="http://schemas.openxmlformats.org/drawingml/2006/wordprocessingDrawing" xmlns:w10="urn:schemas-microsoft-com:office:word" xmlns:w="http://schemas.openxmlformats.org/wordprocessingml/2006/main" xmlns:w14="http://schemas.microsoft.com/office/word/2010/wordml" xmlns:w15="http://schemas.microsoft.com/office/word/2012/wordml" xmlns:w16cei="http://schemas.microsoft.com/office/word/2026/wordml/cei" xmlns:w16cex="http://schemas.microsoft.com/office/word/2018/wordml/cex" xmlns:w16cid="http://schemas.microsoft.com/office/word/2016/wordml/cid" xmlns:w16="http://schemas.microsoft.com/office/word/2018/wordml" xmlns:w16du="http://schemas.microsoft.com/office/word/2023/wordml/word16du" xmlns:w16sdtdh="http://schemas.microsoft.com/office/word/2020/wordml/sdtdatahash" xmlns:w16sdtfl="http://schemas.microsoft.com/office/word/2024/wordml/sdtformatlock" xmlns:w16se="http://schemas.microsoft.com/office/word/2015/wordml/symex" xmlns:wpg="http://schemas.microsoft.com/office/word/2010/wordprocessingGroup" xmlns:wpi="http://schemas.microsoft.com/office/word/2010/wordprocessingInk" xmlns:wne="http://schemas.microsoft.com/office/word/2006/wordml" xmlns:wps="http://schemas.microsoft.com/office/word/2010/wordprocessingShape" mc:Ignorable="w14 w15 w16se w16cid w16 w16cex w16sdtdh w16sdtfl w16du wp14">
   <w:body>
     <w:p>
       <w:pPr>
@@ -16,25 +16,7 @@
           <w:sz w:val="28"/>
           <w:szCs w:val="28"/>
         </w:rPr>
-        <w:t xml:space="preserve">           </w:t>
-      </w:r>
-      <w:proofErr w:type="spellStart"/>
-      <w:r>
-        <w:rPr>
-          <w:rFonts w:ascii="Times New Roman" w:hAnsi="Times New Roman" w:cs="Times New Roman"/>
-          <w:sz w:val="28"/>
-          <w:szCs w:val="28"/>
-        </w:rPr>
-        <w:t>Spendwise</w:t>
-      </w:r>
-      <w:proofErr w:type="spellEnd"/>
-      <w:r>
-        <w:rPr>
-          <w:rFonts w:ascii="Times New Roman" w:hAnsi="Times New Roman" w:cs="Times New Roman"/>
-          <w:sz w:val="28"/>
-          <w:szCs w:val="28"/>
-        </w:rPr>
-        <w:t xml:space="preserve"> Important Points</w:t>
+        <w:t xml:space="preserve">           Spendwise Important Points</w:t>
       </w:r>
     </w:p>
     <w:p>
@@ -94,95 +76,41 @@
           <w:sz w:val="28"/>
           <w:szCs w:val="28"/>
         </w:rPr>
-        <w:t xml:space="preserve">  </w:t>
-      </w:r>
-      <w:proofErr w:type="spellStart"/>
-      <w:r>
-        <w:rPr>
-          <w:rFonts w:ascii="Times New Roman" w:hAnsi="Times New Roman" w:cs="Times New Roman"/>
-          <w:sz w:val="28"/>
-          <w:szCs w:val="28"/>
-        </w:rPr>
-        <w:t>middleware.ts</w:t>
-      </w:r>
-      <w:proofErr w:type="spellEnd"/>
-      <w:r>
-        <w:rPr>
-          <w:rFonts w:ascii="Times New Roman" w:hAnsi="Times New Roman" w:cs="Times New Roman"/>
-          <w:sz w:val="28"/>
-          <w:szCs w:val="28"/>
-        </w:rPr>
-        <w:t xml:space="preserve"> runs on the SERVER</w:t>
-      </w:r>
-    </w:p>
-    <w:p>
-      <w:pPr>
-        <w:rPr>
-          <w:rFonts w:ascii="Times New Roman" w:hAnsi="Times New Roman" w:cs="Times New Roman"/>
-          <w:sz w:val="28"/>
-          <w:szCs w:val="28"/>
-        </w:rPr>
-      </w:pPr>
-      <w:r>
-        <w:rPr>
-          <w:rFonts w:ascii="Times New Roman" w:hAnsi="Times New Roman" w:cs="Times New Roman"/>
-          <w:sz w:val="28"/>
-          <w:szCs w:val="28"/>
-        </w:rPr>
-        <w:t xml:space="preserve">  </w:t>
-      </w:r>
-      <w:proofErr w:type="spellStart"/>
-      <w:r>
-        <w:rPr>
-          <w:rFonts w:ascii="Times New Roman" w:hAnsi="Times New Roman" w:cs="Times New Roman"/>
-          <w:sz w:val="28"/>
-          <w:szCs w:val="28"/>
-        </w:rPr>
-        <w:t>localStorage</w:t>
-      </w:r>
-      <w:proofErr w:type="spellEnd"/>
-      <w:r>
-        <w:rPr>
-          <w:rFonts w:ascii="Times New Roman" w:hAnsi="Times New Roman" w:cs="Times New Roman"/>
-          <w:sz w:val="28"/>
-          <w:szCs w:val="28"/>
-        </w:rPr>
-        <w:t xml:space="preserve"> exists only in the BROWSER</w:t>
-      </w:r>
-    </w:p>
-    <w:p>
-      <w:pPr>
-        <w:rPr>
-          <w:rFonts w:ascii="Times New Roman" w:hAnsi="Times New Roman" w:cs="Times New Roman"/>
-          <w:sz w:val="28"/>
-          <w:szCs w:val="28"/>
-        </w:rPr>
-      </w:pPr>
-      <w:r>
-        <w:rPr>
-          <w:rFonts w:ascii="Times New Roman" w:hAnsi="Times New Roman" w:cs="Times New Roman"/>
-          <w:sz w:val="28"/>
-          <w:szCs w:val="28"/>
-        </w:rPr>
-        <w:t xml:space="preserve">  Server cannot read </w:t>
-      </w:r>
-      <w:proofErr w:type="spellStart"/>
-      <w:r>
-        <w:rPr>
-          <w:rFonts w:ascii="Times New Roman" w:hAnsi="Times New Roman" w:cs="Times New Roman"/>
-          <w:sz w:val="28"/>
-          <w:szCs w:val="28"/>
-        </w:rPr>
-        <w:t>localStorage</w:t>
-      </w:r>
-      <w:proofErr w:type="spellEnd"/>
-      <w:r>
-        <w:rPr>
-          <w:rFonts w:ascii="Times New Roman" w:hAnsi="Times New Roman" w:cs="Times New Roman"/>
-          <w:sz w:val="28"/>
-          <w:szCs w:val="28"/>
-        </w:rPr>
-        <w:t>!</w:t>
+        <w:t xml:space="preserve">  middleware.ts runs on the SERVER</w:t>
+      </w:r>
+    </w:p>
+    <w:p>
+      <w:pPr>
+        <w:rPr>
+          <w:rFonts w:ascii="Times New Roman" w:hAnsi="Times New Roman" w:cs="Times New Roman"/>
+          <w:sz w:val="28"/>
+          <w:szCs w:val="28"/>
+        </w:rPr>
+      </w:pPr>
+      <w:r>
+        <w:rPr>
+          <w:rFonts w:ascii="Times New Roman" w:hAnsi="Times New Roman" w:cs="Times New Roman"/>
+          <w:sz w:val="28"/>
+          <w:szCs w:val="28"/>
+        </w:rPr>
+        <w:t xml:space="preserve">  localStorage exists only in the BROWSER</w:t>
+      </w:r>
+    </w:p>
+    <w:p>
+      <w:pPr>
+        <w:rPr>
+          <w:rFonts w:ascii="Times New Roman" w:hAnsi="Times New Roman" w:cs="Times New Roman"/>
+          <w:sz w:val="28"/>
+          <w:szCs w:val="28"/>
+        </w:rPr>
+      </w:pPr>
+      <w:r>
+        <w:rPr>
+          <w:rFonts w:ascii="Times New Roman" w:hAnsi="Times New Roman" w:cs="Times New Roman"/>
+          <w:sz w:val="28"/>
+          <w:szCs w:val="28"/>
+        </w:rPr>
+        <w:t xml:space="preserve">  Server cannot read localStorage!</w:t>
       </w:r>
     </w:p>
     <w:p>
@@ -225,25 +153,7 @@
           <w:sz w:val="28"/>
           <w:szCs w:val="28"/>
         </w:rPr>
-        <w:t xml:space="preserve">  Save token in BOTH </w:t>
-      </w:r>
-      <w:proofErr w:type="spellStart"/>
-      <w:r>
-        <w:rPr>
-          <w:rFonts w:ascii="Times New Roman" w:hAnsi="Times New Roman" w:cs="Times New Roman"/>
-          <w:sz w:val="28"/>
-          <w:szCs w:val="28"/>
-        </w:rPr>
-        <w:t>localStorage</w:t>
-      </w:r>
-      <w:proofErr w:type="spellEnd"/>
-      <w:r>
-        <w:rPr>
-          <w:rFonts w:ascii="Times New Roman" w:hAnsi="Times New Roman" w:cs="Times New Roman"/>
-          <w:sz w:val="28"/>
-          <w:szCs w:val="28"/>
-        </w:rPr>
-        <w:t xml:space="preserve"> AND cookie</w:t>
+        <w:t xml:space="preserve">  Save token in BOTH localStorage AND cookie</w:t>
       </w:r>
     </w:p>
     <w:p>
@@ -337,35 +247,7 @@
           <w:sz w:val="28"/>
           <w:szCs w:val="28"/>
         </w:rPr>
-        <w:t xml:space="preserve">Save token to </w:t>
-      </w:r>
-      <w:proofErr w:type="spellStart"/>
-      <w:proofErr w:type="gramStart"/>
-      <w:r>
-        <w:rPr>
-          <w:rFonts w:ascii="Times New Roman" w:hAnsi="Times New Roman" w:cs="Times New Roman"/>
-          <w:sz w:val="28"/>
-          <w:szCs w:val="28"/>
-        </w:rPr>
-        <w:t>localStorage</w:t>
-      </w:r>
-      <w:proofErr w:type="spellEnd"/>
-      <w:r>
-        <w:rPr>
-          <w:rFonts w:ascii="Times New Roman" w:hAnsi="Times New Roman" w:cs="Times New Roman"/>
-          <w:sz w:val="28"/>
-          <w:szCs w:val="28"/>
-        </w:rPr>
-        <w:t xml:space="preserve">  ←</w:t>
-      </w:r>
-      <w:proofErr w:type="gramEnd"/>
-      <w:r>
-        <w:rPr>
-          <w:rFonts w:ascii="Times New Roman" w:hAnsi="Times New Roman" w:cs="Times New Roman"/>
-          <w:sz w:val="28"/>
-          <w:szCs w:val="28"/>
-        </w:rPr>
-        <w:t xml:space="preserve"> for browser JS (Axios interceptor)</w:t>
+        <w:t>Save token to localStorage  ← for browser JS (Axios interceptor)</w:t>
       </w:r>
     </w:p>
     <w:p>
@@ -444,23 +326,13 @@
           <w:szCs w:val="28"/>
         </w:rPr>
       </w:pPr>
-      <w:proofErr w:type="spellStart"/>
-      <w:r>
-        <w:rPr>
-          <w:rFonts w:ascii="Times New Roman" w:hAnsi="Times New Roman" w:cs="Times New Roman"/>
-          <w:sz w:val="28"/>
-          <w:szCs w:val="28"/>
-        </w:rPr>
-        <w:t>middleware.ts</w:t>
-      </w:r>
-      <w:proofErr w:type="spellEnd"/>
-      <w:r>
-        <w:rPr>
-          <w:rFonts w:ascii="Times New Roman" w:hAnsi="Times New Roman" w:cs="Times New Roman"/>
-          <w:sz w:val="28"/>
-          <w:szCs w:val="28"/>
-        </w:rPr>
-        <w:t xml:space="preserve"> runs on server</w:t>
+      <w:r>
+        <w:rPr>
+          <w:rFonts w:ascii="Times New Roman" w:hAnsi="Times New Roman" w:cs="Times New Roman"/>
+          <w:sz w:val="28"/>
+          <w:szCs w:val="28"/>
+        </w:rPr>
+        <w:t>middleware.ts runs on server</w:t>
       </w:r>
     </w:p>
     <w:p>
@@ -542,43 +414,7 @@
           <w:sz w:val="28"/>
           <w:szCs w:val="28"/>
         </w:rPr>
-        <w:t xml:space="preserve">We already wrote the cookie helpers in </w:t>
-      </w:r>
-      <w:proofErr w:type="spellStart"/>
-      <w:r>
-        <w:rPr>
-          <w:rFonts w:ascii="Times New Roman" w:hAnsi="Times New Roman" w:cs="Times New Roman"/>
-          <w:sz w:val="28"/>
-          <w:szCs w:val="28"/>
-        </w:rPr>
-        <w:t>useAuthStore.ts</w:t>
-      </w:r>
-      <w:proofErr w:type="spellEnd"/>
-      <w:r>
-        <w:rPr>
-          <w:rFonts w:ascii="Times New Roman" w:hAnsi="Times New Roman" w:cs="Times New Roman"/>
-          <w:sz w:val="28"/>
-          <w:szCs w:val="28"/>
-        </w:rPr>
-        <w:t>. But let me make sure they are correctly implemented. Open apps/web/store/</w:t>
-      </w:r>
-      <w:proofErr w:type="spellStart"/>
-      <w:r>
-        <w:rPr>
-          <w:rFonts w:ascii="Times New Roman" w:hAnsi="Times New Roman" w:cs="Times New Roman"/>
-          <w:sz w:val="28"/>
-          <w:szCs w:val="28"/>
-        </w:rPr>
-        <w:t>useAuthStore.ts</w:t>
-      </w:r>
-      <w:proofErr w:type="spellEnd"/>
-      <w:r>
-        <w:rPr>
-          <w:rFonts w:ascii="Times New Roman" w:hAnsi="Times New Roman" w:cs="Times New Roman"/>
-          <w:sz w:val="28"/>
-          <w:szCs w:val="28"/>
-        </w:rPr>
-        <w:t xml:space="preserve"> and verify these two helper functions exist at the top:</w:t>
+        <w:t>We already wrote the cookie helpers in useAuthStore.ts. But let me make sure they are correctly implemented. Open apps/web/store/useAuthStore.ts and verify these two helper functions exist at the top:</w:t>
       </w:r>
     </w:p>
     <w:p>
@@ -623,114 +459,30 @@
           <w:szCs w:val="28"/>
         </w:rPr>
       </w:pPr>
-      <w:proofErr w:type="gramStart"/>
-      <w:r>
-        <w:rPr>
-          <w:rFonts w:ascii="Times New Roman" w:hAnsi="Times New Roman" w:cs="Times New Roman"/>
-          <w:sz w:val="28"/>
-          <w:szCs w:val="28"/>
-        </w:rPr>
-        <w:t xml:space="preserve">│  </w:t>
-      </w:r>
-      <w:proofErr w:type="spellStart"/>
-      <w:r>
-        <w:rPr>
-          <w:rFonts w:ascii="Times New Roman" w:hAnsi="Times New Roman" w:cs="Times New Roman"/>
-          <w:sz w:val="28"/>
-          <w:szCs w:val="28"/>
-        </w:rPr>
-        <w:t>localStorage</w:t>
-      </w:r>
-      <w:proofErr w:type="spellEnd"/>
-      <w:proofErr w:type="gramEnd"/>
-      <w:r>
-        <w:rPr>
-          <w:rFonts w:ascii="Times New Roman" w:hAnsi="Times New Roman" w:cs="Times New Roman"/>
-          <w:sz w:val="28"/>
-          <w:szCs w:val="28"/>
-        </w:rPr>
-        <w:t>['</w:t>
-      </w:r>
-      <w:proofErr w:type="spellStart"/>
-      <w:r>
-        <w:rPr>
-          <w:rFonts w:ascii="Times New Roman" w:hAnsi="Times New Roman" w:cs="Times New Roman"/>
-          <w:sz w:val="28"/>
-          <w:szCs w:val="28"/>
-        </w:rPr>
-        <w:t>spendwise_token</w:t>
-      </w:r>
-      <w:proofErr w:type="spellEnd"/>
-      <w:r>
-        <w:rPr>
-          <w:rFonts w:ascii="Times New Roman" w:hAnsi="Times New Roman" w:cs="Times New Roman"/>
-          <w:sz w:val="28"/>
-          <w:szCs w:val="28"/>
-        </w:rPr>
-        <w:t>'] = "</w:t>
-      </w:r>
-      <w:proofErr w:type="spellStart"/>
-      <w:r>
-        <w:rPr>
-          <w:rFonts w:ascii="Times New Roman" w:hAnsi="Times New Roman" w:cs="Times New Roman"/>
-          <w:sz w:val="28"/>
-          <w:szCs w:val="28"/>
-        </w:rPr>
-        <w:t>eyJ</w:t>
-      </w:r>
-      <w:proofErr w:type="spellEnd"/>
-      <w:r>
-        <w:rPr>
-          <w:rFonts w:ascii="Times New Roman" w:hAnsi="Times New Roman" w:cs="Times New Roman"/>
-          <w:sz w:val="28"/>
-          <w:szCs w:val="28"/>
-        </w:rPr>
-        <w:t xml:space="preserve">..."     </w:t>
-      </w:r>
-    </w:p>
-    <w:p>
-      <w:pPr>
-        <w:rPr>
-          <w:rFonts w:ascii="Times New Roman" w:hAnsi="Times New Roman" w:cs="Times New Roman"/>
-          <w:sz w:val="28"/>
-          <w:szCs w:val="28"/>
-        </w:rPr>
-      </w:pPr>
-      <w:proofErr w:type="gramStart"/>
-      <w:r>
-        <w:rPr>
-          <w:rFonts w:ascii="Times New Roman" w:hAnsi="Times New Roman" w:cs="Times New Roman"/>
-          <w:sz w:val="28"/>
-          <w:szCs w:val="28"/>
-        </w:rPr>
-        <w:t>│  →</w:t>
-      </w:r>
-      <w:proofErr w:type="gramEnd"/>
-      <w:r>
-        <w:rPr>
-          <w:rFonts w:ascii="Times New Roman" w:hAnsi="Times New Roman" w:cs="Times New Roman"/>
-          <w:sz w:val="28"/>
-          <w:szCs w:val="28"/>
-        </w:rPr>
-        <w:t xml:space="preserve"> Used by: Axios interceptor (</w:t>
-      </w:r>
-      <w:proofErr w:type="spellStart"/>
-      <w:r>
-        <w:rPr>
-          <w:rFonts w:ascii="Times New Roman" w:hAnsi="Times New Roman" w:cs="Times New Roman"/>
-          <w:sz w:val="28"/>
-          <w:szCs w:val="28"/>
-        </w:rPr>
-        <w:t>api.ts</w:t>
-      </w:r>
-      <w:proofErr w:type="spellEnd"/>
-      <w:r>
-        <w:rPr>
-          <w:rFonts w:ascii="Times New Roman" w:hAnsi="Times New Roman" w:cs="Times New Roman"/>
-          <w:sz w:val="28"/>
-          <w:szCs w:val="28"/>
-        </w:rPr>
-        <w:t xml:space="preserve">)          </w:t>
+      <w:r>
+        <w:rPr>
+          <w:rFonts w:ascii="Times New Roman" w:hAnsi="Times New Roman" w:cs="Times New Roman"/>
+          <w:sz w:val="28"/>
+          <w:szCs w:val="28"/>
+        </w:rPr>
+        <w:t xml:space="preserve">│  localStorage['spendwise_token'] = "eyJ..."     </w:t>
+      </w:r>
+    </w:p>
+    <w:p>
+      <w:pPr>
+        <w:rPr>
+          <w:rFonts w:ascii="Times New Roman" w:hAnsi="Times New Roman" w:cs="Times New Roman"/>
+          <w:sz w:val="28"/>
+          <w:szCs w:val="28"/>
+        </w:rPr>
+      </w:pPr>
+      <w:r>
+        <w:rPr>
+          <w:rFonts w:ascii="Times New Roman" w:hAnsi="Times New Roman" w:cs="Times New Roman"/>
+          <w:sz w:val="28"/>
+          <w:szCs w:val="28"/>
+        </w:rPr>
+        <w:t xml:space="preserve">│  → Used by: Axios interceptor (api.ts)          </w:t>
       </w:r>
     </w:p>
     <w:p>
@@ -807,78 +559,24 @@
           <w:sz w:val="28"/>
           <w:szCs w:val="28"/>
         </w:rPr>
-        <w:t>│  Cookie['</w:t>
-      </w:r>
-      <w:proofErr w:type="spellStart"/>
-      <w:r>
-        <w:rPr>
-          <w:rFonts w:ascii="Times New Roman" w:hAnsi="Times New Roman" w:cs="Times New Roman"/>
-          <w:sz w:val="28"/>
-          <w:szCs w:val="28"/>
-        </w:rPr>
-        <w:t>spendwise_token</w:t>
-      </w:r>
-      <w:proofErr w:type="spellEnd"/>
-      <w:r>
-        <w:rPr>
-          <w:rFonts w:ascii="Times New Roman" w:hAnsi="Times New Roman" w:cs="Times New Roman"/>
-          <w:sz w:val="28"/>
-          <w:szCs w:val="28"/>
-        </w:rPr>
-        <w:t>'] = "</w:t>
-      </w:r>
-      <w:proofErr w:type="spellStart"/>
-      <w:r>
-        <w:rPr>
-          <w:rFonts w:ascii="Times New Roman" w:hAnsi="Times New Roman" w:cs="Times New Roman"/>
-          <w:sz w:val="28"/>
-          <w:szCs w:val="28"/>
-        </w:rPr>
-        <w:t>eyJ</w:t>
-      </w:r>
-      <w:proofErr w:type="spellEnd"/>
-      <w:r>
-        <w:rPr>
-          <w:rFonts w:ascii="Times New Roman" w:hAnsi="Times New Roman" w:cs="Times New Roman"/>
-          <w:sz w:val="28"/>
-          <w:szCs w:val="28"/>
-        </w:rPr>
-        <w:t xml:space="preserve">..."           </w:t>
-      </w:r>
-    </w:p>
-    <w:p>
-      <w:pPr>
-        <w:rPr>
-          <w:rFonts w:ascii="Times New Roman" w:hAnsi="Times New Roman" w:cs="Times New Roman"/>
-          <w:sz w:val="28"/>
-          <w:szCs w:val="28"/>
-        </w:rPr>
-      </w:pPr>
-      <w:r>
-        <w:rPr>
-          <w:rFonts w:ascii="Times New Roman" w:hAnsi="Times New Roman" w:cs="Times New Roman"/>
-          <w:sz w:val="28"/>
-          <w:szCs w:val="28"/>
-        </w:rPr>
-        <w:t xml:space="preserve">│  → Used by: </w:t>
-      </w:r>
-      <w:proofErr w:type="spellStart"/>
-      <w:r>
-        <w:rPr>
-          <w:rFonts w:ascii="Times New Roman" w:hAnsi="Times New Roman" w:cs="Times New Roman"/>
-          <w:sz w:val="28"/>
-          <w:szCs w:val="28"/>
-        </w:rPr>
-        <w:t>middleware.ts</w:t>
-      </w:r>
-      <w:proofErr w:type="spellEnd"/>
-      <w:r>
-        <w:rPr>
-          <w:rFonts w:ascii="Times New Roman" w:hAnsi="Times New Roman" w:cs="Times New Roman"/>
-          <w:sz w:val="28"/>
-          <w:szCs w:val="28"/>
-        </w:rPr>
-        <w:t xml:space="preserve">                       </w:t>
+        <w:t xml:space="preserve">│  Cookie['spendwise_token'] = "eyJ..."           </w:t>
+      </w:r>
+    </w:p>
+    <w:p>
+      <w:pPr>
+        <w:rPr>
+          <w:rFonts w:ascii="Times New Roman" w:hAnsi="Times New Roman" w:cs="Times New Roman"/>
+          <w:sz w:val="28"/>
+          <w:szCs w:val="28"/>
+        </w:rPr>
+      </w:pPr>
+      <w:r>
+        <w:rPr>
+          <w:rFonts w:ascii="Times New Roman" w:hAnsi="Times New Roman" w:cs="Times New Roman"/>
+          <w:sz w:val="28"/>
+          <w:szCs w:val="28"/>
+        </w:rPr>
+        <w:t xml:space="preserve">│  → Used by: middleware.ts                       </w:t>
       </w:r>
     </w:p>
     <w:p>
@@ -1068,23 +766,64 @@
         </w:rPr>
         <w:t xml:space="preserve">Gemini API Key = </w:t>
       </w:r>
-      <w:proofErr w:type="gramStart"/>
-      <w:r>
-        <w:rPr>
-          <w:rFonts w:ascii="Times New Roman" w:hAnsi="Times New Roman" w:cs="Times New Roman"/>
-          <w:sz w:val="28"/>
-          <w:szCs w:val="28"/>
-        </w:rPr>
-        <w:t>AQ.Ab</w:t>
-      </w:r>
-      <w:proofErr w:type="gramEnd"/>
-      <w:r>
-        <w:rPr>
-          <w:rFonts w:ascii="Times New Roman" w:hAnsi="Times New Roman" w:cs="Times New Roman"/>
-          <w:sz w:val="28"/>
-          <w:szCs w:val="28"/>
-        </w:rPr>
-        <w:t>8RN6JtLpHr-X399xMdltMeKN98-xivIbtH6waSS6Jb4CRDzA</w:t>
+      <w:r>
+        <w:rPr>
+          <w:rFonts w:ascii="Times New Roman" w:hAnsi="Times New Roman" w:cs="Times New Roman"/>
+          <w:sz w:val="28"/>
+          <w:szCs w:val="28"/>
+        </w:rPr>
+        <w:t>AQ.Ab8RN6JtLpHr-X399xMdltMeKN98-xivIbtH6waSS6Jb4CRDzA</w:t>
+      </w:r>
+    </w:p>
+    <w:p>
+      <w:pPr>
+        <w:rPr>
+          <w:rFonts w:ascii="Times New Roman" w:hAnsi="Times New Roman" w:cs="Times New Roman"/>
+          <w:sz w:val="28"/>
+          <w:szCs w:val="28"/>
+        </w:rPr>
+      </w:pPr>
+    </w:p>
+    <w:p>
+      <w:pPr>
+        <w:rPr>
+          <w:rFonts w:ascii="Times New Roman" w:hAnsi="Times New Roman" w:cs="Times New Roman"/>
+          <w:sz w:val="28"/>
+          <w:szCs w:val="28"/>
+        </w:rPr>
+      </w:pPr>
+    </w:p>
+    <w:p>
+      <w:pPr>
+        <w:rPr>
+          <w:rFonts w:ascii="Times New Roman" w:hAnsi="Times New Roman" w:cs="Times New Roman"/>
+          <w:sz w:val="28"/>
+          <w:szCs w:val="28"/>
+        </w:rPr>
+      </w:pPr>
+      <w:r>
+        <w:rPr>
+          <w:rFonts w:ascii="Times New Roman" w:hAnsi="Times New Roman" w:cs="Times New Roman"/>
+          <w:sz w:val="28"/>
+          <w:szCs w:val="28"/>
+        </w:rPr>
+        <w:t>Claude api key= ‘</w:t>
+      </w:r>
+      <w:r>
+        <w:rPr>
+          <w:rFonts w:ascii="Times New Roman" w:hAnsi="Times New Roman" w:cs="Times New Roman"/>
+          <w:sz w:val="28"/>
+          <w:szCs w:val="28"/>
+        </w:rPr>
+        <w:t>sk-9fb5a0dea035427c9f362adcf1ed5187</w:t>
+      </w:r>
+      <w:r>
+        <w:rPr>
+          <w:rFonts w:ascii="Times New Roman" w:hAnsi="Times New Roman" w:cs="Times New Roman"/>
+          <w:sz w:val="28"/>
+          <w:szCs w:val="28"/>
+        </w:rPr>
+        <w:t>’</w:t>
       </w:r>
     </w:p>
     <w:p>
@@ -1718,7 +1457,6 @@
   <w:style w:type="character" w:default="1" w:styleId="DefaultParagraphFont">
     <w:name w:val="Default Paragraph Font"/>
     <w:uiPriority w:val="1"/>
-    <w:semiHidden/>
     <w:unhideWhenUsed/>
   </w:style>
   <w:style w:type="table" w:default="1" w:styleId="TableNormal">

</xml_diff>

<commit_message>
Set unpredictable public_id instead of sequential user ID for privacy
</commit_message>
<xml_diff>
--- a/Spendwise Important Points.docx
+++ b/Spendwise Important Points.docx
@@ -843,6 +843,105 @@
           <w:szCs w:val="28"/>
         </w:rPr>
       </w:pPr>
+      <w:r>
+        <w:rPr>
+          <w:noProof/>
+        </w:rPr>
+        <w:drawing>
+          <wp:inline distT="0" distB="0" distL="0" distR="0" wp14:anchorId="00D1268E" wp14:editId="72C0C038">
+            <wp:extent cx="5534025" cy="1905000"/>
+            <wp:effectExtent l="0" t="0" r="9525" b="0"/>
+            <wp:docPr id="1978391525" name="Picture 1"/>
+            <wp:cNvGraphicFramePr>
+              <a:graphicFrameLocks xmlns:a="http://schemas.openxmlformats.org/drawingml/2006/main" noChangeAspect="1"/>
+            </wp:cNvGraphicFramePr>
+            <a:graphic xmlns:a="http://schemas.openxmlformats.org/drawingml/2006/main">
+              <a:graphicData uri="http://schemas.openxmlformats.org/drawingml/2006/picture">
+                <pic:pic xmlns:pic="http://schemas.openxmlformats.org/drawingml/2006/picture">
+                  <pic:nvPicPr>
+                    <pic:cNvPr id="1978391525" name=""/>
+                    <pic:cNvPicPr/>
+                  </pic:nvPicPr>
+                  <pic:blipFill>
+                    <a:blip r:embed="rId5"/>
+                    <a:stretch>
+                      <a:fillRect/>
+                    </a:stretch>
+                  </pic:blipFill>
+                  <pic:spPr>
+                    <a:xfrm>
+                      <a:off x="0" y="0"/>
+                      <a:ext cx="5534025" cy="1905000"/>
+                    </a:xfrm>
+                    <a:prstGeom prst="rect">
+                      <a:avLst/>
+                    </a:prstGeom>
+                  </pic:spPr>
+                </pic:pic>
+              </a:graphicData>
+            </a:graphic>
+          </wp:inline>
+        </w:drawing>
+      </w:r>
+    </w:p>
+    <w:p>
+      <w:pPr>
+        <w:rPr>
+          <w:rFonts w:ascii="Times New Roman" w:hAnsi="Times New Roman" w:cs="Times New Roman"/>
+          <w:sz w:val="28"/>
+          <w:szCs w:val="28"/>
+        </w:rPr>
+      </w:pPr>
+    </w:p>
+    <w:p>
+      <w:pPr>
+        <w:rPr>
+          <w:rFonts w:ascii="Times New Roman" w:hAnsi="Times New Roman" w:cs="Times New Roman"/>
+          <w:sz w:val="28"/>
+          <w:szCs w:val="28"/>
+        </w:rPr>
+      </w:pPr>
+      <w:r>
+        <w:rPr>
+          <w:noProof/>
+        </w:rPr>
+        <w:lastRenderedPageBreak/>
+        <w:drawing>
+          <wp:inline distT="0" distB="0" distL="0" distR="0" wp14:anchorId="38EF8DE9" wp14:editId="3963568B">
+            <wp:extent cx="5943600" cy="2239645"/>
+            <wp:effectExtent l="0" t="0" r="0" b="8255"/>
+            <wp:docPr id="230497216" name="Picture 1"/>
+            <wp:cNvGraphicFramePr>
+              <a:graphicFrameLocks xmlns:a="http://schemas.openxmlformats.org/drawingml/2006/main" noChangeAspect="1"/>
+            </wp:cNvGraphicFramePr>
+            <a:graphic xmlns:a="http://schemas.openxmlformats.org/drawingml/2006/main">
+              <a:graphicData uri="http://schemas.openxmlformats.org/drawingml/2006/picture">
+                <pic:pic xmlns:pic="http://schemas.openxmlformats.org/drawingml/2006/picture">
+                  <pic:nvPicPr>
+                    <pic:cNvPr id="230497216" name=""/>
+                    <pic:cNvPicPr/>
+                  </pic:nvPicPr>
+                  <pic:blipFill>
+                    <a:blip r:embed="rId6"/>
+                    <a:stretch>
+                      <a:fillRect/>
+                    </a:stretch>
+                  </pic:blipFill>
+                  <pic:spPr>
+                    <a:xfrm>
+                      <a:off x="0" y="0"/>
+                      <a:ext cx="5943600" cy="2239645"/>
+                    </a:xfrm>
+                    <a:prstGeom prst="rect">
+                      <a:avLst/>
+                    </a:prstGeom>
+                  </pic:spPr>
+                </pic:pic>
+              </a:graphicData>
+            </a:graphic>
+          </wp:inline>
+        </w:drawing>
+      </w:r>
     </w:p>
     <w:sectPr>
       <w:pgSz w:w="12240" w:h="15840"/>

</xml_diff>

<commit_message>
fix issue by making all test cases run sequentially
</commit_message>
<xml_diff>
--- a/Spendwise Important Points.docx
+++ b/Spendwise Important Points.docx
@@ -797,33 +797,19 @@
       <w:pPr>
         <w:rPr>
           <w:rFonts w:ascii="Times New Roman" w:hAnsi="Times New Roman" w:cs="Times New Roman"/>
-          <w:sz w:val="28"/>
-          <w:szCs w:val="28"/>
-        </w:rPr>
-      </w:pPr>
-      <w:r>
-        <w:rPr>
-          <w:rFonts w:ascii="Times New Roman" w:hAnsi="Times New Roman" w:cs="Times New Roman"/>
-          <w:sz w:val="28"/>
-          <w:szCs w:val="28"/>
-        </w:rPr>
-        <w:t>Claude api key= ‘</w:t>
-      </w:r>
-      <w:r>
-        <w:rPr>
-          <w:rFonts w:ascii="Times New Roman" w:hAnsi="Times New Roman" w:cs="Times New Roman"/>
-          <w:sz w:val="28"/>
-          <w:szCs w:val="28"/>
-        </w:rPr>
-        <w:t>sk-9fb5a0dea035427c9f362adcf1ed5187</w:t>
-      </w:r>
-      <w:r>
-        <w:rPr>
-          <w:rFonts w:ascii="Times New Roman" w:hAnsi="Times New Roman" w:cs="Times New Roman"/>
-          <w:sz w:val="28"/>
-          <w:szCs w:val="28"/>
-        </w:rPr>
-        <w:t>’</w:t>
+          <w:color w:val="00B0F0"/>
+          <w:sz w:val="28"/>
+          <w:szCs w:val="28"/>
+        </w:rPr>
+      </w:pPr>
+      <w:r>
+        <w:rPr>
+          <w:rFonts w:ascii="Times New Roman" w:hAnsi="Times New Roman" w:cs="Times New Roman"/>
+          <w:color w:val="00B0F0"/>
+          <w:sz w:val="28"/>
+          <w:szCs w:val="28"/>
+        </w:rPr>
+        <w:t>Claude api key= ‘sk-9fb5a0dea035427c9f362adcf1ed5187’</w:t>
       </w:r>
     </w:p>
     <w:p>
@@ -942,6 +928,124 @@
           </wp:inline>
         </w:drawing>
       </w:r>
+    </w:p>
+    <w:p>
+      <w:pPr>
+        <w:rPr>
+          <w:rFonts w:ascii="Times New Roman" w:hAnsi="Times New Roman" w:cs="Times New Roman"/>
+          <w:sz w:val="28"/>
+          <w:szCs w:val="28"/>
+        </w:rPr>
+      </w:pPr>
+    </w:p>
+    <w:p>
+      <w:pPr>
+        <w:rPr>
+          <w:rFonts w:ascii="Times New Roman" w:hAnsi="Times New Roman" w:cs="Times New Roman"/>
+          <w:sz w:val="28"/>
+          <w:szCs w:val="28"/>
+        </w:rPr>
+      </w:pPr>
+      <w:r>
+        <w:rPr>
+          <w:rFonts w:ascii="Times New Roman" w:hAnsi="Times New Roman" w:cs="Times New Roman"/>
+          <w:sz w:val="28"/>
+          <w:szCs w:val="28"/>
+        </w:rPr>
+        <w:t>Run test cases:</w:t>
+      </w:r>
+    </w:p>
+    <w:p>
+      <w:pPr>
+        <w:rPr>
+          <w:rFonts w:ascii="Times New Roman" w:hAnsi="Times New Roman" w:cs="Times New Roman"/>
+          <w:sz w:val="28"/>
+          <w:szCs w:val="28"/>
+        </w:rPr>
+      </w:pPr>
+      <w:r>
+        <w:rPr>
+          <w:rFonts w:ascii="Times New Roman" w:hAnsi="Times New Roman" w:cs="Times New Roman"/>
+          <w:sz w:val="28"/>
+          <w:szCs w:val="28"/>
+        </w:rPr>
+        <w:t xml:space="preserve">    Run all test cases: npm run test</w:t>
+      </w:r>
+    </w:p>
+    <w:p>
+      <w:pPr>
+        <w:rPr>
+          <w:rFonts w:ascii="Times New Roman" w:hAnsi="Times New Roman" w:cs="Times New Roman"/>
+          <w:sz w:val="28"/>
+          <w:szCs w:val="28"/>
+        </w:rPr>
+      </w:pPr>
+      <w:r>
+        <w:rPr>
+          <w:rFonts w:ascii="Times New Roman" w:hAnsi="Times New Roman" w:cs="Times New Roman"/>
+          <w:sz w:val="28"/>
+          <w:szCs w:val="28"/>
+        </w:rPr>
+        <w:t xml:space="preserve">    </w:t>
+      </w:r>
+      <w:r>
+        <w:rPr>
+          <w:rFonts w:ascii="Times New Roman" w:hAnsi="Times New Roman" w:cs="Times New Roman"/>
+          <w:sz w:val="28"/>
+          <w:szCs w:val="28"/>
+        </w:rPr>
+        <w:t>Shows a table of what percentage of each file is actually exercised by tests</w:t>
+      </w:r>
+      <w:r>
+        <w:rPr>
+          <w:rFonts w:ascii="Times New Roman" w:hAnsi="Times New Roman" w:cs="Times New Roman"/>
+          <w:sz w:val="28"/>
+          <w:szCs w:val="28"/>
+        </w:rPr>
+        <w:t xml:space="preserve">: </w:t>
+      </w:r>
+    </w:p>
+    <w:p>
+      <w:pPr>
+        <w:rPr>
+          <w:rFonts w:ascii="Times New Roman" w:hAnsi="Times New Roman" w:cs="Times New Roman"/>
+          <w:sz w:val="28"/>
+          <w:szCs w:val="28"/>
+        </w:rPr>
+      </w:pPr>
+      <w:r>
+        <w:rPr>
+          <w:rFonts w:ascii="Times New Roman" w:hAnsi="Times New Roman" w:cs="Times New Roman"/>
+          <w:sz w:val="28"/>
+          <w:szCs w:val="28"/>
+        </w:rPr>
+        <w:t xml:space="preserve">              </w:t>
+      </w:r>
+      <w:r>
+        <w:rPr>
+          <w:rFonts w:ascii="Times New Roman" w:hAnsi="Times New Roman" w:cs="Times New Roman"/>
+          <w:sz w:val="28"/>
+          <w:szCs w:val="28"/>
+        </w:rPr>
+        <w:t>n</w:t>
+      </w:r>
+      <w:r>
+        <w:rPr>
+          <w:rFonts w:ascii="Times New Roman" w:hAnsi="Times New Roman" w:cs="Times New Roman"/>
+          <w:sz w:val="28"/>
+          <w:szCs w:val="28"/>
+        </w:rPr>
+        <w:t>pm run test:coverage</w:t>
+      </w:r>
+    </w:p>
+    <w:p>
+      <w:pPr>
+        <w:rPr>
+          <w:rFonts w:ascii="Times New Roman" w:hAnsi="Times New Roman" w:cs="Times New Roman"/>
+          <w:sz w:val="28"/>
+          <w:szCs w:val="28"/>
+        </w:rPr>
+      </w:pPr>
     </w:p>
     <w:sectPr>
       <w:pgSz w:w="12240" w:h="15840"/>

</xml_diff>

<commit_message>
setup docker and fix docker env vars and database initialization for containerized setup
</commit_message>
<xml_diff>
--- a/Spendwise Important Points.docx
+++ b/Spendwise Important Points.docx
@@ -16,7 +16,25 @@
           <w:sz w:val="28"/>
           <w:szCs w:val="28"/>
         </w:rPr>
-        <w:t xml:space="preserve">           Spendwise Important Points</w:t>
+        <w:t xml:space="preserve">           </w:t>
+      </w:r>
+      <w:proofErr w:type="spellStart"/>
+      <w:r>
+        <w:rPr>
+          <w:rFonts w:ascii="Times New Roman" w:hAnsi="Times New Roman" w:cs="Times New Roman"/>
+          <w:sz w:val="28"/>
+          <w:szCs w:val="28"/>
+        </w:rPr>
+        <w:t>Spendwise</w:t>
+      </w:r>
+      <w:proofErr w:type="spellEnd"/>
+      <w:r>
+        <w:rPr>
+          <w:rFonts w:ascii="Times New Roman" w:hAnsi="Times New Roman" w:cs="Times New Roman"/>
+          <w:sz w:val="28"/>
+          <w:szCs w:val="28"/>
+        </w:rPr>
+        <w:t xml:space="preserve"> Important Points</w:t>
       </w:r>
     </w:p>
     <w:p>
@@ -76,41 +94,95 @@
           <w:sz w:val="28"/>
           <w:szCs w:val="28"/>
         </w:rPr>
-        <w:t xml:space="preserve">  middleware.ts runs on the SERVER</w:t>
-      </w:r>
-    </w:p>
-    <w:p>
-      <w:pPr>
-        <w:rPr>
-          <w:rFonts w:ascii="Times New Roman" w:hAnsi="Times New Roman" w:cs="Times New Roman"/>
-          <w:sz w:val="28"/>
-          <w:szCs w:val="28"/>
-        </w:rPr>
-      </w:pPr>
-      <w:r>
-        <w:rPr>
-          <w:rFonts w:ascii="Times New Roman" w:hAnsi="Times New Roman" w:cs="Times New Roman"/>
-          <w:sz w:val="28"/>
-          <w:szCs w:val="28"/>
-        </w:rPr>
-        <w:t xml:space="preserve">  localStorage exists only in the BROWSER</w:t>
-      </w:r>
-    </w:p>
-    <w:p>
-      <w:pPr>
-        <w:rPr>
-          <w:rFonts w:ascii="Times New Roman" w:hAnsi="Times New Roman" w:cs="Times New Roman"/>
-          <w:sz w:val="28"/>
-          <w:szCs w:val="28"/>
-        </w:rPr>
-      </w:pPr>
-      <w:r>
-        <w:rPr>
-          <w:rFonts w:ascii="Times New Roman" w:hAnsi="Times New Roman" w:cs="Times New Roman"/>
-          <w:sz w:val="28"/>
-          <w:szCs w:val="28"/>
-        </w:rPr>
-        <w:t xml:space="preserve">  Server cannot read localStorage!</w:t>
+        <w:t xml:space="preserve">  </w:t>
+      </w:r>
+      <w:proofErr w:type="spellStart"/>
+      <w:r>
+        <w:rPr>
+          <w:rFonts w:ascii="Times New Roman" w:hAnsi="Times New Roman" w:cs="Times New Roman"/>
+          <w:sz w:val="28"/>
+          <w:szCs w:val="28"/>
+        </w:rPr>
+        <w:t>middleware.ts</w:t>
+      </w:r>
+      <w:proofErr w:type="spellEnd"/>
+      <w:r>
+        <w:rPr>
+          <w:rFonts w:ascii="Times New Roman" w:hAnsi="Times New Roman" w:cs="Times New Roman"/>
+          <w:sz w:val="28"/>
+          <w:szCs w:val="28"/>
+        </w:rPr>
+        <w:t xml:space="preserve"> runs on the SERVER</w:t>
+      </w:r>
+    </w:p>
+    <w:p>
+      <w:pPr>
+        <w:rPr>
+          <w:rFonts w:ascii="Times New Roman" w:hAnsi="Times New Roman" w:cs="Times New Roman"/>
+          <w:sz w:val="28"/>
+          <w:szCs w:val="28"/>
+        </w:rPr>
+      </w:pPr>
+      <w:r>
+        <w:rPr>
+          <w:rFonts w:ascii="Times New Roman" w:hAnsi="Times New Roman" w:cs="Times New Roman"/>
+          <w:sz w:val="28"/>
+          <w:szCs w:val="28"/>
+        </w:rPr>
+        <w:t xml:space="preserve">  </w:t>
+      </w:r>
+      <w:proofErr w:type="spellStart"/>
+      <w:r>
+        <w:rPr>
+          <w:rFonts w:ascii="Times New Roman" w:hAnsi="Times New Roman" w:cs="Times New Roman"/>
+          <w:sz w:val="28"/>
+          <w:szCs w:val="28"/>
+        </w:rPr>
+        <w:t>localStorage</w:t>
+      </w:r>
+      <w:proofErr w:type="spellEnd"/>
+      <w:r>
+        <w:rPr>
+          <w:rFonts w:ascii="Times New Roman" w:hAnsi="Times New Roman" w:cs="Times New Roman"/>
+          <w:sz w:val="28"/>
+          <w:szCs w:val="28"/>
+        </w:rPr>
+        <w:t xml:space="preserve"> exists only in the BROWSER</w:t>
+      </w:r>
+    </w:p>
+    <w:p>
+      <w:pPr>
+        <w:rPr>
+          <w:rFonts w:ascii="Times New Roman" w:hAnsi="Times New Roman" w:cs="Times New Roman"/>
+          <w:sz w:val="28"/>
+          <w:szCs w:val="28"/>
+        </w:rPr>
+      </w:pPr>
+      <w:r>
+        <w:rPr>
+          <w:rFonts w:ascii="Times New Roman" w:hAnsi="Times New Roman" w:cs="Times New Roman"/>
+          <w:sz w:val="28"/>
+          <w:szCs w:val="28"/>
+        </w:rPr>
+        <w:t xml:space="preserve">  Server cannot read </w:t>
+      </w:r>
+      <w:proofErr w:type="spellStart"/>
+      <w:r>
+        <w:rPr>
+          <w:rFonts w:ascii="Times New Roman" w:hAnsi="Times New Roman" w:cs="Times New Roman"/>
+          <w:sz w:val="28"/>
+          <w:szCs w:val="28"/>
+        </w:rPr>
+        <w:t>localStorage</w:t>
+      </w:r>
+      <w:proofErr w:type="spellEnd"/>
+      <w:r>
+        <w:rPr>
+          <w:rFonts w:ascii="Times New Roman" w:hAnsi="Times New Roman" w:cs="Times New Roman"/>
+          <w:sz w:val="28"/>
+          <w:szCs w:val="28"/>
+        </w:rPr>
+        <w:t>!</w:t>
       </w:r>
     </w:p>
     <w:p>
@@ -153,7 +225,25 @@
           <w:sz w:val="28"/>
           <w:szCs w:val="28"/>
         </w:rPr>
-        <w:t xml:space="preserve">  Save token in BOTH localStorage AND cookie</w:t>
+        <w:t xml:space="preserve">  Save token in BOTH </w:t>
+      </w:r>
+      <w:proofErr w:type="spellStart"/>
+      <w:r>
+        <w:rPr>
+          <w:rFonts w:ascii="Times New Roman" w:hAnsi="Times New Roman" w:cs="Times New Roman"/>
+          <w:sz w:val="28"/>
+          <w:szCs w:val="28"/>
+        </w:rPr>
+        <w:t>localStorage</w:t>
+      </w:r>
+      <w:proofErr w:type="spellEnd"/>
+      <w:r>
+        <w:rPr>
+          <w:rFonts w:ascii="Times New Roman" w:hAnsi="Times New Roman" w:cs="Times New Roman"/>
+          <w:sz w:val="28"/>
+          <w:szCs w:val="28"/>
+        </w:rPr>
+        <w:t xml:space="preserve"> AND cookie</w:t>
       </w:r>
     </w:p>
     <w:p>
@@ -247,7 +337,35 @@
           <w:sz w:val="28"/>
           <w:szCs w:val="28"/>
         </w:rPr>
-        <w:t>Save token to localStorage  ← for browser JS (Axios interceptor)</w:t>
+        <w:t xml:space="preserve">Save token to </w:t>
+      </w:r>
+      <w:proofErr w:type="spellStart"/>
+      <w:proofErr w:type="gramStart"/>
+      <w:r>
+        <w:rPr>
+          <w:rFonts w:ascii="Times New Roman" w:hAnsi="Times New Roman" w:cs="Times New Roman"/>
+          <w:sz w:val="28"/>
+          <w:szCs w:val="28"/>
+        </w:rPr>
+        <w:t>localStorage</w:t>
+      </w:r>
+      <w:proofErr w:type="spellEnd"/>
+      <w:r>
+        <w:rPr>
+          <w:rFonts w:ascii="Times New Roman" w:hAnsi="Times New Roman" w:cs="Times New Roman"/>
+          <w:sz w:val="28"/>
+          <w:szCs w:val="28"/>
+        </w:rPr>
+        <w:t xml:space="preserve">  ←</w:t>
+      </w:r>
+      <w:proofErr w:type="gramEnd"/>
+      <w:r>
+        <w:rPr>
+          <w:rFonts w:ascii="Times New Roman" w:hAnsi="Times New Roman" w:cs="Times New Roman"/>
+          <w:sz w:val="28"/>
+          <w:szCs w:val="28"/>
+        </w:rPr>
+        <w:t xml:space="preserve"> for browser JS (Axios interceptor)</w:t>
       </w:r>
     </w:p>
     <w:p>
@@ -326,13 +444,23 @@
           <w:szCs w:val="28"/>
         </w:rPr>
       </w:pPr>
-      <w:r>
-        <w:rPr>
-          <w:rFonts w:ascii="Times New Roman" w:hAnsi="Times New Roman" w:cs="Times New Roman"/>
-          <w:sz w:val="28"/>
-          <w:szCs w:val="28"/>
-        </w:rPr>
-        <w:t>middleware.ts runs on server</w:t>
+      <w:proofErr w:type="spellStart"/>
+      <w:r>
+        <w:rPr>
+          <w:rFonts w:ascii="Times New Roman" w:hAnsi="Times New Roman" w:cs="Times New Roman"/>
+          <w:sz w:val="28"/>
+          <w:szCs w:val="28"/>
+        </w:rPr>
+        <w:t>middleware.ts</w:t>
+      </w:r>
+      <w:proofErr w:type="spellEnd"/>
+      <w:r>
+        <w:rPr>
+          <w:rFonts w:ascii="Times New Roman" w:hAnsi="Times New Roman" w:cs="Times New Roman"/>
+          <w:sz w:val="28"/>
+          <w:szCs w:val="28"/>
+        </w:rPr>
+        <w:t xml:space="preserve"> runs on server</w:t>
       </w:r>
     </w:p>
     <w:p>
@@ -414,7 +542,43 @@
           <w:sz w:val="28"/>
           <w:szCs w:val="28"/>
         </w:rPr>
-        <w:t>We already wrote the cookie helpers in useAuthStore.ts. But let me make sure they are correctly implemented. Open apps/web/store/useAuthStore.ts and verify these two helper functions exist at the top:</w:t>
+        <w:t xml:space="preserve">We already wrote the cookie helpers in </w:t>
+      </w:r>
+      <w:proofErr w:type="spellStart"/>
+      <w:r>
+        <w:rPr>
+          <w:rFonts w:ascii="Times New Roman" w:hAnsi="Times New Roman" w:cs="Times New Roman"/>
+          <w:sz w:val="28"/>
+          <w:szCs w:val="28"/>
+        </w:rPr>
+        <w:t>useAuthStore.ts</w:t>
+      </w:r>
+      <w:proofErr w:type="spellEnd"/>
+      <w:r>
+        <w:rPr>
+          <w:rFonts w:ascii="Times New Roman" w:hAnsi="Times New Roman" w:cs="Times New Roman"/>
+          <w:sz w:val="28"/>
+          <w:szCs w:val="28"/>
+        </w:rPr>
+        <w:t>. But let me make sure they are correctly implemented. Open apps/web/store/</w:t>
+      </w:r>
+      <w:proofErr w:type="spellStart"/>
+      <w:r>
+        <w:rPr>
+          <w:rFonts w:ascii="Times New Roman" w:hAnsi="Times New Roman" w:cs="Times New Roman"/>
+          <w:sz w:val="28"/>
+          <w:szCs w:val="28"/>
+        </w:rPr>
+        <w:t>useAuthStore.ts</w:t>
+      </w:r>
+      <w:proofErr w:type="spellEnd"/>
+      <w:r>
+        <w:rPr>
+          <w:rFonts w:ascii="Times New Roman" w:hAnsi="Times New Roman" w:cs="Times New Roman"/>
+          <w:sz w:val="28"/>
+          <w:szCs w:val="28"/>
+        </w:rPr>
+        <w:t xml:space="preserve"> and verify these two helper functions exist at the top:</w:t>
       </w:r>
     </w:p>
     <w:p>
@@ -459,30 +623,114 @@
           <w:szCs w:val="28"/>
         </w:rPr>
       </w:pPr>
-      <w:r>
-        <w:rPr>
-          <w:rFonts w:ascii="Times New Roman" w:hAnsi="Times New Roman" w:cs="Times New Roman"/>
-          <w:sz w:val="28"/>
-          <w:szCs w:val="28"/>
-        </w:rPr>
-        <w:t xml:space="preserve">│  localStorage['spendwise_token'] = "eyJ..."     </w:t>
-      </w:r>
-    </w:p>
-    <w:p>
-      <w:pPr>
-        <w:rPr>
-          <w:rFonts w:ascii="Times New Roman" w:hAnsi="Times New Roman" w:cs="Times New Roman"/>
-          <w:sz w:val="28"/>
-          <w:szCs w:val="28"/>
-        </w:rPr>
-      </w:pPr>
-      <w:r>
-        <w:rPr>
-          <w:rFonts w:ascii="Times New Roman" w:hAnsi="Times New Roman" w:cs="Times New Roman"/>
-          <w:sz w:val="28"/>
-          <w:szCs w:val="28"/>
-        </w:rPr>
-        <w:t xml:space="preserve">│  → Used by: Axios interceptor (api.ts)          </w:t>
+      <w:proofErr w:type="gramStart"/>
+      <w:r>
+        <w:rPr>
+          <w:rFonts w:ascii="Times New Roman" w:hAnsi="Times New Roman" w:cs="Times New Roman"/>
+          <w:sz w:val="28"/>
+          <w:szCs w:val="28"/>
+        </w:rPr>
+        <w:t xml:space="preserve">│  </w:t>
+      </w:r>
+      <w:proofErr w:type="spellStart"/>
+      <w:r>
+        <w:rPr>
+          <w:rFonts w:ascii="Times New Roman" w:hAnsi="Times New Roman" w:cs="Times New Roman"/>
+          <w:sz w:val="28"/>
+          <w:szCs w:val="28"/>
+        </w:rPr>
+        <w:t>localStorage</w:t>
+      </w:r>
+      <w:proofErr w:type="spellEnd"/>
+      <w:proofErr w:type="gramEnd"/>
+      <w:r>
+        <w:rPr>
+          <w:rFonts w:ascii="Times New Roman" w:hAnsi="Times New Roman" w:cs="Times New Roman"/>
+          <w:sz w:val="28"/>
+          <w:szCs w:val="28"/>
+        </w:rPr>
+        <w:t>['</w:t>
+      </w:r>
+      <w:proofErr w:type="spellStart"/>
+      <w:r>
+        <w:rPr>
+          <w:rFonts w:ascii="Times New Roman" w:hAnsi="Times New Roman" w:cs="Times New Roman"/>
+          <w:sz w:val="28"/>
+          <w:szCs w:val="28"/>
+        </w:rPr>
+        <w:t>spendwise_token</w:t>
+      </w:r>
+      <w:proofErr w:type="spellEnd"/>
+      <w:r>
+        <w:rPr>
+          <w:rFonts w:ascii="Times New Roman" w:hAnsi="Times New Roman" w:cs="Times New Roman"/>
+          <w:sz w:val="28"/>
+          <w:szCs w:val="28"/>
+        </w:rPr>
+        <w:t>'] = "</w:t>
+      </w:r>
+      <w:proofErr w:type="spellStart"/>
+      <w:r>
+        <w:rPr>
+          <w:rFonts w:ascii="Times New Roman" w:hAnsi="Times New Roman" w:cs="Times New Roman"/>
+          <w:sz w:val="28"/>
+          <w:szCs w:val="28"/>
+        </w:rPr>
+        <w:t>eyJ</w:t>
+      </w:r>
+      <w:proofErr w:type="spellEnd"/>
+      <w:r>
+        <w:rPr>
+          <w:rFonts w:ascii="Times New Roman" w:hAnsi="Times New Roman" w:cs="Times New Roman"/>
+          <w:sz w:val="28"/>
+          <w:szCs w:val="28"/>
+        </w:rPr>
+        <w:t xml:space="preserve">..."     </w:t>
+      </w:r>
+    </w:p>
+    <w:p>
+      <w:pPr>
+        <w:rPr>
+          <w:rFonts w:ascii="Times New Roman" w:hAnsi="Times New Roman" w:cs="Times New Roman"/>
+          <w:sz w:val="28"/>
+          <w:szCs w:val="28"/>
+        </w:rPr>
+      </w:pPr>
+      <w:proofErr w:type="gramStart"/>
+      <w:r>
+        <w:rPr>
+          <w:rFonts w:ascii="Times New Roman" w:hAnsi="Times New Roman" w:cs="Times New Roman"/>
+          <w:sz w:val="28"/>
+          <w:szCs w:val="28"/>
+        </w:rPr>
+        <w:t>│  →</w:t>
+      </w:r>
+      <w:proofErr w:type="gramEnd"/>
+      <w:r>
+        <w:rPr>
+          <w:rFonts w:ascii="Times New Roman" w:hAnsi="Times New Roman" w:cs="Times New Roman"/>
+          <w:sz w:val="28"/>
+          <w:szCs w:val="28"/>
+        </w:rPr>
+        <w:t xml:space="preserve"> Used by: Axios interceptor (</w:t>
+      </w:r>
+      <w:proofErr w:type="spellStart"/>
+      <w:r>
+        <w:rPr>
+          <w:rFonts w:ascii="Times New Roman" w:hAnsi="Times New Roman" w:cs="Times New Roman"/>
+          <w:sz w:val="28"/>
+          <w:szCs w:val="28"/>
+        </w:rPr>
+        <w:t>api.ts</w:t>
+      </w:r>
+      <w:proofErr w:type="spellEnd"/>
+      <w:r>
+        <w:rPr>
+          <w:rFonts w:ascii="Times New Roman" w:hAnsi="Times New Roman" w:cs="Times New Roman"/>
+          <w:sz w:val="28"/>
+          <w:szCs w:val="28"/>
+        </w:rPr>
+        <w:t xml:space="preserve">)          </w:t>
       </w:r>
     </w:p>
     <w:p>
@@ -559,24 +807,78 @@
           <w:sz w:val="28"/>
           <w:szCs w:val="28"/>
         </w:rPr>
-        <w:t xml:space="preserve">│  Cookie['spendwise_token'] = "eyJ..."           </w:t>
-      </w:r>
-    </w:p>
-    <w:p>
-      <w:pPr>
-        <w:rPr>
-          <w:rFonts w:ascii="Times New Roman" w:hAnsi="Times New Roman" w:cs="Times New Roman"/>
-          <w:sz w:val="28"/>
-          <w:szCs w:val="28"/>
-        </w:rPr>
-      </w:pPr>
-      <w:r>
-        <w:rPr>
-          <w:rFonts w:ascii="Times New Roman" w:hAnsi="Times New Roman" w:cs="Times New Roman"/>
-          <w:sz w:val="28"/>
-          <w:szCs w:val="28"/>
-        </w:rPr>
-        <w:t xml:space="preserve">│  → Used by: middleware.ts                       </w:t>
+        <w:t>│  Cookie['</w:t>
+      </w:r>
+      <w:proofErr w:type="spellStart"/>
+      <w:r>
+        <w:rPr>
+          <w:rFonts w:ascii="Times New Roman" w:hAnsi="Times New Roman" w:cs="Times New Roman"/>
+          <w:sz w:val="28"/>
+          <w:szCs w:val="28"/>
+        </w:rPr>
+        <w:t>spendwise_token</w:t>
+      </w:r>
+      <w:proofErr w:type="spellEnd"/>
+      <w:r>
+        <w:rPr>
+          <w:rFonts w:ascii="Times New Roman" w:hAnsi="Times New Roman" w:cs="Times New Roman"/>
+          <w:sz w:val="28"/>
+          <w:szCs w:val="28"/>
+        </w:rPr>
+        <w:t>'] = "</w:t>
+      </w:r>
+      <w:proofErr w:type="spellStart"/>
+      <w:r>
+        <w:rPr>
+          <w:rFonts w:ascii="Times New Roman" w:hAnsi="Times New Roman" w:cs="Times New Roman"/>
+          <w:sz w:val="28"/>
+          <w:szCs w:val="28"/>
+        </w:rPr>
+        <w:t>eyJ</w:t>
+      </w:r>
+      <w:proofErr w:type="spellEnd"/>
+      <w:r>
+        <w:rPr>
+          <w:rFonts w:ascii="Times New Roman" w:hAnsi="Times New Roman" w:cs="Times New Roman"/>
+          <w:sz w:val="28"/>
+          <w:szCs w:val="28"/>
+        </w:rPr>
+        <w:t xml:space="preserve">..."           </w:t>
+      </w:r>
+    </w:p>
+    <w:p>
+      <w:pPr>
+        <w:rPr>
+          <w:rFonts w:ascii="Times New Roman" w:hAnsi="Times New Roman" w:cs="Times New Roman"/>
+          <w:sz w:val="28"/>
+          <w:szCs w:val="28"/>
+        </w:rPr>
+      </w:pPr>
+      <w:r>
+        <w:rPr>
+          <w:rFonts w:ascii="Times New Roman" w:hAnsi="Times New Roman" w:cs="Times New Roman"/>
+          <w:sz w:val="28"/>
+          <w:szCs w:val="28"/>
+        </w:rPr>
+        <w:t xml:space="preserve">│  → Used by: </w:t>
+      </w:r>
+      <w:proofErr w:type="spellStart"/>
+      <w:r>
+        <w:rPr>
+          <w:rFonts w:ascii="Times New Roman" w:hAnsi="Times New Roman" w:cs="Times New Roman"/>
+          <w:sz w:val="28"/>
+          <w:szCs w:val="28"/>
+        </w:rPr>
+        <w:t>middleware.ts</w:t>
+      </w:r>
+      <w:proofErr w:type="spellEnd"/>
+      <w:r>
+        <w:rPr>
+          <w:rFonts w:ascii="Times New Roman" w:hAnsi="Times New Roman" w:cs="Times New Roman"/>
+          <w:sz w:val="28"/>
+          <w:szCs w:val="28"/>
+        </w:rPr>
+        <w:t xml:space="preserve">                       </w:t>
       </w:r>
     </w:p>
     <w:p>
@@ -720,7 +1022,7 @@
                     <pic:cNvPicPr/>
                   </pic:nvPicPr>
                   <pic:blipFill>
-                    <a:blip r:embed="rId4"/>
+                    <a:blip r:embed="rId5"/>
                     <a:stretch>
                       <a:fillRect/>
                     </a:stretch>
@@ -766,13 +1068,23 @@
         </w:rPr>
         <w:t xml:space="preserve">Gemini API Key = </w:t>
       </w:r>
-      <w:r>
-        <w:rPr>
-          <w:rFonts w:ascii="Times New Roman" w:hAnsi="Times New Roman" w:cs="Times New Roman"/>
-          <w:sz w:val="28"/>
-          <w:szCs w:val="28"/>
-        </w:rPr>
-        <w:t>AQ.Ab8RN6JtLpHr-X399xMdltMeKN98-xivIbtH6waSS6Jb4CRDzA</w:t>
+      <w:proofErr w:type="gramStart"/>
+      <w:r>
+        <w:rPr>
+          <w:rFonts w:ascii="Times New Roman" w:hAnsi="Times New Roman" w:cs="Times New Roman"/>
+          <w:sz w:val="28"/>
+          <w:szCs w:val="28"/>
+        </w:rPr>
+        <w:t>AQ.Ab</w:t>
+      </w:r>
+      <w:proofErr w:type="gramEnd"/>
+      <w:r>
+        <w:rPr>
+          <w:rFonts w:ascii="Times New Roman" w:hAnsi="Times New Roman" w:cs="Times New Roman"/>
+          <w:sz w:val="28"/>
+          <w:szCs w:val="28"/>
+        </w:rPr>
+        <w:t>8RN6JtLpHr-X399xMdltMeKN98-xivIbtH6waSS6Jb4CRDzA</w:t>
       </w:r>
     </w:p>
     <w:p>
@@ -809,7 +1121,27 @@
           <w:sz w:val="28"/>
           <w:szCs w:val="28"/>
         </w:rPr>
-        <w:t>Claude api key= ‘sk-9fb5a0dea035427c9f362adcf1ed5187’</w:t>
+        <w:t xml:space="preserve">Claude </w:t>
+      </w:r>
+      <w:proofErr w:type="spellStart"/>
+      <w:r>
+        <w:rPr>
+          <w:rFonts w:ascii="Times New Roman" w:hAnsi="Times New Roman" w:cs="Times New Roman"/>
+          <w:color w:val="00B0F0"/>
+          <w:sz w:val="28"/>
+          <w:szCs w:val="28"/>
+        </w:rPr>
+        <w:t>api</w:t>
+      </w:r>
+      <w:proofErr w:type="spellEnd"/>
+      <w:r>
+        <w:rPr>
+          <w:rFonts w:ascii="Times New Roman" w:hAnsi="Times New Roman" w:cs="Times New Roman"/>
+          <w:color w:val="00B0F0"/>
+          <w:sz w:val="28"/>
+          <w:szCs w:val="28"/>
+        </w:rPr>
+        <w:t xml:space="preserve"> key= ‘sk-9fb5a0dea035427c9f362adcf1ed5187’</w:t>
       </w:r>
     </w:p>
     <w:p>
@@ -849,7 +1181,7 @@
                     <pic:cNvPicPr/>
                   </pic:nvPicPr>
                   <pic:blipFill>
-                    <a:blip r:embed="rId5"/>
+                    <a:blip r:embed="rId6"/>
                     <a:stretch>
                       <a:fillRect/>
                     </a:stretch>
@@ -908,7 +1240,7 @@
                     <pic:cNvPicPr/>
                   </pic:nvPicPr>
                   <pic:blipFill>
-                    <a:blip r:embed="rId6"/>
+                    <a:blip r:embed="rId7"/>
                     <a:stretch>
                       <a:fillRect/>
                     </a:stretch>
@@ -969,7 +1301,25 @@
           <w:sz w:val="28"/>
           <w:szCs w:val="28"/>
         </w:rPr>
-        <w:t xml:space="preserve">    Run all test cases: npm run test</w:t>
+        <w:t xml:space="preserve">    Run all test cases: </w:t>
+      </w:r>
+      <w:proofErr w:type="spellStart"/>
+      <w:r>
+        <w:rPr>
+          <w:rFonts w:ascii="Times New Roman" w:hAnsi="Times New Roman" w:cs="Times New Roman"/>
+          <w:sz w:val="28"/>
+          <w:szCs w:val="28"/>
+        </w:rPr>
+        <w:t>npm</w:t>
+      </w:r>
+      <w:proofErr w:type="spellEnd"/>
+      <w:r>
+        <w:rPr>
+          <w:rFonts w:ascii="Times New Roman" w:hAnsi="Times New Roman" w:cs="Times New Roman"/>
+          <w:sz w:val="28"/>
+          <w:szCs w:val="28"/>
+        </w:rPr>
+        <w:t xml:space="preserve"> run test</w:t>
       </w:r>
     </w:p>
     <w:p>
@@ -1021,6 +1371,7 @@
         </w:rPr>
         <w:t xml:space="preserve">              </w:t>
       </w:r>
+      <w:proofErr w:type="spellStart"/>
       <w:r>
         <w:rPr>
           <w:rFonts w:ascii="Times New Roman" w:hAnsi="Times New Roman" w:cs="Times New Roman"/>
@@ -1035,17 +1386,327 @@
           <w:sz w:val="28"/>
           <w:szCs w:val="28"/>
         </w:rPr>
-        <w:t>pm run test:coverage</w:t>
-      </w:r>
-    </w:p>
-    <w:p>
-      <w:pPr>
-        <w:rPr>
-          <w:rFonts w:ascii="Times New Roman" w:hAnsi="Times New Roman" w:cs="Times New Roman"/>
-          <w:sz w:val="28"/>
-          <w:szCs w:val="28"/>
-        </w:rPr>
-      </w:pPr>
+        <w:t>pm</w:t>
+      </w:r>
+      <w:proofErr w:type="spellEnd"/>
+      <w:r>
+        <w:rPr>
+          <w:rFonts w:ascii="Times New Roman" w:hAnsi="Times New Roman" w:cs="Times New Roman"/>
+          <w:sz w:val="28"/>
+          <w:szCs w:val="28"/>
+        </w:rPr>
+        <w:t xml:space="preserve"> run </w:t>
+      </w:r>
+      <w:proofErr w:type="spellStart"/>
+      <w:proofErr w:type="gramStart"/>
+      <w:r>
+        <w:rPr>
+          <w:rFonts w:ascii="Times New Roman" w:hAnsi="Times New Roman" w:cs="Times New Roman"/>
+          <w:sz w:val="28"/>
+          <w:szCs w:val="28"/>
+        </w:rPr>
+        <w:t>test:coverage</w:t>
+      </w:r>
+      <w:proofErr w:type="spellEnd"/>
+      <w:proofErr w:type="gramEnd"/>
+    </w:p>
+    <w:p>
+      <w:pPr>
+        <w:rPr>
+          <w:rFonts w:ascii="Times New Roman" w:hAnsi="Times New Roman" w:cs="Times New Roman"/>
+          <w:sz w:val="28"/>
+          <w:szCs w:val="28"/>
+        </w:rPr>
+      </w:pPr>
+    </w:p>
+    <w:p>
+      <w:pPr>
+        <w:pStyle w:val="ListParagraph"/>
+        <w:numPr>
+          <w:ilvl w:val="0"/>
+          <w:numId w:val="1"/>
+        </w:numPr>
+        <w:rPr>
+          <w:rFonts w:ascii="Times New Roman" w:hAnsi="Times New Roman" w:cs="Times New Roman"/>
+          <w:sz w:val="28"/>
+          <w:szCs w:val="28"/>
+        </w:rPr>
+      </w:pPr>
+      <w:r>
+        <w:rPr>
+          <w:rFonts w:ascii="Times New Roman" w:hAnsi="Times New Roman" w:cs="Times New Roman"/>
+          <w:sz w:val="28"/>
+          <w:szCs w:val="28"/>
+        </w:rPr>
+        <w:t>Docker → packages your backend into a portable container</w:t>
+      </w:r>
+    </w:p>
+    <w:p>
+      <w:pPr>
+        <w:pStyle w:val="ListParagraph"/>
+        <w:ind w:left="2160"/>
+        <w:rPr>
+          <w:rFonts w:ascii="Times New Roman" w:hAnsi="Times New Roman" w:cs="Times New Roman"/>
+          <w:sz w:val="28"/>
+          <w:szCs w:val="28"/>
+        </w:rPr>
+      </w:pPr>
+      <w:r>
+        <w:rPr>
+          <w:rFonts w:ascii="Times New Roman" w:hAnsi="Times New Roman" w:cs="Times New Roman"/>
+          <w:sz w:val="28"/>
+          <w:szCs w:val="28"/>
+        </w:rPr>
+        <w:t>that runs identically on any machine</w:t>
+      </w:r>
+    </w:p>
+    <w:p>
+      <w:pPr>
+        <w:pStyle w:val="ListParagraph"/>
+        <w:numPr>
+          <w:ilvl w:val="0"/>
+          <w:numId w:val="1"/>
+        </w:numPr>
+        <w:rPr>
+          <w:rFonts w:ascii="Times New Roman" w:hAnsi="Times New Roman" w:cs="Times New Roman"/>
+          <w:sz w:val="28"/>
+          <w:szCs w:val="28"/>
+        </w:rPr>
+      </w:pPr>
+      <w:r>
+        <w:rPr>
+          <w:rFonts w:ascii="Times New Roman" w:hAnsi="Times New Roman" w:cs="Times New Roman"/>
+          <w:sz w:val="28"/>
+          <w:szCs w:val="28"/>
+        </w:rPr>
+        <w:t>GitHub Actions → automatically runs your tests every time you</w:t>
+      </w:r>
+    </w:p>
+    <w:p>
+      <w:pPr>
+        <w:pStyle w:val="ListParagraph"/>
+        <w:ind w:left="2160"/>
+        <w:rPr>
+          <w:rFonts w:ascii="Times New Roman" w:hAnsi="Times New Roman" w:cs="Times New Roman"/>
+          <w:sz w:val="28"/>
+          <w:szCs w:val="28"/>
+        </w:rPr>
+      </w:pPr>
+      <w:r>
+        <w:rPr>
+          <w:rFonts w:ascii="Times New Roman" w:hAnsi="Times New Roman" w:cs="Times New Roman"/>
+          <w:sz w:val="28"/>
+          <w:szCs w:val="28"/>
+        </w:rPr>
+        <w:t>push code or open a pull request</w:t>
+      </w:r>
+    </w:p>
+    <w:p>
+      <w:pPr>
+        <w:rPr>
+          <w:rFonts w:ascii="Times New Roman" w:hAnsi="Times New Roman" w:cs="Times New Roman"/>
+          <w:b/>
+          <w:bCs/>
+          <w:sz w:val="28"/>
+          <w:szCs w:val="28"/>
+        </w:rPr>
+      </w:pPr>
+      <w:r>
+        <w:rPr>
+          <w:rFonts w:ascii="Times New Roman" w:hAnsi="Times New Roman" w:cs="Times New Roman"/>
+          <w:b/>
+          <w:bCs/>
+          <w:sz w:val="28"/>
+          <w:szCs w:val="28"/>
+        </w:rPr>
+        <w:t xml:space="preserve">in </w:t>
+      </w:r>
+      <w:proofErr w:type="spellStart"/>
+      <w:r>
+        <w:rPr>
+          <w:rFonts w:ascii="Times New Roman" w:hAnsi="Times New Roman" w:cs="Times New Roman"/>
+          <w:b/>
+          <w:bCs/>
+          <w:sz w:val="28"/>
+          <w:szCs w:val="28"/>
+        </w:rPr>
+        <w:t>Dockerfile</w:t>
+      </w:r>
+      <w:proofErr w:type="spellEnd"/>
+    </w:p>
+    <w:p>
+      <w:pPr>
+        <w:rPr>
+          <w:rFonts w:ascii="Times New Roman" w:hAnsi="Times New Roman" w:cs="Times New Roman"/>
+          <w:sz w:val="28"/>
+          <w:szCs w:val="28"/>
+        </w:rPr>
+      </w:pPr>
+      <w:r>
+        <w:rPr>
+          <w:rFonts w:ascii="Times New Roman" w:hAnsi="Times New Roman" w:cs="Times New Roman"/>
+          <w:b/>
+          <w:bCs/>
+          <w:sz w:val="28"/>
+          <w:szCs w:val="28"/>
+        </w:rPr>
+        <w:t>multi-stage builds:</w:t>
+      </w:r>
+      <w:r>
+        <w:rPr>
+          <w:rFonts w:ascii="Times New Roman" w:hAnsi="Times New Roman" w:cs="Times New Roman"/>
+          <w:sz w:val="28"/>
+          <w:szCs w:val="28"/>
+        </w:rPr>
+        <w:t xml:space="preserve"> </w:t>
+      </w:r>
+    </w:p>
+    <w:p>
+      <w:pPr>
+        <w:rPr>
+          <w:rFonts w:ascii="Times New Roman" w:hAnsi="Times New Roman" w:cs="Times New Roman"/>
+          <w:sz w:val="28"/>
+          <w:szCs w:val="28"/>
+        </w:rPr>
+      </w:pPr>
+      <w:r>
+        <w:rPr>
+          <w:rFonts w:ascii="Times New Roman" w:hAnsi="Times New Roman" w:cs="Times New Roman"/>
+          <w:sz w:val="28"/>
+          <w:szCs w:val="28"/>
+        </w:rPr>
+        <w:t xml:space="preserve">Stage 1 has everything needed to BUILD the app (TypeScript compiler, all packages). </w:t>
+      </w:r>
+    </w:p>
+    <w:p>
+      <w:pPr>
+        <w:rPr>
+          <w:rFonts w:ascii="Times New Roman" w:hAnsi="Times New Roman" w:cs="Times New Roman"/>
+          <w:sz w:val="28"/>
+          <w:szCs w:val="28"/>
+        </w:rPr>
+      </w:pPr>
+      <w:r>
+        <w:rPr>
+          <w:rFonts w:ascii="Times New Roman" w:hAnsi="Times New Roman" w:cs="Times New Roman"/>
+          <w:sz w:val="28"/>
+          <w:szCs w:val="28"/>
+        </w:rPr>
+        <w:t>Stage 2 only copies the final compiled result. This is exactly how professional companies ship Node.js apps — smaller image, faster deploys, fewer security vulnerabilities since dev tools aren't shipped.</w:t>
+      </w:r>
+    </w:p>
+    <w:p>
+      <w:pPr>
+        <w:rPr>
+          <w:rFonts w:ascii="Times New Roman" w:hAnsi="Times New Roman" w:cs="Times New Roman"/>
+          <w:sz w:val="28"/>
+          <w:szCs w:val="28"/>
+        </w:rPr>
+      </w:pPr>
+    </w:p>
+    <w:p>
+      <w:pPr>
+        <w:rPr>
+          <w:rFonts w:ascii="Times New Roman" w:hAnsi="Times New Roman" w:cs="Times New Roman"/>
+          <w:sz w:val="28"/>
+          <w:szCs w:val="28"/>
+        </w:rPr>
+      </w:pPr>
+      <w:proofErr w:type="spellStart"/>
+      <w:r>
+        <w:rPr>
+          <w:rFonts w:ascii="Times New Roman" w:hAnsi="Times New Roman" w:cs="Times New Roman"/>
+          <w:b/>
+          <w:bCs/>
+          <w:sz w:val="28"/>
+          <w:szCs w:val="28"/>
+        </w:rPr>
+        <w:lastRenderedPageBreak/>
+        <w:t>Dockerfile</w:t>
+      </w:r>
+      <w:proofErr w:type="spellEnd"/>
+      <w:r>
+        <w:rPr>
+          <w:rFonts w:ascii="Times New Roman" w:hAnsi="Times New Roman" w:cs="Times New Roman"/>
+          <w:b/>
+          <w:bCs/>
+          <w:sz w:val="28"/>
+          <w:szCs w:val="28"/>
+        </w:rPr>
+        <w:t xml:space="preserve"> = </w:t>
+      </w:r>
+      <w:r>
+        <w:rPr>
+          <w:rFonts w:ascii="Times New Roman" w:hAnsi="Times New Roman" w:cs="Times New Roman"/>
+          <w:sz w:val="28"/>
+          <w:szCs w:val="28"/>
+        </w:rPr>
+        <w:t>tells Docker how to build ONE container.</w:t>
+      </w:r>
+      <w:r>
+        <w:rPr>
+          <w:rFonts w:ascii="Times New Roman" w:hAnsi="Times New Roman" w:cs="Times New Roman"/>
+          <w:sz w:val="28"/>
+          <w:szCs w:val="28"/>
+        </w:rPr>
+        <w:br/>
+      </w:r>
+      <w:r>
+        <w:rPr>
+          <w:rFonts w:ascii="Times New Roman" w:hAnsi="Times New Roman" w:cs="Times New Roman"/>
+          <w:b/>
+          <w:bCs/>
+          <w:sz w:val="28"/>
+          <w:szCs w:val="28"/>
+        </w:rPr>
+        <w:t>docker-</w:t>
+      </w:r>
+      <w:proofErr w:type="spellStart"/>
+      <w:r>
+        <w:rPr>
+          <w:rFonts w:ascii="Times New Roman" w:hAnsi="Times New Roman" w:cs="Times New Roman"/>
+          <w:b/>
+          <w:bCs/>
+          <w:sz w:val="28"/>
+          <w:szCs w:val="28"/>
+        </w:rPr>
+        <w:t>compose.yml</w:t>
+      </w:r>
+      <w:proofErr w:type="spellEnd"/>
+      <w:r>
+        <w:rPr>
+          <w:rFonts w:ascii="Times New Roman" w:hAnsi="Times New Roman" w:cs="Times New Roman"/>
+          <w:b/>
+          <w:bCs/>
+          <w:sz w:val="28"/>
+          <w:szCs w:val="28"/>
+        </w:rPr>
+        <w:t xml:space="preserve"> = </w:t>
+      </w:r>
+      <w:r>
+        <w:rPr>
+          <w:rFonts w:ascii="Times New Roman" w:hAnsi="Times New Roman" w:cs="Times New Roman"/>
+          <w:sz w:val="28"/>
+          <w:szCs w:val="28"/>
+        </w:rPr>
+        <w:t>tells Docker how to run and connect MULTIPLE</w:t>
+      </w:r>
+      <w:r>
+        <w:rPr>
+          <w:rFonts w:ascii="Times New Roman" w:hAnsi="Times New Roman" w:cs="Times New Roman"/>
+          <w:sz w:val="28"/>
+          <w:szCs w:val="28"/>
+        </w:rPr>
+        <w:t xml:space="preserve">               </w:t>
+      </w:r>
+      <w:r>
+        <w:rPr>
+          <w:rFonts w:ascii="Times New Roman" w:hAnsi="Times New Roman" w:cs="Times New Roman"/>
+          <w:sz w:val="28"/>
+          <w:szCs w:val="28"/>
+        </w:rPr>
+        <w:t>containers/services together.</w:t>
+      </w:r>
     </w:p>
     <w:sectPr>
       <w:pgSz w:w="12240" w:h="15840"/>
@@ -1055,6 +1716,127 @@
     </w:sectPr>
   </w:body>
 </w:document>
+</file>
+
+<file path=word/numbering.xml><?xml version="1.0" encoding="utf-8"?>
+<w:numbering xmlns:wpc="http://schemas.microsoft.com/office/word/2010/wordprocessingCanvas" xmlns:cx="http://schemas.microsoft.com/office/drawing/2014/chartex" xmlns:cx1="http://schemas.microsoft.com/office/drawing/2015/9/8/chartex" xmlns:cx2="http://schemas.microsoft.com/office/drawing/2015/10/21/chartex" xmlns:cx3="http://schemas.microsoft.com/office/drawing/2016/5/9/chartex" xmlns:cx4="http://schemas.microsoft.com/office/drawing/2016/5/10/chartex" xmlns:cx5="http://schemas.microsoft.com/office/drawing/2016/5/11/chartex" xmlns:cx6="http://schemas.microsoft.com/office/drawing/2016/5/12/chartex" xmlns:cx7="http://schemas.microsoft.com/office/drawing/2016/5/13/chartex" xmlns:cx8="http://schemas.microsoft.com/office/drawing/2016/5/14/chartex" xmlns:mc="http://schemas.openxmlformats.org/markup-compatibility/2006" xmlns:aink="http://schemas.microsoft.com/office/drawing/2016/ink" xmlns:am3d="http://schemas.microsoft.com/office/drawing/2017/model3d" xmlns:o="urn:schemas-microsoft-com:office:office" xmlns:oel="http://schemas.microsoft.com/office/2019/extlst" xmlns:r="http://schemas.openxmlformats.org/officeDocument/2006/relationships" xmlns:m="http://schemas.openxmlformats.org/officeDocument/2006/math" xmlns:v="urn:schemas-microsoft-com:vml" xmlns:wp14="http://schemas.microsoft.com/office/word/2010/wordprocessingDrawing" xmlns:wp="http://schemas.openxmlformats.org/drawingml/2006/wordprocessingDrawing" xmlns:w10="urn:schemas-microsoft-com:office:word" xmlns:w="http://schemas.openxmlformats.org/wordprocessingml/2006/main" xmlns:w14="http://schemas.microsoft.com/office/word/2010/wordml" xmlns:w15="http://schemas.microsoft.com/office/word/2012/wordml" xmlns:w16cei="http://schemas.microsoft.com/office/word/2026/wordml/cei" xmlns:w16cex="http://schemas.microsoft.com/office/word/2018/wordml/cex" xmlns:w16cid="http://schemas.microsoft.com/office/word/2016/wordml/cid" xmlns:w16="http://schemas.microsoft.com/office/word/2018/wordml" xmlns:w16du="http://schemas.microsoft.com/office/word/2023/wordml/word16du" xmlns:w16sdtdh="http://schemas.microsoft.com/office/word/2020/wordml/sdtdatahash" xmlns:w16sdtfl="http://schemas.microsoft.com/office/word/2024/wordml/sdtformatlock" xmlns:w16se="http://schemas.microsoft.com/office/word/2015/wordml/symex" xmlns:wpg="http://schemas.microsoft.com/office/word/2010/wordprocessingGroup" xmlns:wpi="http://schemas.microsoft.com/office/word/2010/wordprocessingInk" xmlns:wne="http://schemas.microsoft.com/office/word/2006/wordml" xmlns:wps="http://schemas.microsoft.com/office/word/2010/wordprocessingShape" mc:Ignorable="w14 w15 w16se w16cid w16 w16cex w16sdtdh w16sdtfl w16du wp14">
+  <w:abstractNum w:abstractNumId="0" w15:restartNumberingAfterBreak="0">
+    <w:nsid w:val="1E5421B4"/>
+    <w:multiLevelType w:val="hybridMultilevel"/>
+    <w:tmpl w:val="44107982"/>
+    <w:lvl w:ilvl="0" w:tplc="04090001">
+      <w:start w:val="1"/>
+      <w:numFmt w:val="bullet"/>
+      <w:lvlText w:val=""/>
+      <w:lvlJc w:val="left"/>
+      <w:pPr>
+        <w:ind w:left="720" w:hanging="360"/>
+      </w:pPr>
+      <w:rPr>
+        <w:rFonts w:ascii="Symbol" w:hAnsi="Symbol" w:hint="default"/>
+      </w:rPr>
+    </w:lvl>
+    <w:lvl w:ilvl="1" w:tplc="04090003" w:tentative="1">
+      <w:start w:val="1"/>
+      <w:numFmt w:val="bullet"/>
+      <w:lvlText w:val="o"/>
+      <w:lvlJc w:val="left"/>
+      <w:pPr>
+        <w:ind w:left="1440" w:hanging="360"/>
+      </w:pPr>
+      <w:rPr>
+        <w:rFonts w:ascii="Courier New" w:hAnsi="Courier New" w:cs="Courier New" w:hint="default"/>
+      </w:rPr>
+    </w:lvl>
+    <w:lvl w:ilvl="2" w:tplc="04090005">
+      <w:start w:val="1"/>
+      <w:numFmt w:val="bullet"/>
+      <w:lvlText w:val=""/>
+      <w:lvlJc w:val="left"/>
+      <w:pPr>
+        <w:ind w:left="2160" w:hanging="360"/>
+      </w:pPr>
+      <w:rPr>
+        <w:rFonts w:ascii="Wingdings" w:hAnsi="Wingdings" w:hint="default"/>
+      </w:rPr>
+    </w:lvl>
+    <w:lvl w:ilvl="3" w:tplc="04090001" w:tentative="1">
+      <w:start w:val="1"/>
+      <w:numFmt w:val="bullet"/>
+      <w:lvlText w:val=""/>
+      <w:lvlJc w:val="left"/>
+      <w:pPr>
+        <w:ind w:left="2880" w:hanging="360"/>
+      </w:pPr>
+      <w:rPr>
+        <w:rFonts w:ascii="Symbol" w:hAnsi="Symbol" w:hint="default"/>
+      </w:rPr>
+    </w:lvl>
+    <w:lvl w:ilvl="4" w:tplc="04090003" w:tentative="1">
+      <w:start w:val="1"/>
+      <w:numFmt w:val="bullet"/>
+      <w:lvlText w:val="o"/>
+      <w:lvlJc w:val="left"/>
+      <w:pPr>
+        <w:ind w:left="3600" w:hanging="360"/>
+      </w:pPr>
+      <w:rPr>
+        <w:rFonts w:ascii="Courier New" w:hAnsi="Courier New" w:cs="Courier New" w:hint="default"/>
+      </w:rPr>
+    </w:lvl>
+    <w:lvl w:ilvl="5" w:tplc="04090005" w:tentative="1">
+      <w:start w:val="1"/>
+      <w:numFmt w:val="bullet"/>
+      <w:lvlText w:val=""/>
+      <w:lvlJc w:val="left"/>
+      <w:pPr>
+        <w:ind w:left="4320" w:hanging="360"/>
+      </w:pPr>
+      <w:rPr>
+        <w:rFonts w:ascii="Wingdings" w:hAnsi="Wingdings" w:hint="default"/>
+      </w:rPr>
+    </w:lvl>
+    <w:lvl w:ilvl="6" w:tplc="04090001" w:tentative="1">
+      <w:start w:val="1"/>
+      <w:numFmt w:val="bullet"/>
+      <w:lvlText w:val=""/>
+      <w:lvlJc w:val="left"/>
+      <w:pPr>
+        <w:ind w:left="5040" w:hanging="360"/>
+      </w:pPr>
+      <w:rPr>
+        <w:rFonts w:ascii="Symbol" w:hAnsi="Symbol" w:hint="default"/>
+      </w:rPr>
+    </w:lvl>
+    <w:lvl w:ilvl="7" w:tplc="04090003" w:tentative="1">
+      <w:start w:val="1"/>
+      <w:numFmt w:val="bullet"/>
+      <w:lvlText w:val="o"/>
+      <w:lvlJc w:val="left"/>
+      <w:pPr>
+        <w:ind w:left="5760" w:hanging="360"/>
+      </w:pPr>
+      <w:rPr>
+        <w:rFonts w:ascii="Courier New" w:hAnsi="Courier New" w:cs="Courier New" w:hint="default"/>
+      </w:rPr>
+    </w:lvl>
+    <w:lvl w:ilvl="8" w:tplc="04090005" w:tentative="1">
+      <w:start w:val="1"/>
+      <w:numFmt w:val="bullet"/>
+      <w:lvlText w:val=""/>
+      <w:lvlJc w:val="left"/>
+      <w:pPr>
+        <w:ind w:left="6480" w:hanging="360"/>
+      </w:pPr>
+      <w:rPr>
+        <w:rFonts w:ascii="Wingdings" w:hAnsi="Wingdings" w:hint="default"/>
+      </w:rPr>
+    </w:lvl>
+  </w:abstractNum>
+  <w:num w:numId="1" w16cid:durableId="1508207483">
+    <w:abstractNumId w:val="0"/>
+  </w:num>
+</w:numbering>
 </file>
 
 <file path=word/styles.xml><?xml version="1.0" encoding="utf-8"?>

</xml_diff>

<commit_message>
chore: trigger backend redeploy with correct CORS origin
</commit_message>
<xml_diff>
--- a/Spendwise Important Points.docx
+++ b/Spendwise Important Points.docx
@@ -1,6 +1,6 @@
 
 <file path=word/document.xml><?xml version="1.0" encoding="utf-8"?>
-<w:document xmlns:wpc="http://schemas.microsoft.com/office/word/2010/wordprocessingCanvas" xmlns:cx="http://schemas.microsoft.com/office/drawing/2014/chartex" xmlns:cx1="http://schemas.microsoft.com/office/drawing/2015/9/8/chartex" xmlns:cx2="http://schemas.microsoft.com/office/drawing/2015/10/21/chartex" xmlns:cx3="http://schemas.microsoft.com/office/drawing/2016/5/9/chartex" xmlns:cx4="http://schemas.microsoft.com/office/drawing/2016/5/10/chartex" xmlns:cx5="http://schemas.microsoft.com/office/drawing/2016/5/11/chartex" xmlns:cx6="http://schemas.microsoft.com/office/drawing/2016/5/12/chartex" xmlns:cx7="http://schemas.microsoft.com/office/drawing/2016/5/13/chartex" xmlns:cx8="http://schemas.microsoft.com/office/drawing/2016/5/14/chartex" xmlns:mc="http://schemas.openxmlformats.org/markup-compatibility/2006" xmlns:aink="http://schemas.microsoft.com/office/drawing/2016/ink" xmlns:am3d="http://schemas.microsoft.com/office/drawing/2017/model3d" xmlns:o="urn:schemas-microsoft-com:office:office" xmlns:oel="http://schemas.microsoft.com/office/2019/extlst" xmlns:r="http://schemas.openxmlformats.org/officeDocument/2006/relationships" xmlns:m="http://schemas.openxmlformats.org/officeDocument/2006/math" xmlns:v="urn:schemas-microsoft-com:vml" xmlns:wp14="http://schemas.microsoft.com/office/word/2010/wordprocessingDrawing" xmlns:wp="http://schemas.openxmlformats.org/drawingml/2006/wordprocessingDrawing" xmlns:w10="urn:schemas-microsoft-com:office:word" xmlns:w="http://schemas.openxmlformats.org/wordprocessingml/2006/main" xmlns:w14="http://schemas.microsoft.com/office/word/2010/wordml" xmlns:w15="http://schemas.microsoft.com/office/word/2012/wordml" xmlns:w16cei="http://schemas.microsoft.com/office/word/2026/wordml/cei" xmlns:w16cex="http://schemas.microsoft.com/office/word/2018/wordml/cex" xmlns:w16cid="http://schemas.microsoft.com/office/word/2016/wordml/cid" xmlns:w16="http://schemas.microsoft.com/office/word/2018/wordml" xmlns:w16du="http://schemas.microsoft.com/office/word/2023/wordml/word16du" xmlns:w16sdtdh="http://schemas.microsoft.com/office/word/2020/wordml/sdtdatahash" xmlns:w16sdtfl="http://schemas.microsoft.com/office/word/2024/wordml/sdtformatlock" xmlns:w16se="http://schemas.microsoft.com/office/word/2015/wordml/symex" xmlns:wpg="http://schemas.microsoft.com/office/word/2010/wordprocessingGroup" xmlns:wpi="http://schemas.microsoft.com/office/word/2010/wordprocessingInk" xmlns:wne="http://schemas.microsoft.com/office/word/2006/wordml" xmlns:wps="http://schemas.microsoft.com/office/word/2010/wordprocessingShape" mc:Ignorable="w14 w15 w16se w16cid w16 w16cex w16sdtdh w16sdtfl w16du wp14">
+<w:document xmlns:wpc="http://schemas.microsoft.com/office/word/2010/wordprocessingCanvas" xmlns:cx="http://schemas.microsoft.com/office/drawing/2014/chartex" xmlns:cx1="http://schemas.microsoft.com/office/drawing/2015/9/8/chartex" xmlns:cx2="http://schemas.microsoft.com/office/drawing/2015/10/21/chartex" xmlns:cx3="http://schemas.microsoft.com/office/drawing/2016/5/9/chartex" xmlns:cx4="http://schemas.microsoft.com/office/drawing/2016/5/10/chartex" xmlns:cx5="http://schemas.microsoft.com/office/drawing/2016/5/11/chartex" xmlns:cx6="http://schemas.microsoft.com/office/drawing/2016/5/12/chartex" xmlns:cx7="http://schemas.microsoft.com/office/drawing/2016/5/13/chartex" xmlns:cx8="http://schemas.microsoft.com/office/drawing/2016/5/14/chartex" xmlns:mc="http://schemas.openxmlformats.org/markup-compatibility/2006" xmlns:aink="http://schemas.microsoft.com/office/drawing/2016/ink" xmlns:am3d="http://schemas.microsoft.com/office/drawing/2017/model3d" xmlns:o="urn:schemas-microsoft-com:office:office" xmlns:oel="http://schemas.microsoft.com/office/2019/extlst" xmlns:r="http://schemas.openxmlformats.org/officeDocument/2006/relationships" xmlns:m="http://schemas.openxmlformats.org/officeDocument/2006/math" xmlns:v="urn:schemas-microsoft-com:vml" xmlns:wp14="http://schemas.microsoft.com/office/word/2010/wordprocessingDrawing" xmlns:wp="http://schemas.openxmlformats.org/drawingml/2006/wordprocessingDrawing" xmlns:w10="urn:schemas-microsoft-com:office:word" xmlns:w="http://schemas.openxmlformats.org/wordprocessingml/2006/main" xmlns:w14="http://schemas.microsoft.com/office/word/2010/wordml" xmlns:w15="http://schemas.microsoft.com/office/word/2012/wordml" xmlns:w16cex="http://schemas.microsoft.com/office/word/2018/wordml/cex" xmlns:w16cid="http://schemas.microsoft.com/office/word/2016/wordml/cid" xmlns:w16="http://schemas.microsoft.com/office/word/2018/wordml" xmlns:w16du="http://schemas.microsoft.com/office/word/2023/wordml/word16du" xmlns:w16sdtdh="http://schemas.microsoft.com/office/word/2020/wordml/sdtdatahash" xmlns:w16sdtfl="http://schemas.microsoft.com/office/word/2024/wordml/sdtformatlock" xmlns:w16se="http://schemas.microsoft.com/office/word/2015/wordml/symex" xmlns:wpg="http://schemas.microsoft.com/office/word/2010/wordprocessingGroup" xmlns:wpi="http://schemas.microsoft.com/office/word/2010/wordprocessingInk" xmlns:wne="http://schemas.microsoft.com/office/word/2006/wordml" xmlns:wps="http://schemas.microsoft.com/office/word/2010/wordprocessingShape" mc:Ignorable="w14 w15 w16se w16cid w16 w16cex w16sdtdh w16sdtfl w16du wp14">
   <w:body>
     <w:p>
       <w:pPr>
@@ -16,25 +16,7 @@
           <w:sz w:val="28"/>
           <w:szCs w:val="28"/>
         </w:rPr>
-        <w:t xml:space="preserve">           </w:t>
-      </w:r>
-      <w:proofErr w:type="spellStart"/>
-      <w:r>
-        <w:rPr>
-          <w:rFonts w:ascii="Times New Roman" w:hAnsi="Times New Roman" w:cs="Times New Roman"/>
-          <w:sz w:val="28"/>
-          <w:szCs w:val="28"/>
-        </w:rPr>
-        <w:t>Spendwise</w:t>
-      </w:r>
-      <w:proofErr w:type="spellEnd"/>
-      <w:r>
-        <w:rPr>
-          <w:rFonts w:ascii="Times New Roman" w:hAnsi="Times New Roman" w:cs="Times New Roman"/>
-          <w:sz w:val="28"/>
-          <w:szCs w:val="28"/>
-        </w:rPr>
-        <w:t xml:space="preserve"> Important Points</w:t>
+        <w:t xml:space="preserve">           Spendwise Important Points</w:t>
       </w:r>
     </w:p>
     <w:p>
@@ -94,95 +76,41 @@
           <w:sz w:val="28"/>
           <w:szCs w:val="28"/>
         </w:rPr>
-        <w:t xml:space="preserve">  </w:t>
-      </w:r>
-      <w:proofErr w:type="spellStart"/>
-      <w:r>
-        <w:rPr>
-          <w:rFonts w:ascii="Times New Roman" w:hAnsi="Times New Roman" w:cs="Times New Roman"/>
-          <w:sz w:val="28"/>
-          <w:szCs w:val="28"/>
-        </w:rPr>
-        <w:t>middleware.ts</w:t>
-      </w:r>
-      <w:proofErr w:type="spellEnd"/>
-      <w:r>
-        <w:rPr>
-          <w:rFonts w:ascii="Times New Roman" w:hAnsi="Times New Roman" w:cs="Times New Roman"/>
-          <w:sz w:val="28"/>
-          <w:szCs w:val="28"/>
-        </w:rPr>
-        <w:t xml:space="preserve"> runs on the SERVER</w:t>
-      </w:r>
-    </w:p>
-    <w:p>
-      <w:pPr>
-        <w:rPr>
-          <w:rFonts w:ascii="Times New Roman" w:hAnsi="Times New Roman" w:cs="Times New Roman"/>
-          <w:sz w:val="28"/>
-          <w:szCs w:val="28"/>
-        </w:rPr>
-      </w:pPr>
-      <w:r>
-        <w:rPr>
-          <w:rFonts w:ascii="Times New Roman" w:hAnsi="Times New Roman" w:cs="Times New Roman"/>
-          <w:sz w:val="28"/>
-          <w:szCs w:val="28"/>
-        </w:rPr>
-        <w:t xml:space="preserve">  </w:t>
-      </w:r>
-      <w:proofErr w:type="spellStart"/>
-      <w:r>
-        <w:rPr>
-          <w:rFonts w:ascii="Times New Roman" w:hAnsi="Times New Roman" w:cs="Times New Roman"/>
-          <w:sz w:val="28"/>
-          <w:szCs w:val="28"/>
-        </w:rPr>
-        <w:t>localStorage</w:t>
-      </w:r>
-      <w:proofErr w:type="spellEnd"/>
-      <w:r>
-        <w:rPr>
-          <w:rFonts w:ascii="Times New Roman" w:hAnsi="Times New Roman" w:cs="Times New Roman"/>
-          <w:sz w:val="28"/>
-          <w:szCs w:val="28"/>
-        </w:rPr>
-        <w:t xml:space="preserve"> exists only in the BROWSER</w:t>
-      </w:r>
-    </w:p>
-    <w:p>
-      <w:pPr>
-        <w:rPr>
-          <w:rFonts w:ascii="Times New Roman" w:hAnsi="Times New Roman" w:cs="Times New Roman"/>
-          <w:sz w:val="28"/>
-          <w:szCs w:val="28"/>
-        </w:rPr>
-      </w:pPr>
-      <w:r>
-        <w:rPr>
-          <w:rFonts w:ascii="Times New Roman" w:hAnsi="Times New Roman" w:cs="Times New Roman"/>
-          <w:sz w:val="28"/>
-          <w:szCs w:val="28"/>
-        </w:rPr>
-        <w:t xml:space="preserve">  Server cannot read </w:t>
-      </w:r>
-      <w:proofErr w:type="spellStart"/>
-      <w:r>
-        <w:rPr>
-          <w:rFonts w:ascii="Times New Roman" w:hAnsi="Times New Roman" w:cs="Times New Roman"/>
-          <w:sz w:val="28"/>
-          <w:szCs w:val="28"/>
-        </w:rPr>
-        <w:t>localStorage</w:t>
-      </w:r>
-      <w:proofErr w:type="spellEnd"/>
-      <w:r>
-        <w:rPr>
-          <w:rFonts w:ascii="Times New Roman" w:hAnsi="Times New Roman" w:cs="Times New Roman"/>
-          <w:sz w:val="28"/>
-          <w:szCs w:val="28"/>
-        </w:rPr>
-        <w:t>!</w:t>
+        <w:t xml:space="preserve">  middleware.ts runs on the SERVER</w:t>
+      </w:r>
+    </w:p>
+    <w:p>
+      <w:pPr>
+        <w:rPr>
+          <w:rFonts w:ascii="Times New Roman" w:hAnsi="Times New Roman" w:cs="Times New Roman"/>
+          <w:sz w:val="28"/>
+          <w:szCs w:val="28"/>
+        </w:rPr>
+      </w:pPr>
+      <w:r>
+        <w:rPr>
+          <w:rFonts w:ascii="Times New Roman" w:hAnsi="Times New Roman" w:cs="Times New Roman"/>
+          <w:sz w:val="28"/>
+          <w:szCs w:val="28"/>
+        </w:rPr>
+        <w:t xml:space="preserve">  localStorage exists only in the BROWSER</w:t>
+      </w:r>
+    </w:p>
+    <w:p>
+      <w:pPr>
+        <w:rPr>
+          <w:rFonts w:ascii="Times New Roman" w:hAnsi="Times New Roman" w:cs="Times New Roman"/>
+          <w:sz w:val="28"/>
+          <w:szCs w:val="28"/>
+        </w:rPr>
+      </w:pPr>
+      <w:r>
+        <w:rPr>
+          <w:rFonts w:ascii="Times New Roman" w:hAnsi="Times New Roman" w:cs="Times New Roman"/>
+          <w:sz w:val="28"/>
+          <w:szCs w:val="28"/>
+        </w:rPr>
+        <w:t xml:space="preserve">  Server cannot read localStorage!</w:t>
       </w:r>
     </w:p>
     <w:p>
@@ -225,25 +153,7 @@
           <w:sz w:val="28"/>
           <w:szCs w:val="28"/>
         </w:rPr>
-        <w:t xml:space="preserve">  Save token in BOTH </w:t>
-      </w:r>
-      <w:proofErr w:type="spellStart"/>
-      <w:r>
-        <w:rPr>
-          <w:rFonts w:ascii="Times New Roman" w:hAnsi="Times New Roman" w:cs="Times New Roman"/>
-          <w:sz w:val="28"/>
-          <w:szCs w:val="28"/>
-        </w:rPr>
-        <w:t>localStorage</w:t>
-      </w:r>
-      <w:proofErr w:type="spellEnd"/>
-      <w:r>
-        <w:rPr>
-          <w:rFonts w:ascii="Times New Roman" w:hAnsi="Times New Roman" w:cs="Times New Roman"/>
-          <w:sz w:val="28"/>
-          <w:szCs w:val="28"/>
-        </w:rPr>
-        <w:t xml:space="preserve"> AND cookie</w:t>
+        <w:t xml:space="preserve">  Save token in BOTH localStorage AND cookie</w:t>
       </w:r>
     </w:p>
     <w:p>
@@ -337,25 +247,7 @@
           <w:sz w:val="28"/>
           <w:szCs w:val="28"/>
         </w:rPr>
-        <w:t xml:space="preserve">Save token to </w:t>
-      </w:r>
-      <w:proofErr w:type="spellStart"/>
-      <w:r>
-        <w:rPr>
-          <w:rFonts w:ascii="Times New Roman" w:hAnsi="Times New Roman" w:cs="Times New Roman"/>
-          <w:sz w:val="28"/>
-          <w:szCs w:val="28"/>
-        </w:rPr>
-        <w:t>localStorage</w:t>
-      </w:r>
-      <w:proofErr w:type="spellEnd"/>
-      <w:r>
-        <w:rPr>
-          <w:rFonts w:ascii="Times New Roman" w:hAnsi="Times New Roman" w:cs="Times New Roman"/>
-          <w:sz w:val="28"/>
-          <w:szCs w:val="28"/>
-        </w:rPr>
-        <w:t xml:space="preserve">  ← for browser JS (Axios interceptor)</w:t>
+        <w:t>Save token to localStorage  ← for browser JS (Axios interceptor)</w:t>
       </w:r>
     </w:p>
     <w:p>
@@ -434,23 +326,13 @@
           <w:szCs w:val="28"/>
         </w:rPr>
       </w:pPr>
-      <w:proofErr w:type="spellStart"/>
-      <w:r>
-        <w:rPr>
-          <w:rFonts w:ascii="Times New Roman" w:hAnsi="Times New Roman" w:cs="Times New Roman"/>
-          <w:sz w:val="28"/>
-          <w:szCs w:val="28"/>
-        </w:rPr>
-        <w:t>middleware.ts</w:t>
-      </w:r>
-      <w:proofErr w:type="spellEnd"/>
-      <w:r>
-        <w:rPr>
-          <w:rFonts w:ascii="Times New Roman" w:hAnsi="Times New Roman" w:cs="Times New Roman"/>
-          <w:sz w:val="28"/>
-          <w:szCs w:val="28"/>
-        </w:rPr>
-        <w:t xml:space="preserve"> runs on server</w:t>
+      <w:r>
+        <w:rPr>
+          <w:rFonts w:ascii="Times New Roman" w:hAnsi="Times New Roman" w:cs="Times New Roman"/>
+          <w:sz w:val="28"/>
+          <w:szCs w:val="28"/>
+        </w:rPr>
+        <w:t>middleware.ts runs on server</w:t>
       </w:r>
     </w:p>
     <w:p>
@@ -532,43 +414,7 @@
           <w:sz w:val="28"/>
           <w:szCs w:val="28"/>
         </w:rPr>
-        <w:t xml:space="preserve">We already wrote the cookie helpers in </w:t>
-      </w:r>
-      <w:proofErr w:type="spellStart"/>
-      <w:r>
-        <w:rPr>
-          <w:rFonts w:ascii="Times New Roman" w:hAnsi="Times New Roman" w:cs="Times New Roman"/>
-          <w:sz w:val="28"/>
-          <w:szCs w:val="28"/>
-        </w:rPr>
-        <w:t>useAuthStore.ts</w:t>
-      </w:r>
-      <w:proofErr w:type="spellEnd"/>
-      <w:r>
-        <w:rPr>
-          <w:rFonts w:ascii="Times New Roman" w:hAnsi="Times New Roman" w:cs="Times New Roman"/>
-          <w:sz w:val="28"/>
-          <w:szCs w:val="28"/>
-        </w:rPr>
-        <w:t>. But let me make sure they are correctly implemented. Open apps/web/store/</w:t>
-      </w:r>
-      <w:proofErr w:type="spellStart"/>
-      <w:r>
-        <w:rPr>
-          <w:rFonts w:ascii="Times New Roman" w:hAnsi="Times New Roman" w:cs="Times New Roman"/>
-          <w:sz w:val="28"/>
-          <w:szCs w:val="28"/>
-        </w:rPr>
-        <w:t>useAuthStore.ts</w:t>
-      </w:r>
-      <w:proofErr w:type="spellEnd"/>
-      <w:r>
-        <w:rPr>
-          <w:rFonts w:ascii="Times New Roman" w:hAnsi="Times New Roman" w:cs="Times New Roman"/>
-          <w:sz w:val="28"/>
-          <w:szCs w:val="28"/>
-        </w:rPr>
-        <w:t xml:space="preserve"> and verify these two helper functions exist at the top:</w:t>
+        <w:t>We already wrote the cookie helpers in useAuthStore.ts. But let me make sure they are correctly implemented. Open apps/web/store/useAuthStore.ts and verify these two helper functions exist at the top:</w:t>
       </w:r>
     </w:p>
     <w:p>
@@ -619,96 +465,24 @@
           <w:sz w:val="28"/>
           <w:szCs w:val="28"/>
         </w:rPr>
-        <w:t xml:space="preserve">│  </w:t>
-      </w:r>
-      <w:proofErr w:type="spellStart"/>
-      <w:r>
-        <w:rPr>
-          <w:rFonts w:ascii="Times New Roman" w:hAnsi="Times New Roman" w:cs="Times New Roman"/>
-          <w:sz w:val="28"/>
-          <w:szCs w:val="28"/>
-        </w:rPr>
-        <w:t>localStorage</w:t>
-      </w:r>
-      <w:proofErr w:type="spellEnd"/>
-      <w:r>
-        <w:rPr>
-          <w:rFonts w:ascii="Times New Roman" w:hAnsi="Times New Roman" w:cs="Times New Roman"/>
-          <w:sz w:val="28"/>
-          <w:szCs w:val="28"/>
-        </w:rPr>
-        <w:t>['</w:t>
-      </w:r>
-      <w:proofErr w:type="spellStart"/>
-      <w:r>
-        <w:rPr>
-          <w:rFonts w:ascii="Times New Roman" w:hAnsi="Times New Roman" w:cs="Times New Roman"/>
-          <w:sz w:val="28"/>
-          <w:szCs w:val="28"/>
-        </w:rPr>
-        <w:t>spendwise_token</w:t>
-      </w:r>
-      <w:proofErr w:type="spellEnd"/>
-      <w:r>
-        <w:rPr>
-          <w:rFonts w:ascii="Times New Roman" w:hAnsi="Times New Roman" w:cs="Times New Roman"/>
-          <w:sz w:val="28"/>
-          <w:szCs w:val="28"/>
-        </w:rPr>
-        <w:t>'] = "</w:t>
-      </w:r>
-      <w:proofErr w:type="spellStart"/>
-      <w:r>
-        <w:rPr>
-          <w:rFonts w:ascii="Times New Roman" w:hAnsi="Times New Roman" w:cs="Times New Roman"/>
-          <w:sz w:val="28"/>
-          <w:szCs w:val="28"/>
-        </w:rPr>
-        <w:t>eyJ</w:t>
-      </w:r>
-      <w:proofErr w:type="spellEnd"/>
-      <w:r>
-        <w:rPr>
-          <w:rFonts w:ascii="Times New Roman" w:hAnsi="Times New Roman" w:cs="Times New Roman"/>
-          <w:sz w:val="28"/>
-          <w:szCs w:val="28"/>
-        </w:rPr>
-        <w:t xml:space="preserve">..."     </w:t>
-      </w:r>
-    </w:p>
-    <w:p>
-      <w:pPr>
-        <w:rPr>
-          <w:rFonts w:ascii="Times New Roman" w:hAnsi="Times New Roman" w:cs="Times New Roman"/>
-          <w:sz w:val="28"/>
-          <w:szCs w:val="28"/>
-        </w:rPr>
-      </w:pPr>
-      <w:r>
-        <w:rPr>
-          <w:rFonts w:ascii="Times New Roman" w:hAnsi="Times New Roman" w:cs="Times New Roman"/>
-          <w:sz w:val="28"/>
-          <w:szCs w:val="28"/>
-        </w:rPr>
-        <w:t>│  → Used by: Axios interceptor (</w:t>
-      </w:r>
-      <w:proofErr w:type="spellStart"/>
-      <w:r>
-        <w:rPr>
-          <w:rFonts w:ascii="Times New Roman" w:hAnsi="Times New Roman" w:cs="Times New Roman"/>
-          <w:sz w:val="28"/>
-          <w:szCs w:val="28"/>
-        </w:rPr>
-        <w:t>api.ts</w:t>
-      </w:r>
-      <w:proofErr w:type="spellEnd"/>
-      <w:r>
-        <w:rPr>
-          <w:rFonts w:ascii="Times New Roman" w:hAnsi="Times New Roman" w:cs="Times New Roman"/>
-          <w:sz w:val="28"/>
-          <w:szCs w:val="28"/>
-        </w:rPr>
-        <w:t xml:space="preserve">)          </w:t>
+        <w:t xml:space="preserve">│  localStorage['spendwise_token'] = "eyJ..."     </w:t>
+      </w:r>
+    </w:p>
+    <w:p>
+      <w:pPr>
+        <w:rPr>
+          <w:rFonts w:ascii="Times New Roman" w:hAnsi="Times New Roman" w:cs="Times New Roman"/>
+          <w:sz w:val="28"/>
+          <w:szCs w:val="28"/>
+        </w:rPr>
+      </w:pPr>
+      <w:r>
+        <w:rPr>
+          <w:rFonts w:ascii="Times New Roman" w:hAnsi="Times New Roman" w:cs="Times New Roman"/>
+          <w:sz w:val="28"/>
+          <w:szCs w:val="28"/>
+        </w:rPr>
+        <w:t xml:space="preserve">│  → Used by: Axios interceptor (api.ts)          </w:t>
       </w:r>
     </w:p>
     <w:p>
@@ -785,78 +559,24 @@
           <w:sz w:val="28"/>
           <w:szCs w:val="28"/>
         </w:rPr>
-        <w:t>│  Cookie['</w:t>
-      </w:r>
-      <w:proofErr w:type="spellStart"/>
-      <w:r>
-        <w:rPr>
-          <w:rFonts w:ascii="Times New Roman" w:hAnsi="Times New Roman" w:cs="Times New Roman"/>
-          <w:sz w:val="28"/>
-          <w:szCs w:val="28"/>
-        </w:rPr>
-        <w:t>spendwise_token</w:t>
-      </w:r>
-      <w:proofErr w:type="spellEnd"/>
-      <w:r>
-        <w:rPr>
-          <w:rFonts w:ascii="Times New Roman" w:hAnsi="Times New Roman" w:cs="Times New Roman"/>
-          <w:sz w:val="28"/>
-          <w:szCs w:val="28"/>
-        </w:rPr>
-        <w:t>'] = "</w:t>
-      </w:r>
-      <w:proofErr w:type="spellStart"/>
-      <w:r>
-        <w:rPr>
-          <w:rFonts w:ascii="Times New Roman" w:hAnsi="Times New Roman" w:cs="Times New Roman"/>
-          <w:sz w:val="28"/>
-          <w:szCs w:val="28"/>
-        </w:rPr>
-        <w:t>eyJ</w:t>
-      </w:r>
-      <w:proofErr w:type="spellEnd"/>
-      <w:r>
-        <w:rPr>
-          <w:rFonts w:ascii="Times New Roman" w:hAnsi="Times New Roman" w:cs="Times New Roman"/>
-          <w:sz w:val="28"/>
-          <w:szCs w:val="28"/>
-        </w:rPr>
-        <w:t xml:space="preserve">..."           </w:t>
-      </w:r>
-    </w:p>
-    <w:p>
-      <w:pPr>
-        <w:rPr>
-          <w:rFonts w:ascii="Times New Roman" w:hAnsi="Times New Roman" w:cs="Times New Roman"/>
-          <w:sz w:val="28"/>
-          <w:szCs w:val="28"/>
-        </w:rPr>
-      </w:pPr>
-      <w:r>
-        <w:rPr>
-          <w:rFonts w:ascii="Times New Roman" w:hAnsi="Times New Roman" w:cs="Times New Roman"/>
-          <w:sz w:val="28"/>
-          <w:szCs w:val="28"/>
-        </w:rPr>
-        <w:t xml:space="preserve">│  → Used by: </w:t>
-      </w:r>
-      <w:proofErr w:type="spellStart"/>
-      <w:r>
-        <w:rPr>
-          <w:rFonts w:ascii="Times New Roman" w:hAnsi="Times New Roman" w:cs="Times New Roman"/>
-          <w:sz w:val="28"/>
-          <w:szCs w:val="28"/>
-        </w:rPr>
-        <w:t>middleware.ts</w:t>
-      </w:r>
-      <w:proofErr w:type="spellEnd"/>
-      <w:r>
-        <w:rPr>
-          <w:rFonts w:ascii="Times New Roman" w:hAnsi="Times New Roman" w:cs="Times New Roman"/>
-          <w:sz w:val="28"/>
-          <w:szCs w:val="28"/>
-        </w:rPr>
-        <w:t xml:space="preserve">                       </w:t>
+        <w:t xml:space="preserve">│  Cookie['spendwise_token'] = "eyJ..."           </w:t>
+      </w:r>
+    </w:p>
+    <w:p>
+      <w:pPr>
+        <w:rPr>
+          <w:rFonts w:ascii="Times New Roman" w:hAnsi="Times New Roman" w:cs="Times New Roman"/>
+          <w:sz w:val="28"/>
+          <w:szCs w:val="28"/>
+        </w:rPr>
+      </w:pPr>
+      <w:r>
+        <w:rPr>
+          <w:rFonts w:ascii="Times New Roman" w:hAnsi="Times New Roman" w:cs="Times New Roman"/>
+          <w:sz w:val="28"/>
+          <w:szCs w:val="28"/>
+        </w:rPr>
+        <w:t xml:space="preserve">│  → Used by: middleware.ts                       </w:t>
       </w:r>
     </w:p>
     <w:p>
@@ -1089,27 +809,7 @@
           <w:sz w:val="28"/>
           <w:szCs w:val="28"/>
         </w:rPr>
-        <w:t xml:space="preserve">Claude </w:t>
-      </w:r>
-      <w:proofErr w:type="spellStart"/>
-      <w:r>
-        <w:rPr>
-          <w:rFonts w:ascii="Times New Roman" w:hAnsi="Times New Roman" w:cs="Times New Roman"/>
-          <w:color w:val="00B0F0"/>
-          <w:sz w:val="28"/>
-          <w:szCs w:val="28"/>
-        </w:rPr>
-        <w:t>api</w:t>
-      </w:r>
-      <w:proofErr w:type="spellEnd"/>
-      <w:r>
-        <w:rPr>
-          <w:rFonts w:ascii="Times New Roman" w:hAnsi="Times New Roman" w:cs="Times New Roman"/>
-          <w:color w:val="00B0F0"/>
-          <w:sz w:val="28"/>
-          <w:szCs w:val="28"/>
-        </w:rPr>
-        <w:t xml:space="preserve"> key= ‘sk-9fb5a0dea035427c9f362adcf1ed5187’</w:t>
+        <w:t>Claude api key= ‘sk-9fb5a0dea035427c9f362adcf1ed5187’</w:t>
       </w:r>
     </w:p>
     <w:p>
@@ -1269,25 +969,7 @@
           <w:sz w:val="28"/>
           <w:szCs w:val="28"/>
         </w:rPr>
-        <w:t xml:space="preserve">    Run all test cases: </w:t>
-      </w:r>
-      <w:proofErr w:type="spellStart"/>
-      <w:r>
-        <w:rPr>
-          <w:rFonts w:ascii="Times New Roman" w:hAnsi="Times New Roman" w:cs="Times New Roman"/>
-          <w:sz w:val="28"/>
-          <w:szCs w:val="28"/>
-        </w:rPr>
-        <w:t>npm</w:t>
-      </w:r>
-      <w:proofErr w:type="spellEnd"/>
-      <w:r>
-        <w:rPr>
-          <w:rFonts w:ascii="Times New Roman" w:hAnsi="Times New Roman" w:cs="Times New Roman"/>
-          <w:sz w:val="28"/>
-          <w:szCs w:val="28"/>
-        </w:rPr>
-        <w:t xml:space="preserve"> run test</w:t>
+        <w:t xml:space="preserve">    Run all test cases: npm run test</w:t>
       </w:r>
     </w:p>
     <w:p>
@@ -1339,7 +1021,6 @@
         </w:rPr>
         <w:t xml:space="preserve">              </w:t>
       </w:r>
-      <w:proofErr w:type="spellStart"/>
       <w:r>
         <w:rPr>
           <w:rFonts w:ascii="Times New Roman" w:hAnsi="Times New Roman" w:cs="Times New Roman"/>
@@ -1354,27 +1035,8 @@
           <w:sz w:val="28"/>
           <w:szCs w:val="28"/>
         </w:rPr>
-        <w:t>pm</w:t>
-      </w:r>
-      <w:proofErr w:type="spellEnd"/>
-      <w:r>
-        <w:rPr>
-          <w:rFonts w:ascii="Times New Roman" w:hAnsi="Times New Roman" w:cs="Times New Roman"/>
-          <w:sz w:val="28"/>
-          <w:szCs w:val="28"/>
-        </w:rPr>
-        <w:t xml:space="preserve"> run </w:t>
-      </w:r>
-      <w:proofErr w:type="spellStart"/>
-      <w:r>
-        <w:rPr>
-          <w:rFonts w:ascii="Times New Roman" w:hAnsi="Times New Roman" w:cs="Times New Roman"/>
-          <w:sz w:val="28"/>
-          <w:szCs w:val="28"/>
-        </w:rPr>
-        <w:t>test:coverage</w:t>
-      </w:r>
-      <w:proofErr w:type="spellEnd"/>
+        <w:t>pm run test:coverage</w:t>
+      </w:r>
     </w:p>
     <w:p>
       <w:pPr>
@@ -1485,9 +1147,17 @@
           <w:sz w:val="28"/>
           <w:szCs w:val="28"/>
         </w:rPr>
-        <w:t xml:space="preserve">in </w:t>
-      </w:r>
-      <w:proofErr w:type="spellStart"/>
+        <w:t>in Dockerfile</w:t>
+      </w:r>
+    </w:p>
+    <w:p>
+      <w:pPr>
+        <w:rPr>
+          <w:rFonts w:ascii="Times New Roman" w:hAnsi="Times New Roman" w:cs="Times New Roman"/>
+          <w:sz w:val="28"/>
+          <w:szCs w:val="28"/>
+        </w:rPr>
+      </w:pPr>
       <w:r>
         <w:rPr>
           <w:rFonts w:ascii="Times New Roman" w:hAnsi="Times New Roman" w:cs="Times New Roman"/>
@@ -1496,9 +1166,59 @@
           <w:sz w:val="28"/>
           <w:szCs w:val="28"/>
         </w:rPr>
-        <w:t>Dockerfile</w:t>
-      </w:r>
-      <w:proofErr w:type="spellEnd"/>
+        <w:t>multi-stage builds:</w:t>
+      </w:r>
+      <w:r>
+        <w:rPr>
+          <w:rFonts w:ascii="Times New Roman" w:hAnsi="Times New Roman" w:cs="Times New Roman"/>
+          <w:sz w:val="28"/>
+          <w:szCs w:val="28"/>
+        </w:rPr>
+        <w:t xml:space="preserve"> </w:t>
+      </w:r>
+    </w:p>
+    <w:p>
+      <w:pPr>
+        <w:rPr>
+          <w:rFonts w:ascii="Times New Roman" w:hAnsi="Times New Roman" w:cs="Times New Roman"/>
+          <w:sz w:val="28"/>
+          <w:szCs w:val="28"/>
+        </w:rPr>
+      </w:pPr>
+      <w:r>
+        <w:rPr>
+          <w:rFonts w:ascii="Times New Roman" w:hAnsi="Times New Roman" w:cs="Times New Roman"/>
+          <w:sz w:val="28"/>
+          <w:szCs w:val="28"/>
+        </w:rPr>
+        <w:t xml:space="preserve">Stage 1 has everything needed to BUILD the app (TypeScript compiler, all packages). </w:t>
+      </w:r>
+    </w:p>
+    <w:p>
+      <w:pPr>
+        <w:rPr>
+          <w:rFonts w:ascii="Times New Roman" w:hAnsi="Times New Roman" w:cs="Times New Roman"/>
+          <w:sz w:val="28"/>
+          <w:szCs w:val="28"/>
+        </w:rPr>
+      </w:pPr>
+      <w:r>
+        <w:rPr>
+          <w:rFonts w:ascii="Times New Roman" w:hAnsi="Times New Roman" w:cs="Times New Roman"/>
+          <w:sz w:val="28"/>
+          <w:szCs w:val="28"/>
+        </w:rPr>
+        <w:t>Stage 2 only copies the final compiled result. This is exactly how professional companies ship Node.js apps — smaller image, faster deploys, fewer security vulnerabilities since dev tools aren't shipped.</w:t>
+      </w:r>
+    </w:p>
+    <w:p>
+      <w:pPr>
+        <w:rPr>
+          <w:rFonts w:ascii="Times New Roman" w:hAnsi="Times New Roman" w:cs="Times New Roman"/>
+          <w:sz w:val="28"/>
+          <w:szCs w:val="28"/>
+        </w:rPr>
+      </w:pPr>
     </w:p>
     <w:p>
       <w:pPr>
@@ -1516,69 +1236,25 @@
           <w:sz w:val="28"/>
           <w:szCs w:val="28"/>
         </w:rPr>
-        <w:t>multi-stage builds:</w:t>
-      </w:r>
-      <w:r>
-        <w:rPr>
-          <w:rFonts w:ascii="Times New Roman" w:hAnsi="Times New Roman" w:cs="Times New Roman"/>
-          <w:sz w:val="28"/>
-          <w:szCs w:val="28"/>
-        </w:rPr>
-        <w:t xml:space="preserve"> </w:t>
-      </w:r>
-    </w:p>
-    <w:p>
-      <w:pPr>
-        <w:rPr>
-          <w:rFonts w:ascii="Times New Roman" w:hAnsi="Times New Roman" w:cs="Times New Roman"/>
-          <w:sz w:val="28"/>
-          <w:szCs w:val="28"/>
-        </w:rPr>
-      </w:pPr>
-      <w:r>
-        <w:rPr>
-          <w:rFonts w:ascii="Times New Roman" w:hAnsi="Times New Roman" w:cs="Times New Roman"/>
-          <w:sz w:val="28"/>
-          <w:szCs w:val="28"/>
-        </w:rPr>
-        <w:t xml:space="preserve">Stage 1 has everything needed to BUILD the app (TypeScript compiler, all packages). </w:t>
-      </w:r>
-    </w:p>
-    <w:p>
-      <w:pPr>
-        <w:rPr>
-          <w:rFonts w:ascii="Times New Roman" w:hAnsi="Times New Roman" w:cs="Times New Roman"/>
-          <w:sz w:val="28"/>
-          <w:szCs w:val="28"/>
-        </w:rPr>
-      </w:pPr>
-      <w:r>
-        <w:rPr>
-          <w:rFonts w:ascii="Times New Roman" w:hAnsi="Times New Roman" w:cs="Times New Roman"/>
-          <w:sz w:val="28"/>
-          <w:szCs w:val="28"/>
-        </w:rPr>
-        <w:t>Stage 2 only copies the final compiled result. This is exactly how professional companies ship Node.js apps — smaller image, faster deploys, fewer security vulnerabilities since dev tools aren't shipped.</w:t>
-      </w:r>
-    </w:p>
-    <w:p>
-      <w:pPr>
-        <w:rPr>
-          <w:rFonts w:ascii="Times New Roman" w:hAnsi="Times New Roman" w:cs="Times New Roman"/>
-          <w:sz w:val="28"/>
-          <w:szCs w:val="28"/>
-        </w:rPr>
-      </w:pPr>
-    </w:p>
-    <w:p>
-      <w:pPr>
-        <w:rPr>
-          <w:rFonts w:ascii="Times New Roman" w:hAnsi="Times New Roman" w:cs="Times New Roman"/>
-          <w:sz w:val="28"/>
-          <w:szCs w:val="28"/>
-        </w:rPr>
-      </w:pPr>
-      <w:proofErr w:type="spellStart"/>
+        <w:lastRenderedPageBreak/>
+        <w:t xml:space="preserve">Dockerfile = </w:t>
+      </w:r>
+      <w:r>
+        <w:rPr>
+          <w:rFonts w:ascii="Times New Roman" w:hAnsi="Times New Roman" w:cs="Times New Roman"/>
+          <w:sz w:val="28"/>
+          <w:szCs w:val="28"/>
+        </w:rPr>
+        <w:t>tells Docker how to build ONE container.</w:t>
+      </w:r>
+      <w:r>
+        <w:rPr>
+          <w:rFonts w:ascii="Times New Roman" w:hAnsi="Times New Roman" w:cs="Times New Roman"/>
+          <w:sz w:val="28"/>
+          <w:szCs w:val="28"/>
+        </w:rPr>
+        <w:br/>
+      </w:r>
       <w:r>
         <w:rPr>
           <w:rFonts w:ascii="Times New Roman" w:hAnsi="Times New Roman" w:cs="Times New Roman"/>
@@ -1587,91 +1263,15 @@
           <w:sz w:val="28"/>
           <w:szCs w:val="28"/>
         </w:rPr>
-        <w:lastRenderedPageBreak/>
-        <w:t>Dockerfile</w:t>
-      </w:r>
-      <w:proofErr w:type="spellEnd"/>
-      <w:r>
-        <w:rPr>
-          <w:rFonts w:ascii="Times New Roman" w:hAnsi="Times New Roman" w:cs="Times New Roman"/>
-          <w:b/>
-          <w:bCs/>
-          <w:sz w:val="28"/>
-          <w:szCs w:val="28"/>
-        </w:rPr>
-        <w:t xml:space="preserve"> = </w:t>
-      </w:r>
-      <w:r>
-        <w:rPr>
-          <w:rFonts w:ascii="Times New Roman" w:hAnsi="Times New Roman" w:cs="Times New Roman"/>
-          <w:sz w:val="28"/>
-          <w:szCs w:val="28"/>
-        </w:rPr>
-        <w:t>tells Docker how to build ONE container.</w:t>
-      </w:r>
-      <w:r>
-        <w:rPr>
-          <w:rFonts w:ascii="Times New Roman" w:hAnsi="Times New Roman" w:cs="Times New Roman"/>
-          <w:sz w:val="28"/>
-          <w:szCs w:val="28"/>
-        </w:rPr>
-        <w:br/>
-      </w:r>
-      <w:r>
-        <w:rPr>
-          <w:rFonts w:ascii="Times New Roman" w:hAnsi="Times New Roman" w:cs="Times New Roman"/>
-          <w:b/>
-          <w:bCs/>
-          <w:sz w:val="28"/>
-          <w:szCs w:val="28"/>
-        </w:rPr>
-        <w:t>docker-</w:t>
-      </w:r>
-      <w:proofErr w:type="spellStart"/>
-      <w:r>
-        <w:rPr>
-          <w:rFonts w:ascii="Times New Roman" w:hAnsi="Times New Roman" w:cs="Times New Roman"/>
-          <w:b/>
-          <w:bCs/>
-          <w:sz w:val="28"/>
-          <w:szCs w:val="28"/>
-        </w:rPr>
-        <w:t>compose.yml</w:t>
-      </w:r>
-      <w:proofErr w:type="spellEnd"/>
-      <w:r>
-        <w:rPr>
-          <w:rFonts w:ascii="Times New Roman" w:hAnsi="Times New Roman" w:cs="Times New Roman"/>
-          <w:b/>
-          <w:bCs/>
-          <w:sz w:val="28"/>
-          <w:szCs w:val="28"/>
-        </w:rPr>
-        <w:t xml:space="preserve"> = </w:t>
-      </w:r>
-      <w:r>
-        <w:rPr>
-          <w:rFonts w:ascii="Times New Roman" w:hAnsi="Times New Roman" w:cs="Times New Roman"/>
-          <w:sz w:val="28"/>
-          <w:szCs w:val="28"/>
-        </w:rPr>
-        <w:t>tells Docker how to run and connect MULTIPLE</w:t>
-      </w:r>
-      <w:r>
-        <w:rPr>
-          <w:rFonts w:ascii="Times New Roman" w:hAnsi="Times New Roman" w:cs="Times New Roman"/>
-          <w:sz w:val="28"/>
-          <w:szCs w:val="28"/>
-        </w:rPr>
-        <w:t xml:space="preserve">               </w:t>
-      </w:r>
-      <w:r>
-        <w:rPr>
-          <w:rFonts w:ascii="Times New Roman" w:hAnsi="Times New Roman" w:cs="Times New Roman"/>
-          <w:sz w:val="28"/>
-          <w:szCs w:val="28"/>
-        </w:rPr>
-        <w:t>containers/services together.</w:t>
+        <w:t xml:space="preserve">docker-compose.yml = </w:t>
+      </w:r>
+      <w:r>
+        <w:rPr>
+          <w:rFonts w:ascii="Times New Roman" w:hAnsi="Times New Roman" w:cs="Times New Roman"/>
+          <w:sz w:val="28"/>
+          <w:szCs w:val="28"/>
+        </w:rPr>
+        <w:t>tells Docker how to run and connect MULTIPLE               containers/services together.</w:t>
       </w:r>
     </w:p>
     <w:p>
@@ -1722,25 +1322,7 @@
           <w:sz w:val="28"/>
           <w:szCs w:val="28"/>
         </w:rPr>
-        <w:t>New-Item -ItemType File -Name "docker-</w:t>
-      </w:r>
-      <w:proofErr w:type="spellStart"/>
-      <w:r>
-        <w:rPr>
-          <w:rFonts w:ascii="Times New Roman" w:hAnsi="Times New Roman" w:cs="Times New Roman"/>
-          <w:sz w:val="28"/>
-          <w:szCs w:val="28"/>
-        </w:rPr>
-        <w:t>compose.yml</w:t>
-      </w:r>
-      <w:proofErr w:type="spellEnd"/>
-      <w:r>
-        <w:rPr>
-          <w:rFonts w:ascii="Times New Roman" w:hAnsi="Times New Roman" w:cs="Times New Roman"/>
-          <w:sz w:val="28"/>
-          <w:szCs w:val="28"/>
-        </w:rPr>
-        <w:t>"</w:t>
+        <w:t>New-Item -ItemType File -Name "docker-compose.yml"</w:t>
       </w:r>
     </w:p>
     <w:p>
@@ -1934,14 +1516,155 @@
         </w:rPr>
         <w:t xml:space="preserve">DB Host Server:                                                </w:t>
       </w:r>
-      <w:r>
-        <w:rPr>
-          <w:rFonts w:ascii="Times New Roman" w:hAnsi="Times New Roman" w:cs="Times New Roman"/>
-          <w:sz w:val="28"/>
-          <w:szCs w:val="28"/>
-        </w:rPr>
-        <w:t>https://console.neon.tech/app/projects/lucky-fog-17993504?database=neondb</w:t>
-      </w:r>
+      <w:hyperlink r:id="rId11" w:history="1">
+        <w:r>
+          <w:rPr>
+            <w:rStyle w:val="Hyperlink"/>
+            <w:rFonts w:ascii="Times New Roman" w:hAnsi="Times New Roman" w:cs="Times New Roman"/>
+            <w:sz w:val="28"/>
+            <w:szCs w:val="28"/>
+          </w:rPr>
+          <w:t>https://console.neon.tech/app/projects/lucky-fog-17993504?database=neondb</w:t>
+        </w:r>
+      </w:hyperlink>
+    </w:p>
+    <w:p>
+      <w:pPr>
+        <w:rPr>
+          <w:rFonts w:ascii="Times New Roman" w:hAnsi="Times New Roman" w:cs="Times New Roman"/>
+          <w:sz w:val="28"/>
+          <w:szCs w:val="28"/>
+        </w:rPr>
+      </w:pPr>
+    </w:p>
+    <w:p>
+      <w:pPr>
+        <w:rPr>
+          <w:rFonts w:ascii="Times New Roman" w:hAnsi="Times New Roman" w:cs="Times New Roman"/>
+          <w:sz w:val="28"/>
+          <w:szCs w:val="28"/>
+        </w:rPr>
+      </w:pPr>
+      <w:r>
+        <w:rPr>
+          <w:rFonts w:ascii="Times New Roman" w:hAnsi="Times New Roman" w:cs="Times New Roman"/>
+          <w:b/>
+          <w:bCs/>
+          <w:sz w:val="28"/>
+          <w:szCs w:val="28"/>
+        </w:rPr>
+        <w:lastRenderedPageBreak/>
+        <w:t>Root endpoint</w:t>
+      </w:r>
+      <w:r>
+        <w:rPr>
+          <w:rFonts w:ascii="Times New Roman" w:hAnsi="Times New Roman" w:cs="Times New Roman"/>
+          <w:sz w:val="28"/>
+          <w:szCs w:val="28"/>
+        </w:rPr>
+        <w:t>: </w:t>
+      </w:r>
+      <w:hyperlink r:id="rId12" w:history="1">
+        <w:r>
+          <w:rPr>
+            <w:rStyle w:val="Hyperlink"/>
+            <w:rFonts w:ascii="Times New Roman" w:hAnsi="Times New Roman" w:cs="Times New Roman"/>
+            <w:sz w:val="28"/>
+            <w:szCs w:val="28"/>
+          </w:rPr>
+          <w:t>https://spendwise-backend-eight.vercel.app/</w:t>
+        </w:r>
+      </w:hyperlink>
+    </w:p>
+    <w:p>
+      <w:r>
+        <w:rPr>
+          <w:rFonts w:ascii="Times New Roman" w:hAnsi="Times New Roman" w:cs="Times New Roman"/>
+          <w:b/>
+          <w:bCs/>
+          <w:sz w:val="28"/>
+          <w:szCs w:val="28"/>
+        </w:rPr>
+        <w:t>Health check</w:t>
+      </w:r>
+      <w:r>
+        <w:rPr>
+          <w:rFonts w:ascii="Times New Roman" w:hAnsi="Times New Roman" w:cs="Times New Roman"/>
+          <w:sz w:val="28"/>
+          <w:szCs w:val="28"/>
+        </w:rPr>
+        <w:t>: </w:t>
+      </w:r>
+      <w:hyperlink r:id="rId13" w:history="1">
+        <w:r>
+          <w:rPr>
+            <w:rStyle w:val="Hyperlink"/>
+            <w:rFonts w:ascii="Times New Roman" w:hAnsi="Times New Roman" w:cs="Times New Roman"/>
+            <w:sz w:val="28"/>
+            <w:szCs w:val="28"/>
+          </w:rPr>
+          <w:t>https://spendwise-backend-eight.vercel.app/api/health</w:t>
+        </w:r>
+      </w:hyperlink>
+    </w:p>
+    <w:p/>
+    <w:p>
+      <w:pPr>
+        <w:rPr>
+          <w:rFonts w:ascii="Times New Roman" w:hAnsi="Times New Roman" w:cs="Times New Roman"/>
+          <w:sz w:val="28"/>
+          <w:szCs w:val="28"/>
+        </w:rPr>
+      </w:pPr>
+      <w:r>
+        <w:rPr>
+          <w:noProof/>
+        </w:rPr>
+        <w:drawing>
+          <wp:inline distT="0" distB="0" distL="0" distR="0" wp14:anchorId="4C241D98" wp14:editId="20902471">
+            <wp:extent cx="5705475" cy="5762625"/>
+            <wp:effectExtent l="0" t="0" r="9525" b="9525"/>
+            <wp:docPr id="356191908" name="Picture 1"/>
+            <wp:cNvGraphicFramePr>
+              <a:graphicFrameLocks xmlns:a="http://schemas.openxmlformats.org/drawingml/2006/main" noChangeAspect="1"/>
+            </wp:cNvGraphicFramePr>
+            <a:graphic xmlns:a="http://schemas.openxmlformats.org/drawingml/2006/main">
+              <a:graphicData uri="http://schemas.openxmlformats.org/drawingml/2006/picture">
+                <pic:pic xmlns:pic="http://schemas.openxmlformats.org/drawingml/2006/picture">
+                  <pic:nvPicPr>
+                    <pic:cNvPr id="356191908" name=""/>
+                    <pic:cNvPicPr/>
+                  </pic:nvPicPr>
+                  <pic:blipFill>
+                    <a:blip r:embed="rId14"/>
+                    <a:stretch>
+                      <a:fillRect/>
+                    </a:stretch>
+                  </pic:blipFill>
+                  <pic:spPr>
+                    <a:xfrm>
+                      <a:off x="0" y="0"/>
+                      <a:ext cx="5705475" cy="5762625"/>
+                    </a:xfrm>
+                    <a:prstGeom prst="rect">
+                      <a:avLst/>
+                    </a:prstGeom>
+                  </pic:spPr>
+                </pic:pic>
+              </a:graphicData>
+            </a:graphic>
+          </wp:inline>
+        </w:drawing>
+      </w:r>
+    </w:p>
+    <w:p>
+      <w:pPr>
+        <w:rPr>
+          <w:rFonts w:ascii="Times New Roman" w:hAnsi="Times New Roman" w:cs="Times New Roman"/>
+          <w:sz w:val="28"/>
+          <w:szCs w:val="28"/>
+        </w:rPr>
+      </w:pPr>
     </w:p>
     <w:sectPr>
       <w:pgSz w:w="12240" w:h="15840"/>
@@ -1954,7 +1677,7 @@
 </file>
 
 <file path=word/numbering.xml><?xml version="1.0" encoding="utf-8"?>
-<w:numbering xmlns:wpc="http://schemas.microsoft.com/office/word/2010/wordprocessingCanvas" xmlns:cx="http://schemas.microsoft.com/office/drawing/2014/chartex" xmlns:cx1="http://schemas.microsoft.com/office/drawing/2015/9/8/chartex" xmlns:cx2="http://schemas.microsoft.com/office/drawing/2015/10/21/chartex" xmlns:cx3="http://schemas.microsoft.com/office/drawing/2016/5/9/chartex" xmlns:cx4="http://schemas.microsoft.com/office/drawing/2016/5/10/chartex" xmlns:cx5="http://schemas.microsoft.com/office/drawing/2016/5/11/chartex" xmlns:cx6="http://schemas.microsoft.com/office/drawing/2016/5/12/chartex" xmlns:cx7="http://schemas.microsoft.com/office/drawing/2016/5/13/chartex" xmlns:cx8="http://schemas.microsoft.com/office/drawing/2016/5/14/chartex" xmlns:mc="http://schemas.openxmlformats.org/markup-compatibility/2006" xmlns:aink="http://schemas.microsoft.com/office/drawing/2016/ink" xmlns:am3d="http://schemas.microsoft.com/office/drawing/2017/model3d" xmlns:o="urn:schemas-microsoft-com:office:office" xmlns:oel="http://schemas.microsoft.com/office/2019/extlst" xmlns:r="http://schemas.openxmlformats.org/officeDocument/2006/relationships" xmlns:m="http://schemas.openxmlformats.org/officeDocument/2006/math" xmlns:v="urn:schemas-microsoft-com:vml" xmlns:wp14="http://schemas.microsoft.com/office/word/2010/wordprocessingDrawing" xmlns:wp="http://schemas.openxmlformats.org/drawingml/2006/wordprocessingDrawing" xmlns:w10="urn:schemas-microsoft-com:office:word" xmlns:w="http://schemas.openxmlformats.org/wordprocessingml/2006/main" xmlns:w14="http://schemas.microsoft.com/office/word/2010/wordml" xmlns:w15="http://schemas.microsoft.com/office/word/2012/wordml" xmlns:w16cei="http://schemas.microsoft.com/office/word/2026/wordml/cei" xmlns:w16cex="http://schemas.microsoft.com/office/word/2018/wordml/cex" xmlns:w16cid="http://schemas.microsoft.com/office/word/2016/wordml/cid" xmlns:w16="http://schemas.microsoft.com/office/word/2018/wordml" xmlns:w16du="http://schemas.microsoft.com/office/word/2023/wordml/word16du" xmlns:w16sdtdh="http://schemas.microsoft.com/office/word/2020/wordml/sdtdatahash" xmlns:w16sdtfl="http://schemas.microsoft.com/office/word/2024/wordml/sdtformatlock" xmlns:w16se="http://schemas.microsoft.com/office/word/2015/wordml/symex" xmlns:wpg="http://schemas.microsoft.com/office/word/2010/wordprocessingGroup" xmlns:wpi="http://schemas.microsoft.com/office/word/2010/wordprocessingInk" xmlns:wne="http://schemas.microsoft.com/office/word/2006/wordml" xmlns:wps="http://schemas.microsoft.com/office/word/2010/wordprocessingShape" mc:Ignorable="w14 w15 w16se w16cid w16 w16cex w16sdtdh w16sdtfl w16du wp14">
+<w:numbering xmlns:wpc="http://schemas.microsoft.com/office/word/2010/wordprocessingCanvas" xmlns:cx="http://schemas.microsoft.com/office/drawing/2014/chartex" xmlns:cx1="http://schemas.microsoft.com/office/drawing/2015/9/8/chartex" xmlns:cx2="http://schemas.microsoft.com/office/drawing/2015/10/21/chartex" xmlns:cx3="http://schemas.microsoft.com/office/drawing/2016/5/9/chartex" xmlns:cx4="http://schemas.microsoft.com/office/drawing/2016/5/10/chartex" xmlns:cx5="http://schemas.microsoft.com/office/drawing/2016/5/11/chartex" xmlns:cx6="http://schemas.microsoft.com/office/drawing/2016/5/12/chartex" xmlns:cx7="http://schemas.microsoft.com/office/drawing/2016/5/13/chartex" xmlns:cx8="http://schemas.microsoft.com/office/drawing/2016/5/14/chartex" xmlns:mc="http://schemas.openxmlformats.org/markup-compatibility/2006" xmlns:aink="http://schemas.microsoft.com/office/drawing/2016/ink" xmlns:am3d="http://schemas.microsoft.com/office/drawing/2017/model3d" xmlns:o="urn:schemas-microsoft-com:office:office" xmlns:oel="http://schemas.microsoft.com/office/2019/extlst" xmlns:r="http://schemas.openxmlformats.org/officeDocument/2006/relationships" xmlns:m="http://schemas.openxmlformats.org/officeDocument/2006/math" xmlns:v="urn:schemas-microsoft-com:vml" xmlns:wp14="http://schemas.microsoft.com/office/word/2010/wordprocessingDrawing" xmlns:wp="http://schemas.openxmlformats.org/drawingml/2006/wordprocessingDrawing" xmlns:w10="urn:schemas-microsoft-com:office:word" xmlns:w="http://schemas.openxmlformats.org/wordprocessingml/2006/main" xmlns:w14="http://schemas.microsoft.com/office/word/2010/wordml" xmlns:w15="http://schemas.microsoft.com/office/word/2012/wordml" xmlns:w16cex="http://schemas.microsoft.com/office/word/2018/wordml/cex" xmlns:w16cid="http://schemas.microsoft.com/office/word/2016/wordml/cid" xmlns:w16="http://schemas.microsoft.com/office/word/2018/wordml" xmlns:w16du="http://schemas.microsoft.com/office/word/2023/wordml/word16du" xmlns:w16sdtdh="http://schemas.microsoft.com/office/word/2020/wordml/sdtdatahash" xmlns:w16sdtfl="http://schemas.microsoft.com/office/word/2024/wordml/sdtformatlock" xmlns:w16se="http://schemas.microsoft.com/office/word/2015/wordml/symex" xmlns:wpg="http://schemas.microsoft.com/office/word/2010/wordprocessingGroup" xmlns:wpi="http://schemas.microsoft.com/office/word/2010/wordprocessingInk" xmlns:wne="http://schemas.microsoft.com/office/word/2006/wordml" xmlns:wps="http://schemas.microsoft.com/office/word/2010/wordprocessingShape" mc:Ignorable="w14 w15 w16se w16cid w16 w16cex w16sdtdh w16sdtfl w16du wp14">
   <w:abstractNum w:abstractNumId="0" w15:restartNumberingAfterBreak="0">
     <w:nsid w:val="1E5421B4"/>
     <w:multiLevelType w:val="hybridMultilevel"/>
@@ -2068,8 +1791,160 @@
       </w:rPr>
     </w:lvl>
   </w:abstractNum>
+  <w:abstractNum w:abstractNumId="1" w15:restartNumberingAfterBreak="0">
+    <w:nsid w:val="2934605C"/>
+    <w:multiLevelType w:val="multilevel"/>
+    <w:tmpl w:val="DCCAC506"/>
+    <w:lvl w:ilvl="0">
+      <w:start w:val="1"/>
+      <w:numFmt w:val="bullet"/>
+      <w:lvlText w:val=""/>
+      <w:lvlJc w:val="left"/>
+      <w:pPr>
+        <w:tabs>
+          <w:tab w:val="num" w:pos="720"/>
+        </w:tabs>
+        <w:ind w:left="720" w:hanging="360"/>
+      </w:pPr>
+      <w:rPr>
+        <w:rFonts w:ascii="Symbol" w:hAnsi="Symbol" w:hint="default"/>
+        <w:sz w:val="20"/>
+      </w:rPr>
+    </w:lvl>
+    <w:lvl w:ilvl="1" w:tentative="1">
+      <w:start w:val="1"/>
+      <w:numFmt w:val="bullet"/>
+      <w:lvlText w:val=""/>
+      <w:lvlJc w:val="left"/>
+      <w:pPr>
+        <w:tabs>
+          <w:tab w:val="num" w:pos="1440"/>
+        </w:tabs>
+        <w:ind w:left="1440" w:hanging="360"/>
+      </w:pPr>
+      <w:rPr>
+        <w:rFonts w:ascii="Symbol" w:hAnsi="Symbol" w:hint="default"/>
+        <w:sz w:val="20"/>
+      </w:rPr>
+    </w:lvl>
+    <w:lvl w:ilvl="2" w:tentative="1">
+      <w:start w:val="1"/>
+      <w:numFmt w:val="bullet"/>
+      <w:lvlText w:val=""/>
+      <w:lvlJc w:val="left"/>
+      <w:pPr>
+        <w:tabs>
+          <w:tab w:val="num" w:pos="2160"/>
+        </w:tabs>
+        <w:ind w:left="2160" w:hanging="360"/>
+      </w:pPr>
+      <w:rPr>
+        <w:rFonts w:ascii="Symbol" w:hAnsi="Symbol" w:hint="default"/>
+        <w:sz w:val="20"/>
+      </w:rPr>
+    </w:lvl>
+    <w:lvl w:ilvl="3" w:tentative="1">
+      <w:start w:val="1"/>
+      <w:numFmt w:val="bullet"/>
+      <w:lvlText w:val=""/>
+      <w:lvlJc w:val="left"/>
+      <w:pPr>
+        <w:tabs>
+          <w:tab w:val="num" w:pos="2880"/>
+        </w:tabs>
+        <w:ind w:left="2880" w:hanging="360"/>
+      </w:pPr>
+      <w:rPr>
+        <w:rFonts w:ascii="Symbol" w:hAnsi="Symbol" w:hint="default"/>
+        <w:sz w:val="20"/>
+      </w:rPr>
+    </w:lvl>
+    <w:lvl w:ilvl="4" w:tentative="1">
+      <w:start w:val="1"/>
+      <w:numFmt w:val="bullet"/>
+      <w:lvlText w:val=""/>
+      <w:lvlJc w:val="left"/>
+      <w:pPr>
+        <w:tabs>
+          <w:tab w:val="num" w:pos="3600"/>
+        </w:tabs>
+        <w:ind w:left="3600" w:hanging="360"/>
+      </w:pPr>
+      <w:rPr>
+        <w:rFonts w:ascii="Symbol" w:hAnsi="Symbol" w:hint="default"/>
+        <w:sz w:val="20"/>
+      </w:rPr>
+    </w:lvl>
+    <w:lvl w:ilvl="5" w:tentative="1">
+      <w:start w:val="1"/>
+      <w:numFmt w:val="bullet"/>
+      <w:lvlText w:val=""/>
+      <w:lvlJc w:val="left"/>
+      <w:pPr>
+        <w:tabs>
+          <w:tab w:val="num" w:pos="4320"/>
+        </w:tabs>
+        <w:ind w:left="4320" w:hanging="360"/>
+      </w:pPr>
+      <w:rPr>
+        <w:rFonts w:ascii="Symbol" w:hAnsi="Symbol" w:hint="default"/>
+        <w:sz w:val="20"/>
+      </w:rPr>
+    </w:lvl>
+    <w:lvl w:ilvl="6" w:tentative="1">
+      <w:start w:val="1"/>
+      <w:numFmt w:val="bullet"/>
+      <w:lvlText w:val=""/>
+      <w:lvlJc w:val="left"/>
+      <w:pPr>
+        <w:tabs>
+          <w:tab w:val="num" w:pos="5040"/>
+        </w:tabs>
+        <w:ind w:left="5040" w:hanging="360"/>
+      </w:pPr>
+      <w:rPr>
+        <w:rFonts w:ascii="Symbol" w:hAnsi="Symbol" w:hint="default"/>
+        <w:sz w:val="20"/>
+      </w:rPr>
+    </w:lvl>
+    <w:lvl w:ilvl="7" w:tentative="1">
+      <w:start w:val="1"/>
+      <w:numFmt w:val="bullet"/>
+      <w:lvlText w:val=""/>
+      <w:lvlJc w:val="left"/>
+      <w:pPr>
+        <w:tabs>
+          <w:tab w:val="num" w:pos="5760"/>
+        </w:tabs>
+        <w:ind w:left="5760" w:hanging="360"/>
+      </w:pPr>
+      <w:rPr>
+        <w:rFonts w:ascii="Symbol" w:hAnsi="Symbol" w:hint="default"/>
+        <w:sz w:val="20"/>
+      </w:rPr>
+    </w:lvl>
+    <w:lvl w:ilvl="8" w:tentative="1">
+      <w:start w:val="1"/>
+      <w:numFmt w:val="bullet"/>
+      <w:lvlText w:val=""/>
+      <w:lvlJc w:val="left"/>
+      <w:pPr>
+        <w:tabs>
+          <w:tab w:val="num" w:pos="6480"/>
+        </w:tabs>
+        <w:ind w:left="6480" w:hanging="360"/>
+      </w:pPr>
+      <w:rPr>
+        <w:rFonts w:ascii="Symbol" w:hAnsi="Symbol" w:hint="default"/>
+        <w:sz w:val="20"/>
+      </w:rPr>
+    </w:lvl>
+  </w:abstractNum>
   <w:num w:numId="1" w16cid:durableId="1508207483">
     <w:abstractNumId w:val="0"/>
+  </w:num>
+  <w:num w:numId="2" w16cid:durableId="192158136">
+    <w:abstractNumId w:val="1"/>
   </w:num>
 </w:numbering>
 </file>
@@ -2677,6 +2552,7 @@
   <w:style w:type="character" w:default="1" w:styleId="DefaultParagraphFont">
     <w:name w:val="Default Paragraph Font"/>
     <w:uiPriority w:val="1"/>
+    <w:semiHidden/>
     <w:unhideWhenUsed/>
   </w:style>
   <w:style w:type="table" w:default="1" w:styleId="TableNormal">
@@ -2988,6 +2864,29 @@
       <w:smallCaps/>
       <w:color w:val="2F5496" w:themeColor="accent1" w:themeShade="BF"/>
       <w:spacing w:val="5"/>
+    </w:rPr>
+  </w:style>
+  <w:style w:type="character" w:styleId="Hyperlink">
+    <w:name w:val="Hyperlink"/>
+    <w:basedOn w:val="DefaultParagraphFont"/>
+    <w:uiPriority w:val="99"/>
+    <w:unhideWhenUsed/>
+    <w:rsid w:val="002301E7"/>
+    <w:rPr>
+      <w:color w:val="0563C1" w:themeColor="hyperlink"/>
+      <w:u w:val="single"/>
+    </w:rPr>
+  </w:style>
+  <w:style w:type="character" w:styleId="UnresolvedMention">
+    <w:name w:val="Unresolved Mention"/>
+    <w:basedOn w:val="DefaultParagraphFont"/>
+    <w:uiPriority w:val="99"/>
+    <w:semiHidden/>
+    <w:unhideWhenUsed/>
+    <w:rsid w:val="002301E7"/>
+    <w:rPr>
+      <w:color w:val="605E5C"/>
+      <w:shd w:val="clear" w:color="auto" w:fill="E1DFDD"/>
     </w:rPr>
   </w:style>
 </w:styles>

</xml_diff>

<commit_message>
fix pdf and csv download issue on export page
</commit_message>
<xml_diff>
--- a/Spendwise Important Points.docx
+++ b/Spendwise Important Points.docx
@@ -1665,6 +1665,73 @@
           <w:szCs w:val="28"/>
         </w:rPr>
       </w:pPr>
+      <w:r>
+        <w:rPr>
+          <w:rFonts w:ascii="Times New Roman" w:hAnsi="Times New Roman" w:cs="Times New Roman"/>
+          <w:sz w:val="28"/>
+          <w:szCs w:val="28"/>
+        </w:rPr>
+        <w:t>https://spendwise-web-zeta.vercel.app/</w:t>
+      </w:r>
+    </w:p>
+    <w:p>
+      <w:pPr>
+        <w:rPr>
+          <w:rFonts w:ascii="Times New Roman" w:hAnsi="Times New Roman" w:cs="Times New Roman"/>
+          <w:sz w:val="28"/>
+          <w:szCs w:val="28"/>
+        </w:rPr>
+      </w:pPr>
+    </w:p>
+    <w:p>
+      <w:pPr>
+        <w:rPr>
+          <w:rFonts w:ascii="Times New Roman" w:hAnsi="Times New Roman" w:cs="Times New Roman"/>
+          <w:sz w:val="28"/>
+          <w:szCs w:val="28"/>
+        </w:rPr>
+      </w:pPr>
+      <w:r>
+        <w:rPr>
+          <w:noProof/>
+        </w:rPr>
+        <w:lastRenderedPageBreak/>
+        <w:drawing>
+          <wp:inline distT="0" distB="0" distL="0" distR="0" wp14:anchorId="078080C6" wp14:editId="75CA0466">
+            <wp:extent cx="5943600" cy="3382645"/>
+            <wp:effectExtent l="0" t="0" r="0" b="8255"/>
+            <wp:docPr id="302582088" name="Picture 1"/>
+            <wp:cNvGraphicFramePr>
+              <a:graphicFrameLocks xmlns:a="http://schemas.openxmlformats.org/drawingml/2006/main" noChangeAspect="1"/>
+            </wp:cNvGraphicFramePr>
+            <a:graphic xmlns:a="http://schemas.openxmlformats.org/drawingml/2006/main">
+              <a:graphicData uri="http://schemas.openxmlformats.org/drawingml/2006/picture">
+                <pic:pic xmlns:pic="http://schemas.openxmlformats.org/drawingml/2006/picture">
+                  <pic:nvPicPr>
+                    <pic:cNvPr id="302582088" name=""/>
+                    <pic:cNvPicPr/>
+                  </pic:nvPicPr>
+                  <pic:blipFill>
+                    <a:blip r:embed="rId15"/>
+                    <a:stretch>
+                      <a:fillRect/>
+                    </a:stretch>
+                  </pic:blipFill>
+                  <pic:spPr>
+                    <a:xfrm>
+                      <a:off x="0" y="0"/>
+                      <a:ext cx="5943600" cy="3382645"/>
+                    </a:xfrm>
+                    <a:prstGeom prst="rect">
+                      <a:avLst/>
+                    </a:prstGeom>
+                  </pic:spPr>
+                </pic:pic>
+              </a:graphicData>
+            </a:graphic>
+          </wp:inline>
+        </w:drawing>
+      </w:r>
     </w:p>
     <w:sectPr>
       <w:pgSz w:w="12240" w:h="15840"/>

</xml_diff>

<commit_message>
add forgot password and reset password with SMTP email
</commit_message>
<xml_diff>
--- a/Spendwise Important Points.docx
+++ b/Spendwise Important Points.docx
@@ -16,7 +16,25 @@
           <w:sz w:val="28"/>
           <w:szCs w:val="28"/>
         </w:rPr>
-        <w:t xml:space="preserve">           Spendwise Important Points</w:t>
+        <w:t xml:space="preserve">           </w:t>
+      </w:r>
+      <w:proofErr w:type="spellStart"/>
+      <w:r>
+        <w:rPr>
+          <w:rFonts w:ascii="Times New Roman" w:hAnsi="Times New Roman" w:cs="Times New Roman"/>
+          <w:sz w:val="28"/>
+          <w:szCs w:val="28"/>
+        </w:rPr>
+        <w:t>Spendwise</w:t>
+      </w:r>
+      <w:proofErr w:type="spellEnd"/>
+      <w:r>
+        <w:rPr>
+          <w:rFonts w:ascii="Times New Roman" w:hAnsi="Times New Roman" w:cs="Times New Roman"/>
+          <w:sz w:val="28"/>
+          <w:szCs w:val="28"/>
+        </w:rPr>
+        <w:t xml:space="preserve"> Important Points</w:t>
       </w:r>
     </w:p>
     <w:p>
@@ -76,41 +94,95 @@
           <w:sz w:val="28"/>
           <w:szCs w:val="28"/>
         </w:rPr>
-        <w:t xml:space="preserve">  middleware.ts runs on the SERVER</w:t>
-      </w:r>
-    </w:p>
-    <w:p>
-      <w:pPr>
-        <w:rPr>
-          <w:rFonts w:ascii="Times New Roman" w:hAnsi="Times New Roman" w:cs="Times New Roman"/>
-          <w:sz w:val="28"/>
-          <w:szCs w:val="28"/>
-        </w:rPr>
-      </w:pPr>
-      <w:r>
-        <w:rPr>
-          <w:rFonts w:ascii="Times New Roman" w:hAnsi="Times New Roman" w:cs="Times New Roman"/>
-          <w:sz w:val="28"/>
-          <w:szCs w:val="28"/>
-        </w:rPr>
-        <w:t xml:space="preserve">  localStorage exists only in the BROWSER</w:t>
-      </w:r>
-    </w:p>
-    <w:p>
-      <w:pPr>
-        <w:rPr>
-          <w:rFonts w:ascii="Times New Roman" w:hAnsi="Times New Roman" w:cs="Times New Roman"/>
-          <w:sz w:val="28"/>
-          <w:szCs w:val="28"/>
-        </w:rPr>
-      </w:pPr>
-      <w:r>
-        <w:rPr>
-          <w:rFonts w:ascii="Times New Roman" w:hAnsi="Times New Roman" w:cs="Times New Roman"/>
-          <w:sz w:val="28"/>
-          <w:szCs w:val="28"/>
-        </w:rPr>
-        <w:t xml:space="preserve">  Server cannot read localStorage!</w:t>
+        <w:t xml:space="preserve">  </w:t>
+      </w:r>
+      <w:proofErr w:type="spellStart"/>
+      <w:r>
+        <w:rPr>
+          <w:rFonts w:ascii="Times New Roman" w:hAnsi="Times New Roman" w:cs="Times New Roman"/>
+          <w:sz w:val="28"/>
+          <w:szCs w:val="28"/>
+        </w:rPr>
+        <w:t>middleware.ts</w:t>
+      </w:r>
+      <w:proofErr w:type="spellEnd"/>
+      <w:r>
+        <w:rPr>
+          <w:rFonts w:ascii="Times New Roman" w:hAnsi="Times New Roman" w:cs="Times New Roman"/>
+          <w:sz w:val="28"/>
+          <w:szCs w:val="28"/>
+        </w:rPr>
+        <w:t xml:space="preserve"> runs on the SERVER</w:t>
+      </w:r>
+    </w:p>
+    <w:p>
+      <w:pPr>
+        <w:rPr>
+          <w:rFonts w:ascii="Times New Roman" w:hAnsi="Times New Roman" w:cs="Times New Roman"/>
+          <w:sz w:val="28"/>
+          <w:szCs w:val="28"/>
+        </w:rPr>
+      </w:pPr>
+      <w:r>
+        <w:rPr>
+          <w:rFonts w:ascii="Times New Roman" w:hAnsi="Times New Roman" w:cs="Times New Roman"/>
+          <w:sz w:val="28"/>
+          <w:szCs w:val="28"/>
+        </w:rPr>
+        <w:t xml:space="preserve">  </w:t>
+      </w:r>
+      <w:proofErr w:type="spellStart"/>
+      <w:r>
+        <w:rPr>
+          <w:rFonts w:ascii="Times New Roman" w:hAnsi="Times New Roman" w:cs="Times New Roman"/>
+          <w:sz w:val="28"/>
+          <w:szCs w:val="28"/>
+        </w:rPr>
+        <w:t>localStorage</w:t>
+      </w:r>
+      <w:proofErr w:type="spellEnd"/>
+      <w:r>
+        <w:rPr>
+          <w:rFonts w:ascii="Times New Roman" w:hAnsi="Times New Roman" w:cs="Times New Roman"/>
+          <w:sz w:val="28"/>
+          <w:szCs w:val="28"/>
+        </w:rPr>
+        <w:t xml:space="preserve"> exists only in the BROWSER</w:t>
+      </w:r>
+    </w:p>
+    <w:p>
+      <w:pPr>
+        <w:rPr>
+          <w:rFonts w:ascii="Times New Roman" w:hAnsi="Times New Roman" w:cs="Times New Roman"/>
+          <w:sz w:val="28"/>
+          <w:szCs w:val="28"/>
+        </w:rPr>
+      </w:pPr>
+      <w:r>
+        <w:rPr>
+          <w:rFonts w:ascii="Times New Roman" w:hAnsi="Times New Roman" w:cs="Times New Roman"/>
+          <w:sz w:val="28"/>
+          <w:szCs w:val="28"/>
+        </w:rPr>
+        <w:t xml:space="preserve">  Server cannot read </w:t>
+      </w:r>
+      <w:proofErr w:type="spellStart"/>
+      <w:r>
+        <w:rPr>
+          <w:rFonts w:ascii="Times New Roman" w:hAnsi="Times New Roman" w:cs="Times New Roman"/>
+          <w:sz w:val="28"/>
+          <w:szCs w:val="28"/>
+        </w:rPr>
+        <w:t>localStorage</w:t>
+      </w:r>
+      <w:proofErr w:type="spellEnd"/>
+      <w:r>
+        <w:rPr>
+          <w:rFonts w:ascii="Times New Roman" w:hAnsi="Times New Roman" w:cs="Times New Roman"/>
+          <w:sz w:val="28"/>
+          <w:szCs w:val="28"/>
+        </w:rPr>
+        <w:t>!</w:t>
       </w:r>
     </w:p>
     <w:p>
@@ -153,7 +225,25 @@
           <w:sz w:val="28"/>
           <w:szCs w:val="28"/>
         </w:rPr>
-        <w:t xml:space="preserve">  Save token in BOTH localStorage AND cookie</w:t>
+        <w:t xml:space="preserve">  Save token in BOTH </w:t>
+      </w:r>
+      <w:proofErr w:type="spellStart"/>
+      <w:r>
+        <w:rPr>
+          <w:rFonts w:ascii="Times New Roman" w:hAnsi="Times New Roman" w:cs="Times New Roman"/>
+          <w:sz w:val="28"/>
+          <w:szCs w:val="28"/>
+        </w:rPr>
+        <w:t>localStorage</w:t>
+      </w:r>
+      <w:proofErr w:type="spellEnd"/>
+      <w:r>
+        <w:rPr>
+          <w:rFonts w:ascii="Times New Roman" w:hAnsi="Times New Roman" w:cs="Times New Roman"/>
+          <w:sz w:val="28"/>
+          <w:szCs w:val="28"/>
+        </w:rPr>
+        <w:t xml:space="preserve"> AND cookie</w:t>
       </w:r>
     </w:p>
     <w:p>
@@ -247,7 +337,35 @@
           <w:sz w:val="28"/>
           <w:szCs w:val="28"/>
         </w:rPr>
-        <w:t>Save token to localStorage  ← for browser JS (Axios interceptor)</w:t>
+        <w:t xml:space="preserve">Save token to </w:t>
+      </w:r>
+      <w:proofErr w:type="spellStart"/>
+      <w:proofErr w:type="gramStart"/>
+      <w:r>
+        <w:rPr>
+          <w:rFonts w:ascii="Times New Roman" w:hAnsi="Times New Roman" w:cs="Times New Roman"/>
+          <w:sz w:val="28"/>
+          <w:szCs w:val="28"/>
+        </w:rPr>
+        <w:t>localStorage</w:t>
+      </w:r>
+      <w:proofErr w:type="spellEnd"/>
+      <w:r>
+        <w:rPr>
+          <w:rFonts w:ascii="Times New Roman" w:hAnsi="Times New Roman" w:cs="Times New Roman"/>
+          <w:sz w:val="28"/>
+          <w:szCs w:val="28"/>
+        </w:rPr>
+        <w:t xml:space="preserve">  ←</w:t>
+      </w:r>
+      <w:proofErr w:type="gramEnd"/>
+      <w:r>
+        <w:rPr>
+          <w:rFonts w:ascii="Times New Roman" w:hAnsi="Times New Roman" w:cs="Times New Roman"/>
+          <w:sz w:val="28"/>
+          <w:szCs w:val="28"/>
+        </w:rPr>
+        <w:t xml:space="preserve"> for browser JS (Axios interceptor)</w:t>
       </w:r>
     </w:p>
     <w:p>
@@ -326,13 +444,23 @@
           <w:szCs w:val="28"/>
         </w:rPr>
       </w:pPr>
-      <w:r>
-        <w:rPr>
-          <w:rFonts w:ascii="Times New Roman" w:hAnsi="Times New Roman" w:cs="Times New Roman"/>
-          <w:sz w:val="28"/>
-          <w:szCs w:val="28"/>
-        </w:rPr>
-        <w:t>middleware.ts runs on server</w:t>
+      <w:proofErr w:type="spellStart"/>
+      <w:r>
+        <w:rPr>
+          <w:rFonts w:ascii="Times New Roman" w:hAnsi="Times New Roman" w:cs="Times New Roman"/>
+          <w:sz w:val="28"/>
+          <w:szCs w:val="28"/>
+        </w:rPr>
+        <w:t>middleware.ts</w:t>
+      </w:r>
+      <w:proofErr w:type="spellEnd"/>
+      <w:r>
+        <w:rPr>
+          <w:rFonts w:ascii="Times New Roman" w:hAnsi="Times New Roman" w:cs="Times New Roman"/>
+          <w:sz w:val="28"/>
+          <w:szCs w:val="28"/>
+        </w:rPr>
+        <w:t xml:space="preserve"> runs on server</w:t>
       </w:r>
     </w:p>
     <w:p>
@@ -414,7 +542,43 @@
           <w:sz w:val="28"/>
           <w:szCs w:val="28"/>
         </w:rPr>
-        <w:t>We already wrote the cookie helpers in useAuthStore.ts. But let me make sure they are correctly implemented. Open apps/web/store/useAuthStore.ts and verify these two helper functions exist at the top:</w:t>
+        <w:t xml:space="preserve">We already wrote the cookie helpers in </w:t>
+      </w:r>
+      <w:proofErr w:type="spellStart"/>
+      <w:r>
+        <w:rPr>
+          <w:rFonts w:ascii="Times New Roman" w:hAnsi="Times New Roman" w:cs="Times New Roman"/>
+          <w:sz w:val="28"/>
+          <w:szCs w:val="28"/>
+        </w:rPr>
+        <w:t>useAuthStore.ts</w:t>
+      </w:r>
+      <w:proofErr w:type="spellEnd"/>
+      <w:r>
+        <w:rPr>
+          <w:rFonts w:ascii="Times New Roman" w:hAnsi="Times New Roman" w:cs="Times New Roman"/>
+          <w:sz w:val="28"/>
+          <w:szCs w:val="28"/>
+        </w:rPr>
+        <w:t>. But let me make sure they are correctly implemented. Open apps/web/store/</w:t>
+      </w:r>
+      <w:proofErr w:type="spellStart"/>
+      <w:r>
+        <w:rPr>
+          <w:rFonts w:ascii="Times New Roman" w:hAnsi="Times New Roman" w:cs="Times New Roman"/>
+          <w:sz w:val="28"/>
+          <w:szCs w:val="28"/>
+        </w:rPr>
+        <w:t>useAuthStore.ts</w:t>
+      </w:r>
+      <w:proofErr w:type="spellEnd"/>
+      <w:r>
+        <w:rPr>
+          <w:rFonts w:ascii="Times New Roman" w:hAnsi="Times New Roman" w:cs="Times New Roman"/>
+          <w:sz w:val="28"/>
+          <w:szCs w:val="28"/>
+        </w:rPr>
+        <w:t xml:space="preserve"> and verify these two helper functions exist at the top:</w:t>
       </w:r>
     </w:p>
     <w:p>
@@ -459,47 +623,141 @@
           <w:szCs w:val="28"/>
         </w:rPr>
       </w:pPr>
-      <w:r>
-        <w:rPr>
-          <w:rFonts w:ascii="Times New Roman" w:hAnsi="Times New Roman" w:cs="Times New Roman"/>
-          <w:sz w:val="28"/>
-          <w:szCs w:val="28"/>
-        </w:rPr>
-        <w:t xml:space="preserve">│  localStorage['spendwise_token'] = "eyJ..."     </w:t>
-      </w:r>
-    </w:p>
-    <w:p>
-      <w:pPr>
-        <w:rPr>
-          <w:rFonts w:ascii="Times New Roman" w:hAnsi="Times New Roman" w:cs="Times New Roman"/>
-          <w:sz w:val="28"/>
-          <w:szCs w:val="28"/>
-        </w:rPr>
-      </w:pPr>
-      <w:r>
-        <w:rPr>
-          <w:rFonts w:ascii="Times New Roman" w:hAnsi="Times New Roman" w:cs="Times New Roman"/>
-          <w:sz w:val="28"/>
-          <w:szCs w:val="28"/>
-        </w:rPr>
-        <w:t xml:space="preserve">│  → Used by: Axios interceptor (api.ts)          </w:t>
-      </w:r>
-    </w:p>
-    <w:p>
-      <w:pPr>
-        <w:rPr>
-          <w:rFonts w:ascii="Times New Roman" w:hAnsi="Times New Roman" w:cs="Times New Roman"/>
-          <w:sz w:val="28"/>
-          <w:szCs w:val="28"/>
-        </w:rPr>
-      </w:pPr>
-      <w:r>
-        <w:rPr>
-          <w:rFonts w:ascii="Times New Roman" w:hAnsi="Times New Roman" w:cs="Times New Roman"/>
-          <w:sz w:val="28"/>
-          <w:szCs w:val="28"/>
-        </w:rPr>
-        <w:t xml:space="preserve">│  → Attaches to every API request automatically  </w:t>
+      <w:proofErr w:type="gramStart"/>
+      <w:r>
+        <w:rPr>
+          <w:rFonts w:ascii="Times New Roman" w:hAnsi="Times New Roman" w:cs="Times New Roman"/>
+          <w:sz w:val="28"/>
+          <w:szCs w:val="28"/>
+        </w:rPr>
+        <w:t xml:space="preserve">│  </w:t>
+      </w:r>
+      <w:proofErr w:type="spellStart"/>
+      <w:r>
+        <w:rPr>
+          <w:rFonts w:ascii="Times New Roman" w:hAnsi="Times New Roman" w:cs="Times New Roman"/>
+          <w:sz w:val="28"/>
+          <w:szCs w:val="28"/>
+        </w:rPr>
+        <w:t>localStorage</w:t>
+      </w:r>
+      <w:proofErr w:type="spellEnd"/>
+      <w:proofErr w:type="gramEnd"/>
+      <w:r>
+        <w:rPr>
+          <w:rFonts w:ascii="Times New Roman" w:hAnsi="Times New Roman" w:cs="Times New Roman"/>
+          <w:sz w:val="28"/>
+          <w:szCs w:val="28"/>
+        </w:rPr>
+        <w:t>['</w:t>
+      </w:r>
+      <w:proofErr w:type="spellStart"/>
+      <w:r>
+        <w:rPr>
+          <w:rFonts w:ascii="Times New Roman" w:hAnsi="Times New Roman" w:cs="Times New Roman"/>
+          <w:sz w:val="28"/>
+          <w:szCs w:val="28"/>
+        </w:rPr>
+        <w:t>spendwise_token</w:t>
+      </w:r>
+      <w:proofErr w:type="spellEnd"/>
+      <w:r>
+        <w:rPr>
+          <w:rFonts w:ascii="Times New Roman" w:hAnsi="Times New Roman" w:cs="Times New Roman"/>
+          <w:sz w:val="28"/>
+          <w:szCs w:val="28"/>
+        </w:rPr>
+        <w:t>'] = "</w:t>
+      </w:r>
+      <w:proofErr w:type="spellStart"/>
+      <w:r>
+        <w:rPr>
+          <w:rFonts w:ascii="Times New Roman" w:hAnsi="Times New Roman" w:cs="Times New Roman"/>
+          <w:sz w:val="28"/>
+          <w:szCs w:val="28"/>
+        </w:rPr>
+        <w:t>eyJ</w:t>
+      </w:r>
+      <w:proofErr w:type="spellEnd"/>
+      <w:r>
+        <w:rPr>
+          <w:rFonts w:ascii="Times New Roman" w:hAnsi="Times New Roman" w:cs="Times New Roman"/>
+          <w:sz w:val="28"/>
+          <w:szCs w:val="28"/>
+        </w:rPr>
+        <w:t xml:space="preserve">..."     </w:t>
+      </w:r>
+    </w:p>
+    <w:p>
+      <w:pPr>
+        <w:rPr>
+          <w:rFonts w:ascii="Times New Roman" w:hAnsi="Times New Roman" w:cs="Times New Roman"/>
+          <w:sz w:val="28"/>
+          <w:szCs w:val="28"/>
+        </w:rPr>
+      </w:pPr>
+      <w:proofErr w:type="gramStart"/>
+      <w:r>
+        <w:rPr>
+          <w:rFonts w:ascii="Times New Roman" w:hAnsi="Times New Roman" w:cs="Times New Roman"/>
+          <w:sz w:val="28"/>
+          <w:szCs w:val="28"/>
+        </w:rPr>
+        <w:t>│  →</w:t>
+      </w:r>
+      <w:proofErr w:type="gramEnd"/>
+      <w:r>
+        <w:rPr>
+          <w:rFonts w:ascii="Times New Roman" w:hAnsi="Times New Roman" w:cs="Times New Roman"/>
+          <w:sz w:val="28"/>
+          <w:szCs w:val="28"/>
+        </w:rPr>
+        <w:t xml:space="preserve"> Used by: Axios interceptor (</w:t>
+      </w:r>
+      <w:proofErr w:type="spellStart"/>
+      <w:r>
+        <w:rPr>
+          <w:rFonts w:ascii="Times New Roman" w:hAnsi="Times New Roman" w:cs="Times New Roman"/>
+          <w:sz w:val="28"/>
+          <w:szCs w:val="28"/>
+        </w:rPr>
+        <w:t>api.ts</w:t>
+      </w:r>
+      <w:proofErr w:type="spellEnd"/>
+      <w:r>
+        <w:rPr>
+          <w:rFonts w:ascii="Times New Roman" w:hAnsi="Times New Roman" w:cs="Times New Roman"/>
+          <w:sz w:val="28"/>
+          <w:szCs w:val="28"/>
+        </w:rPr>
+        <w:t xml:space="preserve">)          </w:t>
+      </w:r>
+    </w:p>
+    <w:p>
+      <w:pPr>
+        <w:rPr>
+          <w:rFonts w:ascii="Times New Roman" w:hAnsi="Times New Roman" w:cs="Times New Roman"/>
+          <w:sz w:val="28"/>
+          <w:szCs w:val="28"/>
+        </w:rPr>
+      </w:pPr>
+      <w:proofErr w:type="gramStart"/>
+      <w:r>
+        <w:rPr>
+          <w:rFonts w:ascii="Times New Roman" w:hAnsi="Times New Roman" w:cs="Times New Roman"/>
+          <w:sz w:val="28"/>
+          <w:szCs w:val="28"/>
+        </w:rPr>
+        <w:t>│  →</w:t>
+      </w:r>
+      <w:proofErr w:type="gramEnd"/>
+      <w:r>
+        <w:rPr>
+          <w:rFonts w:ascii="Times New Roman" w:hAnsi="Times New Roman" w:cs="Times New Roman"/>
+          <w:sz w:val="28"/>
+          <w:szCs w:val="28"/>
+        </w:rPr>
+        <w:t xml:space="preserve"> Attaches to every API request automatically  </w:t>
       </w:r>
     </w:p>
     <w:p>
@@ -553,47 +811,131 @@
           <w:szCs w:val="28"/>
         </w:rPr>
       </w:pPr>
-      <w:r>
-        <w:rPr>
-          <w:rFonts w:ascii="Times New Roman" w:hAnsi="Times New Roman" w:cs="Times New Roman"/>
-          <w:sz w:val="28"/>
-          <w:szCs w:val="28"/>
-        </w:rPr>
-        <w:t xml:space="preserve">│  Cookie['spendwise_token'] = "eyJ..."           </w:t>
-      </w:r>
-    </w:p>
-    <w:p>
-      <w:pPr>
-        <w:rPr>
-          <w:rFonts w:ascii="Times New Roman" w:hAnsi="Times New Roman" w:cs="Times New Roman"/>
-          <w:sz w:val="28"/>
-          <w:szCs w:val="28"/>
-        </w:rPr>
-      </w:pPr>
-      <w:r>
-        <w:rPr>
-          <w:rFonts w:ascii="Times New Roman" w:hAnsi="Times New Roman" w:cs="Times New Roman"/>
-          <w:sz w:val="28"/>
-          <w:szCs w:val="28"/>
-        </w:rPr>
-        <w:t xml:space="preserve">│  → Used by: middleware.ts                       </w:t>
-      </w:r>
-    </w:p>
-    <w:p>
-      <w:pPr>
-        <w:rPr>
-          <w:rFonts w:ascii="Times New Roman" w:hAnsi="Times New Roman" w:cs="Times New Roman"/>
-          <w:sz w:val="28"/>
-          <w:szCs w:val="28"/>
-        </w:rPr>
-      </w:pPr>
-      <w:r>
-        <w:rPr>
-          <w:rFonts w:ascii="Times New Roman" w:hAnsi="Times New Roman" w:cs="Times New Roman"/>
-          <w:sz w:val="28"/>
-          <w:szCs w:val="28"/>
-        </w:rPr>
-        <w:t xml:space="preserve">│  → Protects /dashboard, /expenses etc.          </w:t>
+      <w:proofErr w:type="gramStart"/>
+      <w:r>
+        <w:rPr>
+          <w:rFonts w:ascii="Times New Roman" w:hAnsi="Times New Roman" w:cs="Times New Roman"/>
+          <w:sz w:val="28"/>
+          <w:szCs w:val="28"/>
+        </w:rPr>
+        <w:t>│  Cookie</w:t>
+      </w:r>
+      <w:proofErr w:type="gramEnd"/>
+      <w:r>
+        <w:rPr>
+          <w:rFonts w:ascii="Times New Roman" w:hAnsi="Times New Roman" w:cs="Times New Roman"/>
+          <w:sz w:val="28"/>
+          <w:szCs w:val="28"/>
+        </w:rPr>
+        <w:t>['</w:t>
+      </w:r>
+      <w:proofErr w:type="spellStart"/>
+      <w:r>
+        <w:rPr>
+          <w:rFonts w:ascii="Times New Roman" w:hAnsi="Times New Roman" w:cs="Times New Roman"/>
+          <w:sz w:val="28"/>
+          <w:szCs w:val="28"/>
+        </w:rPr>
+        <w:t>spendwise_token</w:t>
+      </w:r>
+      <w:proofErr w:type="spellEnd"/>
+      <w:r>
+        <w:rPr>
+          <w:rFonts w:ascii="Times New Roman" w:hAnsi="Times New Roman" w:cs="Times New Roman"/>
+          <w:sz w:val="28"/>
+          <w:szCs w:val="28"/>
+        </w:rPr>
+        <w:t>'] = "</w:t>
+      </w:r>
+      <w:proofErr w:type="spellStart"/>
+      <w:r>
+        <w:rPr>
+          <w:rFonts w:ascii="Times New Roman" w:hAnsi="Times New Roman" w:cs="Times New Roman"/>
+          <w:sz w:val="28"/>
+          <w:szCs w:val="28"/>
+        </w:rPr>
+        <w:t>eyJ</w:t>
+      </w:r>
+      <w:proofErr w:type="spellEnd"/>
+      <w:r>
+        <w:rPr>
+          <w:rFonts w:ascii="Times New Roman" w:hAnsi="Times New Roman" w:cs="Times New Roman"/>
+          <w:sz w:val="28"/>
+          <w:szCs w:val="28"/>
+        </w:rPr>
+        <w:t xml:space="preserve">..."           </w:t>
+      </w:r>
+    </w:p>
+    <w:p>
+      <w:pPr>
+        <w:rPr>
+          <w:rFonts w:ascii="Times New Roman" w:hAnsi="Times New Roman" w:cs="Times New Roman"/>
+          <w:sz w:val="28"/>
+          <w:szCs w:val="28"/>
+        </w:rPr>
+      </w:pPr>
+      <w:proofErr w:type="gramStart"/>
+      <w:r>
+        <w:rPr>
+          <w:rFonts w:ascii="Times New Roman" w:hAnsi="Times New Roman" w:cs="Times New Roman"/>
+          <w:sz w:val="28"/>
+          <w:szCs w:val="28"/>
+        </w:rPr>
+        <w:t>│  →</w:t>
+      </w:r>
+      <w:proofErr w:type="gramEnd"/>
+      <w:r>
+        <w:rPr>
+          <w:rFonts w:ascii="Times New Roman" w:hAnsi="Times New Roman" w:cs="Times New Roman"/>
+          <w:sz w:val="28"/>
+          <w:szCs w:val="28"/>
+        </w:rPr>
+        <w:t xml:space="preserve"> Used by: </w:t>
+      </w:r>
+      <w:proofErr w:type="spellStart"/>
+      <w:r>
+        <w:rPr>
+          <w:rFonts w:ascii="Times New Roman" w:hAnsi="Times New Roman" w:cs="Times New Roman"/>
+          <w:sz w:val="28"/>
+          <w:szCs w:val="28"/>
+        </w:rPr>
+        <w:t>middleware.ts</w:t>
+      </w:r>
+      <w:proofErr w:type="spellEnd"/>
+      <w:r>
+        <w:rPr>
+          <w:rFonts w:ascii="Times New Roman" w:hAnsi="Times New Roman" w:cs="Times New Roman"/>
+          <w:sz w:val="28"/>
+          <w:szCs w:val="28"/>
+        </w:rPr>
+        <w:t xml:space="preserve">                       </w:t>
+      </w:r>
+    </w:p>
+    <w:p>
+      <w:pPr>
+        <w:rPr>
+          <w:rFonts w:ascii="Times New Roman" w:hAnsi="Times New Roman" w:cs="Times New Roman"/>
+          <w:sz w:val="28"/>
+          <w:szCs w:val="28"/>
+        </w:rPr>
+      </w:pPr>
+      <w:proofErr w:type="gramStart"/>
+      <w:r>
+        <w:rPr>
+          <w:rFonts w:ascii="Times New Roman" w:hAnsi="Times New Roman" w:cs="Times New Roman"/>
+          <w:sz w:val="28"/>
+          <w:szCs w:val="28"/>
+        </w:rPr>
+        <w:t>│  →</w:t>
+      </w:r>
+      <w:proofErr w:type="gramEnd"/>
+      <w:r>
+        <w:rPr>
+          <w:rFonts w:ascii="Times New Roman" w:hAnsi="Times New Roman" w:cs="Times New Roman"/>
+          <w:sz w:val="28"/>
+          <w:szCs w:val="28"/>
+        </w:rPr>
+        <w:t xml:space="preserve"> Protects /dashboard, /expenses etc.          </w:t>
       </w:r>
     </w:p>
     <w:p>
@@ -766,13 +1108,23 @@
         </w:rPr>
         <w:t xml:space="preserve">Gemini API Key = </w:t>
       </w:r>
-      <w:r>
-        <w:rPr>
-          <w:rFonts w:ascii="Times New Roman" w:hAnsi="Times New Roman" w:cs="Times New Roman"/>
-          <w:sz w:val="28"/>
-          <w:szCs w:val="28"/>
-        </w:rPr>
-        <w:t>AQ.Ab8RN6JtLpHr-X399xMdltMeKN98-xivIbtH6waSS6Jb4CRDzA</w:t>
+      <w:proofErr w:type="gramStart"/>
+      <w:r>
+        <w:rPr>
+          <w:rFonts w:ascii="Times New Roman" w:hAnsi="Times New Roman" w:cs="Times New Roman"/>
+          <w:sz w:val="28"/>
+          <w:szCs w:val="28"/>
+        </w:rPr>
+        <w:t>AQ.Ab</w:t>
+      </w:r>
+      <w:proofErr w:type="gramEnd"/>
+      <w:r>
+        <w:rPr>
+          <w:rFonts w:ascii="Times New Roman" w:hAnsi="Times New Roman" w:cs="Times New Roman"/>
+          <w:sz w:val="28"/>
+          <w:szCs w:val="28"/>
+        </w:rPr>
+        <w:t>8RN6JtLpHr-X399xMdltMeKN98-xivIbtH6waSS6Jb4CRDzA</w:t>
       </w:r>
     </w:p>
     <w:p>
@@ -809,7 +1161,27 @@
           <w:sz w:val="28"/>
           <w:szCs w:val="28"/>
         </w:rPr>
-        <w:t>Claude api key= ‘sk-9fb5a0dea035427c9f362adcf1ed5187’</w:t>
+        <w:t xml:space="preserve">Claude </w:t>
+      </w:r>
+      <w:proofErr w:type="spellStart"/>
+      <w:r>
+        <w:rPr>
+          <w:rFonts w:ascii="Times New Roman" w:hAnsi="Times New Roman" w:cs="Times New Roman"/>
+          <w:color w:val="00B0F0"/>
+          <w:sz w:val="28"/>
+          <w:szCs w:val="28"/>
+        </w:rPr>
+        <w:t>api</w:t>
+      </w:r>
+      <w:proofErr w:type="spellEnd"/>
+      <w:r>
+        <w:rPr>
+          <w:rFonts w:ascii="Times New Roman" w:hAnsi="Times New Roman" w:cs="Times New Roman"/>
+          <w:color w:val="00B0F0"/>
+          <w:sz w:val="28"/>
+          <w:szCs w:val="28"/>
+        </w:rPr>
+        <w:t xml:space="preserve"> key= ‘sk-9fb5a0dea035427c9f362adcf1ed5187’</w:t>
       </w:r>
     </w:p>
     <w:p>
@@ -969,7 +1341,25 @@
           <w:sz w:val="28"/>
           <w:szCs w:val="28"/>
         </w:rPr>
-        <w:t xml:space="preserve">    Run all test cases: npm run test</w:t>
+        <w:t xml:space="preserve">    Run all test cases: </w:t>
+      </w:r>
+      <w:proofErr w:type="spellStart"/>
+      <w:r>
+        <w:rPr>
+          <w:rFonts w:ascii="Times New Roman" w:hAnsi="Times New Roman" w:cs="Times New Roman"/>
+          <w:sz w:val="28"/>
+          <w:szCs w:val="28"/>
+        </w:rPr>
+        <w:t>npm</w:t>
+      </w:r>
+      <w:proofErr w:type="spellEnd"/>
+      <w:r>
+        <w:rPr>
+          <w:rFonts w:ascii="Times New Roman" w:hAnsi="Times New Roman" w:cs="Times New Roman"/>
+          <w:sz w:val="28"/>
+          <w:szCs w:val="28"/>
+        </w:rPr>
+        <w:t xml:space="preserve"> run test</w:t>
       </w:r>
     </w:p>
     <w:p>
@@ -1021,6 +1411,7 @@
         </w:rPr>
         <w:t xml:space="preserve">              </w:t>
       </w:r>
+      <w:proofErr w:type="spellStart"/>
       <w:r>
         <w:rPr>
           <w:rFonts w:ascii="Times New Roman" w:hAnsi="Times New Roman" w:cs="Times New Roman"/>
@@ -1035,8 +1426,29 @@
           <w:sz w:val="28"/>
           <w:szCs w:val="28"/>
         </w:rPr>
-        <w:t>pm run test:coverage</w:t>
-      </w:r>
+        <w:t>pm</w:t>
+      </w:r>
+      <w:proofErr w:type="spellEnd"/>
+      <w:r>
+        <w:rPr>
+          <w:rFonts w:ascii="Times New Roman" w:hAnsi="Times New Roman" w:cs="Times New Roman"/>
+          <w:sz w:val="28"/>
+          <w:szCs w:val="28"/>
+        </w:rPr>
+        <w:t xml:space="preserve"> run </w:t>
+      </w:r>
+      <w:proofErr w:type="spellStart"/>
+      <w:proofErr w:type="gramStart"/>
+      <w:r>
+        <w:rPr>
+          <w:rFonts w:ascii="Times New Roman" w:hAnsi="Times New Roman" w:cs="Times New Roman"/>
+          <w:sz w:val="28"/>
+          <w:szCs w:val="28"/>
+        </w:rPr>
+        <w:t>test:coverage</w:t>
+      </w:r>
+      <w:proofErr w:type="spellEnd"/>
+      <w:proofErr w:type="gramEnd"/>
     </w:p>
     <w:p>
       <w:pPr>
@@ -1147,17 +1559,9 @@
           <w:sz w:val="28"/>
           <w:szCs w:val="28"/>
         </w:rPr>
-        <w:t>in Dockerfile</w:t>
-      </w:r>
-    </w:p>
-    <w:p>
-      <w:pPr>
-        <w:rPr>
-          <w:rFonts w:ascii="Times New Roman" w:hAnsi="Times New Roman" w:cs="Times New Roman"/>
-          <w:sz w:val="28"/>
-          <w:szCs w:val="28"/>
-        </w:rPr>
-      </w:pPr>
+        <w:t xml:space="preserve">in </w:t>
+      </w:r>
+      <w:proofErr w:type="spellStart"/>
       <w:r>
         <w:rPr>
           <w:rFonts w:ascii="Times New Roman" w:hAnsi="Times New Roman" w:cs="Times New Roman"/>
@@ -1166,59 +1570,9 @@
           <w:sz w:val="28"/>
           <w:szCs w:val="28"/>
         </w:rPr>
-        <w:t>multi-stage builds:</w:t>
-      </w:r>
-      <w:r>
-        <w:rPr>
-          <w:rFonts w:ascii="Times New Roman" w:hAnsi="Times New Roman" w:cs="Times New Roman"/>
-          <w:sz w:val="28"/>
-          <w:szCs w:val="28"/>
-        </w:rPr>
-        <w:t xml:space="preserve"> </w:t>
-      </w:r>
-    </w:p>
-    <w:p>
-      <w:pPr>
-        <w:rPr>
-          <w:rFonts w:ascii="Times New Roman" w:hAnsi="Times New Roman" w:cs="Times New Roman"/>
-          <w:sz w:val="28"/>
-          <w:szCs w:val="28"/>
-        </w:rPr>
-      </w:pPr>
-      <w:r>
-        <w:rPr>
-          <w:rFonts w:ascii="Times New Roman" w:hAnsi="Times New Roman" w:cs="Times New Roman"/>
-          <w:sz w:val="28"/>
-          <w:szCs w:val="28"/>
-        </w:rPr>
-        <w:t xml:space="preserve">Stage 1 has everything needed to BUILD the app (TypeScript compiler, all packages). </w:t>
-      </w:r>
-    </w:p>
-    <w:p>
-      <w:pPr>
-        <w:rPr>
-          <w:rFonts w:ascii="Times New Roman" w:hAnsi="Times New Roman" w:cs="Times New Roman"/>
-          <w:sz w:val="28"/>
-          <w:szCs w:val="28"/>
-        </w:rPr>
-      </w:pPr>
-      <w:r>
-        <w:rPr>
-          <w:rFonts w:ascii="Times New Roman" w:hAnsi="Times New Roman" w:cs="Times New Roman"/>
-          <w:sz w:val="28"/>
-          <w:szCs w:val="28"/>
-        </w:rPr>
-        <w:t>Stage 2 only copies the final compiled result. This is exactly how professional companies ship Node.js apps — smaller image, faster deploys, fewer security vulnerabilities since dev tools aren't shipped.</w:t>
-      </w:r>
-    </w:p>
-    <w:p>
-      <w:pPr>
-        <w:rPr>
-          <w:rFonts w:ascii="Times New Roman" w:hAnsi="Times New Roman" w:cs="Times New Roman"/>
-          <w:sz w:val="28"/>
-          <w:szCs w:val="28"/>
-        </w:rPr>
-      </w:pPr>
+        <w:t>Dockerfile</w:t>
+      </w:r>
+      <w:proofErr w:type="spellEnd"/>
     </w:p>
     <w:p>
       <w:pPr>
@@ -1236,25 +1590,69 @@
           <w:sz w:val="28"/>
           <w:szCs w:val="28"/>
         </w:rPr>
-        <w:lastRenderedPageBreak/>
-        <w:t xml:space="preserve">Dockerfile = </w:t>
-      </w:r>
-      <w:r>
-        <w:rPr>
-          <w:rFonts w:ascii="Times New Roman" w:hAnsi="Times New Roman" w:cs="Times New Roman"/>
-          <w:sz w:val="28"/>
-          <w:szCs w:val="28"/>
-        </w:rPr>
-        <w:t>tells Docker how to build ONE container.</w:t>
-      </w:r>
-      <w:r>
-        <w:rPr>
-          <w:rFonts w:ascii="Times New Roman" w:hAnsi="Times New Roman" w:cs="Times New Roman"/>
-          <w:sz w:val="28"/>
-          <w:szCs w:val="28"/>
-        </w:rPr>
-        <w:br/>
-      </w:r>
+        <w:t>multi-stage builds:</w:t>
+      </w:r>
+      <w:r>
+        <w:rPr>
+          <w:rFonts w:ascii="Times New Roman" w:hAnsi="Times New Roman" w:cs="Times New Roman"/>
+          <w:sz w:val="28"/>
+          <w:szCs w:val="28"/>
+        </w:rPr>
+        <w:t xml:space="preserve"> </w:t>
+      </w:r>
+    </w:p>
+    <w:p>
+      <w:pPr>
+        <w:rPr>
+          <w:rFonts w:ascii="Times New Roman" w:hAnsi="Times New Roman" w:cs="Times New Roman"/>
+          <w:sz w:val="28"/>
+          <w:szCs w:val="28"/>
+        </w:rPr>
+      </w:pPr>
+      <w:r>
+        <w:rPr>
+          <w:rFonts w:ascii="Times New Roman" w:hAnsi="Times New Roman" w:cs="Times New Roman"/>
+          <w:sz w:val="28"/>
+          <w:szCs w:val="28"/>
+        </w:rPr>
+        <w:t xml:space="preserve">Stage 1 has everything needed to BUILD the app (TypeScript compiler, all packages). </w:t>
+      </w:r>
+    </w:p>
+    <w:p>
+      <w:pPr>
+        <w:rPr>
+          <w:rFonts w:ascii="Times New Roman" w:hAnsi="Times New Roman" w:cs="Times New Roman"/>
+          <w:sz w:val="28"/>
+          <w:szCs w:val="28"/>
+        </w:rPr>
+      </w:pPr>
+      <w:r>
+        <w:rPr>
+          <w:rFonts w:ascii="Times New Roman" w:hAnsi="Times New Roman" w:cs="Times New Roman"/>
+          <w:sz w:val="28"/>
+          <w:szCs w:val="28"/>
+        </w:rPr>
+        <w:t>Stage 2 only copies the final compiled result. This is exactly how professional companies ship Node.js apps — smaller image, faster deploys, fewer security vulnerabilities since dev tools aren't shipped.</w:t>
+      </w:r>
+    </w:p>
+    <w:p>
+      <w:pPr>
+        <w:rPr>
+          <w:rFonts w:ascii="Times New Roman" w:hAnsi="Times New Roman" w:cs="Times New Roman"/>
+          <w:sz w:val="28"/>
+          <w:szCs w:val="28"/>
+        </w:rPr>
+      </w:pPr>
+    </w:p>
+    <w:p>
+      <w:pPr>
+        <w:rPr>
+          <w:rFonts w:ascii="Times New Roman" w:hAnsi="Times New Roman" w:cs="Times New Roman"/>
+          <w:sz w:val="28"/>
+          <w:szCs w:val="28"/>
+        </w:rPr>
+      </w:pPr>
+      <w:proofErr w:type="spellStart"/>
       <w:r>
         <w:rPr>
           <w:rFonts w:ascii="Times New Roman" w:hAnsi="Times New Roman" w:cs="Times New Roman"/>
@@ -1263,7 +1661,67 @@
           <w:sz w:val="28"/>
           <w:szCs w:val="28"/>
         </w:rPr>
-        <w:t xml:space="preserve">docker-compose.yml = </w:t>
+        <w:lastRenderedPageBreak/>
+        <w:t>Dockerfile</w:t>
+      </w:r>
+      <w:proofErr w:type="spellEnd"/>
+      <w:r>
+        <w:rPr>
+          <w:rFonts w:ascii="Times New Roman" w:hAnsi="Times New Roman" w:cs="Times New Roman"/>
+          <w:b/>
+          <w:bCs/>
+          <w:sz w:val="28"/>
+          <w:szCs w:val="28"/>
+        </w:rPr>
+        <w:t xml:space="preserve"> = </w:t>
+      </w:r>
+      <w:r>
+        <w:rPr>
+          <w:rFonts w:ascii="Times New Roman" w:hAnsi="Times New Roman" w:cs="Times New Roman"/>
+          <w:sz w:val="28"/>
+          <w:szCs w:val="28"/>
+        </w:rPr>
+        <w:t>tells Docker how to build ONE container.</w:t>
+      </w:r>
+      <w:r>
+        <w:rPr>
+          <w:rFonts w:ascii="Times New Roman" w:hAnsi="Times New Roman" w:cs="Times New Roman"/>
+          <w:sz w:val="28"/>
+          <w:szCs w:val="28"/>
+        </w:rPr>
+        <w:br/>
+      </w:r>
+      <w:r>
+        <w:rPr>
+          <w:rFonts w:ascii="Times New Roman" w:hAnsi="Times New Roman" w:cs="Times New Roman"/>
+          <w:b/>
+          <w:bCs/>
+          <w:sz w:val="28"/>
+          <w:szCs w:val="28"/>
+        </w:rPr>
+        <w:t>docker-</w:t>
+      </w:r>
+      <w:proofErr w:type="spellStart"/>
+      <w:r>
+        <w:rPr>
+          <w:rFonts w:ascii="Times New Roman" w:hAnsi="Times New Roman" w:cs="Times New Roman"/>
+          <w:b/>
+          <w:bCs/>
+          <w:sz w:val="28"/>
+          <w:szCs w:val="28"/>
+        </w:rPr>
+        <w:t>compose.yml</w:t>
+      </w:r>
+      <w:proofErr w:type="spellEnd"/>
+      <w:r>
+        <w:rPr>
+          <w:rFonts w:ascii="Times New Roman" w:hAnsi="Times New Roman" w:cs="Times New Roman"/>
+          <w:b/>
+          <w:bCs/>
+          <w:sz w:val="28"/>
+          <w:szCs w:val="28"/>
+        </w:rPr>
+        <w:t xml:space="preserve"> = </w:t>
       </w:r>
       <w:r>
         <w:rPr>
@@ -1322,7 +1780,25 @@
           <w:sz w:val="28"/>
           <w:szCs w:val="28"/>
         </w:rPr>
-        <w:t>New-Item -ItemType File -Name "docker-compose.yml"</w:t>
+        <w:t>New-Item -ItemType File -Name "docker-</w:t>
+      </w:r>
+      <w:proofErr w:type="spellStart"/>
+      <w:r>
+        <w:rPr>
+          <w:rFonts w:ascii="Times New Roman" w:hAnsi="Times New Roman" w:cs="Times New Roman"/>
+          <w:sz w:val="28"/>
+          <w:szCs w:val="28"/>
+        </w:rPr>
+        <w:t>compose.yml</w:t>
+      </w:r>
+      <w:proofErr w:type="spellEnd"/>
+      <w:r>
+        <w:rPr>
+          <w:rFonts w:ascii="Times New Roman" w:hAnsi="Times New Roman" w:cs="Times New Roman"/>
+          <w:sz w:val="28"/>
+          <w:szCs w:val="28"/>
+        </w:rPr>
+        <w:t>"</w:t>
       </w:r>
     </w:p>
     <w:p>
@@ -1732,6 +2208,60 @@
           </wp:inline>
         </w:drawing>
       </w:r>
+    </w:p>
+    <w:p>
+      <w:pPr>
+        <w:rPr>
+          <w:rFonts w:ascii="Times New Roman" w:hAnsi="Times New Roman" w:cs="Times New Roman"/>
+          <w:sz w:val="28"/>
+          <w:szCs w:val="28"/>
+        </w:rPr>
+      </w:pPr>
+    </w:p>
+    <w:p>
+      <w:pPr>
+        <w:rPr>
+          <w:rFonts w:ascii="Times New Roman" w:hAnsi="Times New Roman" w:cs="Times New Roman"/>
+          <w:sz w:val="28"/>
+          <w:szCs w:val="28"/>
+        </w:rPr>
+      </w:pPr>
+      <w:r>
+        <w:rPr>
+          <w:rFonts w:ascii="Times New Roman" w:hAnsi="Times New Roman" w:cs="Times New Roman"/>
+          <w:b/>
+          <w:bCs/>
+          <w:sz w:val="28"/>
+          <w:szCs w:val="28"/>
+        </w:rPr>
+        <w:t>Never reveal if an email exists</w:t>
+      </w:r>
+      <w:r>
+        <w:rPr>
+          <w:rFonts w:ascii="Times New Roman" w:hAnsi="Times New Roman" w:cs="Times New Roman"/>
+          <w:sz w:val="28"/>
+          <w:szCs w:val="28"/>
+        </w:rPr>
+        <w:t xml:space="preserve"> — the forgot-password endpoint always returns the same success message, whether or not that email is registered. This prevents attackers from using it to discover valid accounts.</w:t>
+      </w:r>
+    </w:p>
+    <w:p>
+      <w:pPr>
+        <w:rPr>
+          <w:rFonts w:ascii="Times New Roman" w:hAnsi="Times New Roman" w:cs="Times New Roman"/>
+          <w:sz w:val="28"/>
+          <w:szCs w:val="28"/>
+        </w:rPr>
+      </w:pPr>
+    </w:p>
+    <w:p>
+      <w:pPr>
+        <w:rPr>
+          <w:rFonts w:ascii="Times New Roman" w:hAnsi="Times New Roman" w:cs="Times New Roman"/>
+          <w:sz w:val="28"/>
+          <w:szCs w:val="28"/>
+        </w:rPr>
+      </w:pPr>
     </w:p>
     <w:sectPr>
       <w:pgSz w:w="12240" w:h="15840"/>
@@ -2619,7 +3149,6 @@
   <w:style w:type="character" w:default="1" w:styleId="DefaultParagraphFont">
     <w:name w:val="Default Paragraph Font"/>
     <w:uiPriority w:val="1"/>
-    <w:semiHidden/>
     <w:unhideWhenUsed/>
   </w:style>
   <w:style w:type="table" w:default="1" w:styleId="TableNormal">

</xml_diff>

<commit_message>
Add eyeIcon to password field
</commit_message>
<xml_diff>
--- a/Spendwise Important Points.docx
+++ b/Spendwise Important Points.docx
@@ -340,7 +340,6 @@
         <w:t xml:space="preserve">Save token to </w:t>
       </w:r>
       <w:proofErr w:type="spellStart"/>
-      <w:proofErr w:type="gramStart"/>
       <w:r>
         <w:rPr>
           <w:rFonts w:ascii="Times New Roman" w:hAnsi="Times New Roman" w:cs="Times New Roman"/>
@@ -356,16 +355,7 @@
           <w:sz w:val="28"/>
           <w:szCs w:val="28"/>
         </w:rPr>
-        <w:t xml:space="preserve">  ←</w:t>
-      </w:r>
-      <w:proofErr w:type="gramEnd"/>
-      <w:r>
-        <w:rPr>
-          <w:rFonts w:ascii="Times New Roman" w:hAnsi="Times New Roman" w:cs="Times New Roman"/>
-          <w:sz w:val="28"/>
-          <w:szCs w:val="28"/>
-        </w:rPr>
-        <w:t xml:space="preserve"> for browser JS (Axios interceptor)</w:t>
+        <w:t xml:space="preserve">  ← for browser JS (Axios interceptor)</w:t>
       </w:r>
     </w:p>
     <w:p>
@@ -623,7 +613,6 @@
           <w:szCs w:val="28"/>
         </w:rPr>
       </w:pPr>
-      <w:proofErr w:type="gramStart"/>
       <w:r>
         <w:rPr>
           <w:rFonts w:ascii="Times New Roman" w:hAnsi="Times New Roman" w:cs="Times New Roman"/>
@@ -642,7 +631,6 @@
         <w:t>localStorage</w:t>
       </w:r>
       <w:proofErr w:type="spellEnd"/>
-      <w:proofErr w:type="gramEnd"/>
       <w:r>
         <w:rPr>
           <w:rFonts w:ascii="Times New Roman" w:hAnsi="Times New Roman" w:cs="Times New Roman"/>
@@ -696,23 +684,13 @@
           <w:szCs w:val="28"/>
         </w:rPr>
       </w:pPr>
-      <w:proofErr w:type="gramStart"/>
-      <w:r>
-        <w:rPr>
-          <w:rFonts w:ascii="Times New Roman" w:hAnsi="Times New Roman" w:cs="Times New Roman"/>
-          <w:sz w:val="28"/>
-          <w:szCs w:val="28"/>
-        </w:rPr>
-        <w:t>│  →</w:t>
-      </w:r>
-      <w:proofErr w:type="gramEnd"/>
-      <w:r>
-        <w:rPr>
-          <w:rFonts w:ascii="Times New Roman" w:hAnsi="Times New Roman" w:cs="Times New Roman"/>
-          <w:sz w:val="28"/>
-          <w:szCs w:val="28"/>
-        </w:rPr>
-        <w:t xml:space="preserve"> Used by: Axios interceptor (</w:t>
+      <w:r>
+        <w:rPr>
+          <w:rFonts w:ascii="Times New Roman" w:hAnsi="Times New Roman" w:cs="Times New Roman"/>
+          <w:sz w:val="28"/>
+          <w:szCs w:val="28"/>
+        </w:rPr>
+        <w:t>│  → Used by: Axios interceptor (</w:t>
       </w:r>
       <w:proofErr w:type="spellStart"/>
       <w:r>
@@ -741,23 +719,13 @@
           <w:szCs w:val="28"/>
         </w:rPr>
       </w:pPr>
-      <w:proofErr w:type="gramStart"/>
-      <w:r>
-        <w:rPr>
-          <w:rFonts w:ascii="Times New Roman" w:hAnsi="Times New Roman" w:cs="Times New Roman"/>
-          <w:sz w:val="28"/>
-          <w:szCs w:val="28"/>
-        </w:rPr>
-        <w:t>│  →</w:t>
-      </w:r>
-      <w:proofErr w:type="gramEnd"/>
-      <w:r>
-        <w:rPr>
-          <w:rFonts w:ascii="Times New Roman" w:hAnsi="Times New Roman" w:cs="Times New Roman"/>
-          <w:sz w:val="28"/>
-          <w:szCs w:val="28"/>
-        </w:rPr>
-        <w:t xml:space="preserve"> Attaches to every API request automatically  </w:t>
+      <w:r>
+        <w:rPr>
+          <w:rFonts w:ascii="Times New Roman" w:hAnsi="Times New Roman" w:cs="Times New Roman"/>
+          <w:sz w:val="28"/>
+          <w:szCs w:val="28"/>
+        </w:rPr>
+        <w:t xml:space="preserve">│  → Attaches to every API request automatically  </w:t>
       </w:r>
     </w:p>
     <w:p>
@@ -811,23 +779,13 @@
           <w:szCs w:val="28"/>
         </w:rPr>
       </w:pPr>
-      <w:proofErr w:type="gramStart"/>
-      <w:r>
-        <w:rPr>
-          <w:rFonts w:ascii="Times New Roman" w:hAnsi="Times New Roman" w:cs="Times New Roman"/>
-          <w:sz w:val="28"/>
-          <w:szCs w:val="28"/>
-        </w:rPr>
-        <w:t>│  Cookie</w:t>
-      </w:r>
-      <w:proofErr w:type="gramEnd"/>
-      <w:r>
-        <w:rPr>
-          <w:rFonts w:ascii="Times New Roman" w:hAnsi="Times New Roman" w:cs="Times New Roman"/>
-          <w:sz w:val="28"/>
-          <w:szCs w:val="28"/>
-        </w:rPr>
-        <w:t>['</w:t>
+      <w:r>
+        <w:rPr>
+          <w:rFonts w:ascii="Times New Roman" w:hAnsi="Times New Roman" w:cs="Times New Roman"/>
+          <w:sz w:val="28"/>
+          <w:szCs w:val="28"/>
+        </w:rPr>
+        <w:t>│  Cookie['</w:t>
       </w:r>
       <w:proofErr w:type="spellStart"/>
       <w:r>
@@ -874,23 +832,13 @@
           <w:szCs w:val="28"/>
         </w:rPr>
       </w:pPr>
-      <w:proofErr w:type="gramStart"/>
-      <w:r>
-        <w:rPr>
-          <w:rFonts w:ascii="Times New Roman" w:hAnsi="Times New Roman" w:cs="Times New Roman"/>
-          <w:sz w:val="28"/>
-          <w:szCs w:val="28"/>
-        </w:rPr>
-        <w:t>│  →</w:t>
-      </w:r>
-      <w:proofErr w:type="gramEnd"/>
-      <w:r>
-        <w:rPr>
-          <w:rFonts w:ascii="Times New Roman" w:hAnsi="Times New Roman" w:cs="Times New Roman"/>
-          <w:sz w:val="28"/>
-          <w:szCs w:val="28"/>
-        </w:rPr>
-        <w:t xml:space="preserve"> Used by: </w:t>
+      <w:r>
+        <w:rPr>
+          <w:rFonts w:ascii="Times New Roman" w:hAnsi="Times New Roman" w:cs="Times New Roman"/>
+          <w:sz w:val="28"/>
+          <w:szCs w:val="28"/>
+        </w:rPr>
+        <w:t xml:space="preserve">│  → Used by: </w:t>
       </w:r>
       <w:proofErr w:type="spellStart"/>
       <w:r>
@@ -919,23 +867,13 @@
           <w:szCs w:val="28"/>
         </w:rPr>
       </w:pPr>
-      <w:proofErr w:type="gramStart"/>
-      <w:r>
-        <w:rPr>
-          <w:rFonts w:ascii="Times New Roman" w:hAnsi="Times New Roman" w:cs="Times New Roman"/>
-          <w:sz w:val="28"/>
-          <w:szCs w:val="28"/>
-        </w:rPr>
-        <w:t>│  →</w:t>
-      </w:r>
-      <w:proofErr w:type="gramEnd"/>
-      <w:r>
-        <w:rPr>
-          <w:rFonts w:ascii="Times New Roman" w:hAnsi="Times New Roman" w:cs="Times New Roman"/>
-          <w:sz w:val="28"/>
-          <w:szCs w:val="28"/>
-        </w:rPr>
-        <w:t xml:space="preserve"> Protects /dashboard, /expenses etc.          </w:t>
+      <w:r>
+        <w:rPr>
+          <w:rFonts w:ascii="Times New Roman" w:hAnsi="Times New Roman" w:cs="Times New Roman"/>
+          <w:sz w:val="28"/>
+          <w:szCs w:val="28"/>
+        </w:rPr>
+        <w:t xml:space="preserve">│  → Protects /dashboard, /expenses etc.          </w:t>
       </w:r>
     </w:p>
     <w:p>
@@ -1108,23 +1046,13 @@
         </w:rPr>
         <w:t xml:space="preserve">Gemini API Key = </w:t>
       </w:r>
-      <w:proofErr w:type="gramStart"/>
-      <w:r>
-        <w:rPr>
-          <w:rFonts w:ascii="Times New Roman" w:hAnsi="Times New Roman" w:cs="Times New Roman"/>
-          <w:sz w:val="28"/>
-          <w:szCs w:val="28"/>
-        </w:rPr>
-        <w:t>AQ.Ab</w:t>
-      </w:r>
-      <w:proofErr w:type="gramEnd"/>
-      <w:r>
-        <w:rPr>
-          <w:rFonts w:ascii="Times New Roman" w:hAnsi="Times New Roman" w:cs="Times New Roman"/>
-          <w:sz w:val="28"/>
-          <w:szCs w:val="28"/>
-        </w:rPr>
-        <w:t>8RN6JtLpHr-X399xMdltMeKN98-xivIbtH6waSS6Jb4CRDzA</w:t>
+      <w:r>
+        <w:rPr>
+          <w:rFonts w:ascii="Times New Roman" w:hAnsi="Times New Roman" w:cs="Times New Roman"/>
+          <w:sz w:val="28"/>
+          <w:szCs w:val="28"/>
+        </w:rPr>
+        <w:t>AQ.Ab8RN6JtLpHr-X399xMdltMeKN98-xivIbtH6waSS6Jb4CRDzA</w:t>
       </w:r>
     </w:p>
     <w:p>
@@ -1438,7 +1366,6 @@
         <w:t xml:space="preserve"> run </w:t>
       </w:r>
       <w:proofErr w:type="spellStart"/>
-      <w:proofErr w:type="gramStart"/>
       <w:r>
         <w:rPr>
           <w:rFonts w:ascii="Times New Roman" w:hAnsi="Times New Roman" w:cs="Times New Roman"/>
@@ -1448,7 +1375,6 @@
         <w:t>test:coverage</w:t>
       </w:r>
       <w:proofErr w:type="spellEnd"/>
-      <w:proofErr w:type="gramEnd"/>
     </w:p>
     <w:p>
       <w:pPr>
@@ -2253,6 +2179,525 @@
           <w:szCs w:val="28"/>
         </w:rPr>
       </w:pPr>
+    </w:p>
+    <w:p>
+      <w:pPr>
+        <w:rPr>
+          <w:rFonts w:ascii="Times New Roman" w:hAnsi="Times New Roman" w:cs="Times New Roman"/>
+          <w:b/>
+          <w:bCs/>
+          <w:sz w:val="28"/>
+          <w:szCs w:val="28"/>
+        </w:rPr>
+      </w:pPr>
+      <w:r>
+        <w:rPr>
+          <w:rFonts w:ascii="Times New Roman" w:hAnsi="Times New Roman" w:cs="Times New Roman"/>
+          <w:b/>
+          <w:bCs/>
+          <w:sz w:val="28"/>
+          <w:szCs w:val="28"/>
+        </w:rPr>
+        <w:t>Expenses and Budgets are intentionally independent features</w:t>
+      </w:r>
+    </w:p>
+    <w:p>
+      <w:pPr>
+        <w:rPr>
+          <w:rFonts w:ascii="Times New Roman" w:hAnsi="Times New Roman" w:cs="Times New Roman"/>
+          <w:sz w:val="28"/>
+          <w:szCs w:val="28"/>
+        </w:rPr>
+      </w:pPr>
+      <w:r>
+        <w:rPr>
+          <w:rFonts w:ascii="Times New Roman" w:hAnsi="Times New Roman" w:cs="Times New Roman"/>
+          <w:sz w:val="28"/>
+          <w:szCs w:val="28"/>
+        </w:rPr>
+        <w:t>Expenses = a record of what you actually spent</w:t>
+      </w:r>
+    </w:p>
+    <w:p>
+      <w:pPr>
+        <w:rPr>
+          <w:rFonts w:ascii="Times New Roman" w:hAnsi="Times New Roman" w:cs="Times New Roman"/>
+          <w:sz w:val="28"/>
+          <w:szCs w:val="28"/>
+        </w:rPr>
+      </w:pPr>
+      <w:r>
+        <w:rPr>
+          <w:rFonts w:ascii="Times New Roman" w:hAnsi="Times New Roman" w:cs="Times New Roman"/>
+          <w:sz w:val="28"/>
+          <w:szCs w:val="28"/>
+        </w:rPr>
+        <w:t>Budgets  = a goal/limit you set for yourself</w:t>
+      </w:r>
+    </w:p>
+    <w:p>
+      <w:pPr>
+        <w:rPr>
+          <w:rFonts w:ascii="Times New Roman" w:hAnsi="Times New Roman" w:cs="Times New Roman"/>
+          <w:sz w:val="28"/>
+          <w:szCs w:val="28"/>
+        </w:rPr>
+      </w:pPr>
+    </w:p>
+    <w:p>
+      <w:pPr>
+        <w:rPr>
+          <w:rFonts w:ascii="Times New Roman" w:hAnsi="Times New Roman" w:cs="Times New Roman"/>
+          <w:sz w:val="28"/>
+          <w:szCs w:val="28"/>
+        </w:rPr>
+      </w:pPr>
+      <w:r>
+        <w:rPr>
+          <w:rFonts w:ascii="Times New Roman" w:hAnsi="Times New Roman" w:cs="Times New Roman"/>
+          <w:sz w:val="28"/>
+          <w:szCs w:val="28"/>
+        </w:rPr>
+        <w:t>They don't need each other to exist.</w:t>
+      </w:r>
+    </w:p>
+    <w:p>
+      <w:pPr>
+        <w:rPr>
+          <w:rFonts w:ascii="Times New Roman" w:hAnsi="Times New Roman" w:cs="Times New Roman"/>
+          <w:sz w:val="28"/>
+          <w:szCs w:val="28"/>
+        </w:rPr>
+      </w:pPr>
+      <w:r>
+        <w:rPr>
+          <w:rFonts w:ascii="Times New Roman" w:hAnsi="Times New Roman" w:cs="Times New Roman"/>
+          <w:sz w:val="28"/>
+          <w:szCs w:val="28"/>
+        </w:rPr>
+        <w:t>Think about how real people use money apps:</w:t>
+      </w:r>
+    </w:p>
+    <w:p>
+      <w:pPr>
+        <w:rPr>
+          <w:rFonts w:ascii="Times New Roman" w:hAnsi="Times New Roman" w:cs="Times New Roman"/>
+          <w:sz w:val="28"/>
+          <w:szCs w:val="28"/>
+        </w:rPr>
+      </w:pPr>
+      <w:r>
+        <w:rPr>
+          <w:rFonts w:ascii="Times New Roman" w:hAnsi="Times New Roman" w:cs="Times New Roman"/>
+          <w:b/>
+          <w:bCs/>
+          <w:sz w:val="28"/>
+          <w:szCs w:val="28"/>
+        </w:rPr>
+        <w:t>Scenario 1 — New user, day one</w:t>
+      </w:r>
+    </w:p>
+    <w:p>
+      <w:pPr>
+        <w:rPr>
+          <w:rFonts w:ascii="Times New Roman" w:hAnsi="Times New Roman" w:cs="Times New Roman"/>
+          <w:sz w:val="28"/>
+          <w:szCs w:val="28"/>
+        </w:rPr>
+      </w:pPr>
+      <w:r>
+        <w:rPr>
+          <w:rFonts w:ascii="Times New Roman" w:hAnsi="Times New Roman" w:cs="Times New Roman"/>
+          <w:sz w:val="28"/>
+          <w:szCs w:val="28"/>
+        </w:rPr>
+        <w:t>User signs up, wants to just start logging expenses immediately</w:t>
+      </w:r>
+    </w:p>
+    <w:p>
+      <w:pPr>
+        <w:rPr>
+          <w:rFonts w:ascii="Times New Roman" w:hAnsi="Times New Roman" w:cs="Times New Roman"/>
+          <w:sz w:val="28"/>
+          <w:szCs w:val="28"/>
+        </w:rPr>
+      </w:pPr>
+      <w:r>
+        <w:rPr>
+          <w:rFonts w:ascii="Times New Roman" w:hAnsi="Times New Roman" w:cs="Times New Roman"/>
+          <w:sz w:val="28"/>
+          <w:szCs w:val="28"/>
+        </w:rPr>
+        <w:t>→ "I bought lunch for 450 LKR" — logs it right away</w:t>
+      </w:r>
+    </w:p>
+    <w:p>
+      <w:pPr>
+        <w:rPr>
+          <w:rFonts w:ascii="Times New Roman" w:hAnsi="Times New Roman" w:cs="Times New Roman"/>
+          <w:sz w:val="28"/>
+          <w:szCs w:val="28"/>
+        </w:rPr>
+      </w:pPr>
+      <w:r>
+        <w:rPr>
+          <w:rFonts w:ascii="Times New Roman" w:hAnsi="Times New Roman" w:cs="Times New Roman"/>
+          <w:sz w:val="28"/>
+          <w:szCs w:val="28"/>
+        </w:rPr>
+        <w:lastRenderedPageBreak/>
+        <w:t>→ Hasn't thought about budgets yet, and that's fine</w:t>
+      </w:r>
+    </w:p>
+    <w:p>
+      <w:pPr>
+        <w:rPr>
+          <w:rFonts w:ascii="Times New Roman" w:hAnsi="Times New Roman" w:cs="Times New Roman"/>
+          <w:sz w:val="28"/>
+          <w:szCs w:val="28"/>
+        </w:rPr>
+      </w:pPr>
+      <w:r>
+        <w:rPr>
+          <w:rFonts w:ascii="Times New Roman" w:hAnsi="Times New Roman" w:cs="Times New Roman"/>
+          <w:sz w:val="28"/>
+          <w:szCs w:val="28"/>
+        </w:rPr>
+        <w:t xml:space="preserve">If we </w:t>
+      </w:r>
+      <w:r>
+        <w:rPr>
+          <w:rFonts w:ascii="Times New Roman" w:hAnsi="Times New Roman" w:cs="Times New Roman"/>
+          <w:i/>
+          <w:iCs/>
+          <w:sz w:val="28"/>
+          <w:szCs w:val="28"/>
+        </w:rPr>
+        <w:t>forced</w:t>
+      </w:r>
+      <w:r>
+        <w:rPr>
+          <w:rFonts w:ascii="Times New Roman" w:hAnsi="Times New Roman" w:cs="Times New Roman"/>
+          <w:sz w:val="28"/>
+          <w:szCs w:val="28"/>
+        </w:rPr>
+        <w:t xml:space="preserve"> users to set a budget before logging any expense, that would be a huge friction point — most people would just abandon the app on day one.</w:t>
+      </w:r>
+    </w:p>
+    <w:p>
+      <w:pPr>
+        <w:rPr>
+          <w:rFonts w:ascii="Times New Roman" w:hAnsi="Times New Roman" w:cs="Times New Roman"/>
+          <w:b/>
+          <w:bCs/>
+          <w:sz w:val="28"/>
+          <w:szCs w:val="28"/>
+        </w:rPr>
+      </w:pPr>
+      <w:r>
+        <w:rPr>
+          <w:rFonts w:ascii="Times New Roman" w:hAnsi="Times New Roman" w:cs="Times New Roman"/>
+          <w:b/>
+          <w:bCs/>
+          <w:sz w:val="28"/>
+          <w:szCs w:val="28"/>
+        </w:rPr>
+        <w:t>The real purpose of this flexibility</w:t>
+      </w:r>
+    </w:p>
+    <w:p>
+      <w:pPr>
+        <w:rPr>
+          <w:rFonts w:ascii="Times New Roman" w:hAnsi="Times New Roman" w:cs="Times New Roman"/>
+          <w:sz w:val="28"/>
+          <w:szCs w:val="28"/>
+        </w:rPr>
+      </w:pPr>
+      <w:r>
+        <w:rPr>
+          <w:rFonts w:ascii="Times New Roman" w:hAnsi="Times New Roman" w:cs="Times New Roman"/>
+          <w:b/>
+          <w:bCs/>
+          <w:sz w:val="28"/>
+          <w:szCs w:val="28"/>
+        </w:rPr>
+        <w:t>1. Budgets are optional, expenses are the core data</w:t>
+      </w:r>
+    </w:p>
+    <w:p>
+      <w:pPr>
+        <w:rPr>
+          <w:rFonts w:ascii="Times New Roman" w:hAnsi="Times New Roman" w:cs="Times New Roman"/>
+          <w:sz w:val="28"/>
+          <w:szCs w:val="28"/>
+        </w:rPr>
+      </w:pPr>
+      <w:r>
+        <w:rPr>
+          <w:rFonts w:ascii="Times New Roman" w:hAnsi="Times New Roman" w:cs="Times New Roman"/>
+          <w:sz w:val="28"/>
+          <w:szCs w:val="28"/>
+        </w:rPr>
+        <w:t xml:space="preserve">Your app's fundamental job is tracking spending. Budgets are a </w:t>
+      </w:r>
+      <w:r>
+        <w:rPr>
+          <w:rFonts w:ascii="Times New Roman" w:hAnsi="Times New Roman" w:cs="Times New Roman"/>
+          <w:b/>
+          <w:bCs/>
+          <w:sz w:val="28"/>
+          <w:szCs w:val="28"/>
+        </w:rPr>
+        <w:t>layer on top</w:t>
+      </w:r>
+      <w:r>
+        <w:rPr>
+          <w:rFonts w:ascii="Times New Roman" w:hAnsi="Times New Roman" w:cs="Times New Roman"/>
+          <w:sz w:val="28"/>
+          <w:szCs w:val="28"/>
+        </w:rPr>
+        <w:t xml:space="preserve"> that helps users control spending once they understand their patterns. Making budgets mandatory-first would be backwards — you can't set a realistic Food budget until you've seen a few weeks of actual Food spending.</w:t>
+      </w:r>
+    </w:p>
+    <w:p>
+      <w:pPr>
+        <w:rPr>
+          <w:rFonts w:ascii="Times New Roman" w:hAnsi="Times New Roman" w:cs="Times New Roman"/>
+          <w:sz w:val="28"/>
+          <w:szCs w:val="28"/>
+        </w:rPr>
+      </w:pPr>
+      <w:r>
+        <w:rPr>
+          <w:rFonts w:ascii="Times New Roman" w:hAnsi="Times New Roman" w:cs="Times New Roman"/>
+          <w:b/>
+          <w:bCs/>
+          <w:sz w:val="28"/>
+          <w:szCs w:val="28"/>
+        </w:rPr>
+        <w:t>2. Some categories may never need a budget</w:t>
+      </w:r>
+    </w:p>
+    <w:p>
+      <w:pPr>
+        <w:rPr>
+          <w:rFonts w:ascii="Times New Roman" w:hAnsi="Times New Roman" w:cs="Times New Roman"/>
+          <w:sz w:val="28"/>
+          <w:szCs w:val="28"/>
+        </w:rPr>
+      </w:pPr>
+      <w:r>
+        <w:rPr>
+          <w:rFonts w:ascii="Times New Roman" w:hAnsi="Times New Roman" w:cs="Times New Roman"/>
+          <w:sz w:val="28"/>
+          <w:szCs w:val="28"/>
+        </w:rPr>
+        <w:t xml:space="preserve">A student might want to track "Health" expenses just for their own records, without ever wanting a strict monthly limit on health spending — you don't want to </w:t>
+      </w:r>
+      <w:r>
+        <w:rPr>
+          <w:rFonts w:ascii="Times New Roman" w:hAnsi="Times New Roman" w:cs="Times New Roman"/>
+          <w:i/>
+          <w:iCs/>
+          <w:sz w:val="28"/>
+          <w:szCs w:val="28"/>
+        </w:rPr>
+        <w:t>limit</w:t>
+      </w:r>
+      <w:r>
+        <w:rPr>
+          <w:rFonts w:ascii="Times New Roman" w:hAnsi="Times New Roman" w:cs="Times New Roman"/>
+          <w:sz w:val="28"/>
+          <w:szCs w:val="28"/>
+        </w:rPr>
+        <w:t xml:space="preserve"> healthcare spending, just see it.</w:t>
+      </w:r>
+    </w:p>
+    <w:p>
+      <w:pPr>
+        <w:rPr>
+          <w:rFonts w:ascii="Times New Roman" w:hAnsi="Times New Roman" w:cs="Times New Roman"/>
+          <w:b/>
+          <w:bCs/>
+          <w:sz w:val="28"/>
+          <w:szCs w:val="28"/>
+        </w:rPr>
+      </w:pPr>
+      <w:r>
+        <w:rPr>
+          <w:rFonts w:ascii="Times New Roman" w:hAnsi="Times New Roman" w:cs="Times New Roman"/>
+          <w:b/>
+          <w:bCs/>
+          <w:sz w:val="28"/>
+          <w:szCs w:val="28"/>
+        </w:rPr>
+        <w:t>3. It matches how your Budget system actually works</w:t>
+      </w:r>
+    </w:p>
+    <w:p>
+      <w:pPr>
+        <w:rPr>
+          <w:rFonts w:ascii="Times New Roman" w:hAnsi="Times New Roman" w:cs="Times New Roman"/>
+          <w:b/>
+          <w:bCs/>
+          <w:sz w:val="28"/>
+          <w:szCs w:val="28"/>
+        </w:rPr>
+      </w:pPr>
+    </w:p>
+    <w:p>
+      <w:pPr>
+        <w:rPr>
+          <w:rFonts w:ascii="Times New Roman" w:hAnsi="Times New Roman" w:cs="Times New Roman"/>
+          <w:sz w:val="28"/>
+          <w:szCs w:val="28"/>
+        </w:rPr>
+      </w:pPr>
+      <w:r>
+        <w:rPr>
+          <w:rFonts w:ascii="Times New Roman" w:hAnsi="Times New Roman" w:cs="Times New Roman"/>
+          <w:sz w:val="28"/>
+          <w:szCs w:val="28"/>
+        </w:rPr>
+        <w:t>E</w:t>
+      </w:r>
+      <w:r>
+        <w:rPr>
+          <w:rFonts w:ascii="Times New Roman" w:hAnsi="Times New Roman" w:cs="Times New Roman"/>
+          <w:sz w:val="28"/>
+          <w:szCs w:val="28"/>
+        </w:rPr>
+        <w:t xml:space="preserve">xpenses are the </w:t>
+      </w:r>
+      <w:r>
+        <w:rPr>
+          <w:rFonts w:ascii="Times New Roman" w:hAnsi="Times New Roman" w:cs="Times New Roman"/>
+          <w:b/>
+          <w:bCs/>
+          <w:sz w:val="28"/>
+          <w:szCs w:val="28"/>
+        </w:rPr>
+        <w:t>source of truth</w:t>
+      </w:r>
+      <w:r>
+        <w:rPr>
+          <w:rFonts w:ascii="Times New Roman" w:hAnsi="Times New Roman" w:cs="Times New Roman"/>
+          <w:sz w:val="28"/>
+          <w:szCs w:val="28"/>
+        </w:rPr>
+        <w:t>, and budgets are just an optional lens you apply on top to see "how am I doing against my goal for this category."</w:t>
+      </w:r>
+    </w:p>
+    <w:p>
+      <w:pPr>
+        <w:rPr>
+          <w:rFonts w:ascii="Times New Roman" w:hAnsi="Times New Roman" w:cs="Times New Roman"/>
+          <w:sz w:val="28"/>
+          <w:szCs w:val="28"/>
+        </w:rPr>
+      </w:pPr>
+    </w:p>
+    <w:p>
+      <w:pPr>
+        <w:rPr>
+          <w:rFonts w:ascii="Times New Roman" w:hAnsi="Times New Roman" w:cs="Times New Roman"/>
+          <w:sz w:val="28"/>
+          <w:szCs w:val="28"/>
+        </w:rPr>
+      </w:pPr>
+      <w:r>
+        <w:rPr>
+          <w:rFonts w:ascii="Times New Roman" w:hAnsi="Times New Roman" w:cs="Times New Roman"/>
+          <w:sz w:val="28"/>
+          <w:szCs w:val="28"/>
+        </w:rPr>
+        <w:t>Future enhancements:</w:t>
+      </w:r>
+    </w:p>
+    <w:p>
+      <w:pPr>
+        <w:rPr>
+          <w:rFonts w:ascii="Times New Roman" w:hAnsi="Times New Roman" w:cs="Times New Roman"/>
+          <w:sz w:val="28"/>
+          <w:szCs w:val="28"/>
+        </w:rPr>
+      </w:pPr>
+      <w:r>
+        <w:rPr>
+          <w:rFonts w:ascii="Times New Roman" w:hAnsi="Times New Roman" w:cs="Times New Roman"/>
+          <w:sz w:val="28"/>
+          <w:szCs w:val="28"/>
+        </w:rPr>
+        <w:t>O</w:t>
+      </w:r>
+      <w:r>
+        <w:rPr>
+          <w:rFonts w:ascii="Times New Roman" w:hAnsi="Times New Roman" w:cs="Times New Roman"/>
+          <w:sz w:val="28"/>
+          <w:szCs w:val="28"/>
+        </w:rPr>
+        <w:t xml:space="preserve">n the Dashboard or Expenses page, if a category has significant spending but </w:t>
+      </w:r>
+      <w:r>
+        <w:rPr>
+          <w:rFonts w:ascii="Times New Roman" w:hAnsi="Times New Roman" w:cs="Times New Roman"/>
+          <w:b/>
+          <w:bCs/>
+          <w:sz w:val="28"/>
+          <w:szCs w:val="28"/>
+        </w:rPr>
+        <w:t>no budget set</w:t>
+      </w:r>
+      <w:r>
+        <w:rPr>
+          <w:rFonts w:ascii="Times New Roman" w:hAnsi="Times New Roman" w:cs="Times New Roman"/>
+          <w:sz w:val="28"/>
+          <w:szCs w:val="28"/>
+        </w:rPr>
+        <w:t>, show a subtle suggestion like:</w:t>
+      </w:r>
+    </w:p>
+    <w:p>
+      <w:pPr>
+        <w:rPr>
+          <w:rFonts w:ascii="Times New Roman" w:hAnsi="Times New Roman" w:cs="Times New Roman"/>
+          <w:sz w:val="28"/>
+          <w:szCs w:val="28"/>
+        </w:rPr>
+      </w:pPr>
+      <w:r>
+        <w:rPr>
+          <w:rFonts w:ascii="Segoe UI Emoji" w:hAnsi="Segoe UI Emoji" w:cs="Segoe UI Emoji"/>
+          <w:sz w:val="28"/>
+          <w:szCs w:val="28"/>
+        </w:rPr>
+        <w:t xml:space="preserve">  </w:t>
+      </w:r>
+      <w:r>
+        <w:rPr>
+          <w:rFonts w:ascii="Times New Roman" w:hAnsi="Times New Roman" w:cs="Times New Roman"/>
+          <w:sz w:val="28"/>
+          <w:szCs w:val="28"/>
+        </w:rPr>
+        <w:t xml:space="preserve"> You've spent LKR 8,500 on Food this month with no budget set.</w:t>
+      </w:r>
+    </w:p>
+    <w:p>
+      <w:pPr>
+        <w:rPr>
+          <w:rFonts w:ascii="Times New Roman" w:hAnsi="Times New Roman" w:cs="Times New Roman"/>
+          <w:sz w:val="28"/>
+          <w:szCs w:val="28"/>
+        </w:rPr>
+      </w:pPr>
+      <w:r>
+        <w:rPr>
+          <w:rFonts w:ascii="Times New Roman" w:hAnsi="Times New Roman" w:cs="Times New Roman"/>
+          <w:sz w:val="28"/>
+          <w:szCs w:val="28"/>
+        </w:rPr>
+        <w:t xml:space="preserve">   [Set a budget →]</w:t>
+      </w:r>
     </w:p>
     <w:p>
       <w:pPr>

</xml_diff>

<commit_message>
add dark theme affect for landing page
</commit_message>
<xml_diff>
--- a/Spendwise Important Points.docx
+++ b/Spendwise Important Points.docx
@@ -16,25 +16,7 @@
           <w:sz w:val="28"/>
           <w:szCs w:val="28"/>
         </w:rPr>
-        <w:t xml:space="preserve">           </w:t>
-      </w:r>
-      <w:proofErr w:type="spellStart"/>
-      <w:r>
-        <w:rPr>
-          <w:rFonts w:ascii="Times New Roman" w:hAnsi="Times New Roman" w:cs="Times New Roman"/>
-          <w:sz w:val="28"/>
-          <w:szCs w:val="28"/>
-        </w:rPr>
-        <w:t>Spendwise</w:t>
-      </w:r>
-      <w:proofErr w:type="spellEnd"/>
-      <w:r>
-        <w:rPr>
-          <w:rFonts w:ascii="Times New Roman" w:hAnsi="Times New Roman" w:cs="Times New Roman"/>
-          <w:sz w:val="28"/>
-          <w:szCs w:val="28"/>
-        </w:rPr>
-        <w:t xml:space="preserve"> Important Points</w:t>
+        <w:t xml:space="preserve">           Spendwise Important Points</w:t>
       </w:r>
     </w:p>
     <w:p>
@@ -94,95 +76,41 @@
           <w:sz w:val="28"/>
           <w:szCs w:val="28"/>
         </w:rPr>
-        <w:t xml:space="preserve">  </w:t>
-      </w:r>
-      <w:proofErr w:type="spellStart"/>
-      <w:r>
-        <w:rPr>
-          <w:rFonts w:ascii="Times New Roman" w:hAnsi="Times New Roman" w:cs="Times New Roman"/>
-          <w:sz w:val="28"/>
-          <w:szCs w:val="28"/>
-        </w:rPr>
-        <w:t>middleware.ts</w:t>
-      </w:r>
-      <w:proofErr w:type="spellEnd"/>
-      <w:r>
-        <w:rPr>
-          <w:rFonts w:ascii="Times New Roman" w:hAnsi="Times New Roman" w:cs="Times New Roman"/>
-          <w:sz w:val="28"/>
-          <w:szCs w:val="28"/>
-        </w:rPr>
-        <w:t xml:space="preserve"> runs on the SERVER</w:t>
-      </w:r>
-    </w:p>
-    <w:p>
-      <w:pPr>
-        <w:rPr>
-          <w:rFonts w:ascii="Times New Roman" w:hAnsi="Times New Roman" w:cs="Times New Roman"/>
-          <w:sz w:val="28"/>
-          <w:szCs w:val="28"/>
-        </w:rPr>
-      </w:pPr>
-      <w:r>
-        <w:rPr>
-          <w:rFonts w:ascii="Times New Roman" w:hAnsi="Times New Roman" w:cs="Times New Roman"/>
-          <w:sz w:val="28"/>
-          <w:szCs w:val="28"/>
-        </w:rPr>
-        <w:t xml:space="preserve">  </w:t>
-      </w:r>
-      <w:proofErr w:type="spellStart"/>
-      <w:r>
-        <w:rPr>
-          <w:rFonts w:ascii="Times New Roman" w:hAnsi="Times New Roman" w:cs="Times New Roman"/>
-          <w:sz w:val="28"/>
-          <w:szCs w:val="28"/>
-        </w:rPr>
-        <w:t>localStorage</w:t>
-      </w:r>
-      <w:proofErr w:type="spellEnd"/>
-      <w:r>
-        <w:rPr>
-          <w:rFonts w:ascii="Times New Roman" w:hAnsi="Times New Roman" w:cs="Times New Roman"/>
-          <w:sz w:val="28"/>
-          <w:szCs w:val="28"/>
-        </w:rPr>
-        <w:t xml:space="preserve"> exists only in the BROWSER</w:t>
-      </w:r>
-    </w:p>
-    <w:p>
-      <w:pPr>
-        <w:rPr>
-          <w:rFonts w:ascii="Times New Roman" w:hAnsi="Times New Roman" w:cs="Times New Roman"/>
-          <w:sz w:val="28"/>
-          <w:szCs w:val="28"/>
-        </w:rPr>
-      </w:pPr>
-      <w:r>
-        <w:rPr>
-          <w:rFonts w:ascii="Times New Roman" w:hAnsi="Times New Roman" w:cs="Times New Roman"/>
-          <w:sz w:val="28"/>
-          <w:szCs w:val="28"/>
-        </w:rPr>
-        <w:t xml:space="preserve">  Server cannot read </w:t>
-      </w:r>
-      <w:proofErr w:type="spellStart"/>
-      <w:r>
-        <w:rPr>
-          <w:rFonts w:ascii="Times New Roman" w:hAnsi="Times New Roman" w:cs="Times New Roman"/>
-          <w:sz w:val="28"/>
-          <w:szCs w:val="28"/>
-        </w:rPr>
-        <w:t>localStorage</w:t>
-      </w:r>
-      <w:proofErr w:type="spellEnd"/>
-      <w:r>
-        <w:rPr>
-          <w:rFonts w:ascii="Times New Roman" w:hAnsi="Times New Roman" w:cs="Times New Roman"/>
-          <w:sz w:val="28"/>
-          <w:szCs w:val="28"/>
-        </w:rPr>
-        <w:t>!</w:t>
+        <w:t xml:space="preserve">  middleware.ts runs on the SERVER</w:t>
+      </w:r>
+    </w:p>
+    <w:p>
+      <w:pPr>
+        <w:rPr>
+          <w:rFonts w:ascii="Times New Roman" w:hAnsi="Times New Roman" w:cs="Times New Roman"/>
+          <w:sz w:val="28"/>
+          <w:szCs w:val="28"/>
+        </w:rPr>
+      </w:pPr>
+      <w:r>
+        <w:rPr>
+          <w:rFonts w:ascii="Times New Roman" w:hAnsi="Times New Roman" w:cs="Times New Roman"/>
+          <w:sz w:val="28"/>
+          <w:szCs w:val="28"/>
+        </w:rPr>
+        <w:t xml:space="preserve">  localStorage exists only in the BROWSER</w:t>
+      </w:r>
+    </w:p>
+    <w:p>
+      <w:pPr>
+        <w:rPr>
+          <w:rFonts w:ascii="Times New Roman" w:hAnsi="Times New Roman" w:cs="Times New Roman"/>
+          <w:sz w:val="28"/>
+          <w:szCs w:val="28"/>
+        </w:rPr>
+      </w:pPr>
+      <w:r>
+        <w:rPr>
+          <w:rFonts w:ascii="Times New Roman" w:hAnsi="Times New Roman" w:cs="Times New Roman"/>
+          <w:sz w:val="28"/>
+          <w:szCs w:val="28"/>
+        </w:rPr>
+        <w:t xml:space="preserve">  Server cannot read localStorage!</w:t>
       </w:r>
     </w:p>
     <w:p>
@@ -225,25 +153,7 @@
           <w:sz w:val="28"/>
           <w:szCs w:val="28"/>
         </w:rPr>
-        <w:t xml:space="preserve">  Save token in BOTH </w:t>
-      </w:r>
-      <w:proofErr w:type="spellStart"/>
-      <w:r>
-        <w:rPr>
-          <w:rFonts w:ascii="Times New Roman" w:hAnsi="Times New Roman" w:cs="Times New Roman"/>
-          <w:sz w:val="28"/>
-          <w:szCs w:val="28"/>
-        </w:rPr>
-        <w:t>localStorage</w:t>
-      </w:r>
-      <w:proofErr w:type="spellEnd"/>
-      <w:r>
-        <w:rPr>
-          <w:rFonts w:ascii="Times New Roman" w:hAnsi="Times New Roman" w:cs="Times New Roman"/>
-          <w:sz w:val="28"/>
-          <w:szCs w:val="28"/>
-        </w:rPr>
-        <w:t xml:space="preserve"> AND cookie</w:t>
+        <w:t xml:space="preserve">  Save token in BOTH localStorage AND cookie</w:t>
       </w:r>
     </w:p>
     <w:p>
@@ -337,25 +247,7 @@
           <w:sz w:val="28"/>
           <w:szCs w:val="28"/>
         </w:rPr>
-        <w:t xml:space="preserve">Save token to </w:t>
-      </w:r>
-      <w:proofErr w:type="spellStart"/>
-      <w:r>
-        <w:rPr>
-          <w:rFonts w:ascii="Times New Roman" w:hAnsi="Times New Roman" w:cs="Times New Roman"/>
-          <w:sz w:val="28"/>
-          <w:szCs w:val="28"/>
-        </w:rPr>
-        <w:t>localStorage</w:t>
-      </w:r>
-      <w:proofErr w:type="spellEnd"/>
-      <w:r>
-        <w:rPr>
-          <w:rFonts w:ascii="Times New Roman" w:hAnsi="Times New Roman" w:cs="Times New Roman"/>
-          <w:sz w:val="28"/>
-          <w:szCs w:val="28"/>
-        </w:rPr>
-        <w:t xml:space="preserve">  ← for browser JS (Axios interceptor)</w:t>
+        <w:t>Save token to localStorage  ← for browser JS (Axios interceptor)</w:t>
       </w:r>
     </w:p>
     <w:p>
@@ -434,23 +326,13 @@
           <w:szCs w:val="28"/>
         </w:rPr>
       </w:pPr>
-      <w:proofErr w:type="spellStart"/>
-      <w:r>
-        <w:rPr>
-          <w:rFonts w:ascii="Times New Roman" w:hAnsi="Times New Roman" w:cs="Times New Roman"/>
-          <w:sz w:val="28"/>
-          <w:szCs w:val="28"/>
-        </w:rPr>
-        <w:t>middleware.ts</w:t>
-      </w:r>
-      <w:proofErr w:type="spellEnd"/>
-      <w:r>
-        <w:rPr>
-          <w:rFonts w:ascii="Times New Roman" w:hAnsi="Times New Roman" w:cs="Times New Roman"/>
-          <w:sz w:val="28"/>
-          <w:szCs w:val="28"/>
-        </w:rPr>
-        <w:t xml:space="preserve"> runs on server</w:t>
+      <w:r>
+        <w:rPr>
+          <w:rFonts w:ascii="Times New Roman" w:hAnsi="Times New Roman" w:cs="Times New Roman"/>
+          <w:sz w:val="28"/>
+          <w:szCs w:val="28"/>
+        </w:rPr>
+        <w:t>middleware.ts runs on server</w:t>
       </w:r>
     </w:p>
     <w:p>
@@ -532,43 +414,7 @@
           <w:sz w:val="28"/>
           <w:szCs w:val="28"/>
         </w:rPr>
-        <w:t xml:space="preserve">We already wrote the cookie helpers in </w:t>
-      </w:r>
-      <w:proofErr w:type="spellStart"/>
-      <w:r>
-        <w:rPr>
-          <w:rFonts w:ascii="Times New Roman" w:hAnsi="Times New Roman" w:cs="Times New Roman"/>
-          <w:sz w:val="28"/>
-          <w:szCs w:val="28"/>
-        </w:rPr>
-        <w:t>useAuthStore.ts</w:t>
-      </w:r>
-      <w:proofErr w:type="spellEnd"/>
-      <w:r>
-        <w:rPr>
-          <w:rFonts w:ascii="Times New Roman" w:hAnsi="Times New Roman" w:cs="Times New Roman"/>
-          <w:sz w:val="28"/>
-          <w:szCs w:val="28"/>
-        </w:rPr>
-        <w:t>. But let me make sure they are correctly implemented. Open apps/web/store/</w:t>
-      </w:r>
-      <w:proofErr w:type="spellStart"/>
-      <w:r>
-        <w:rPr>
-          <w:rFonts w:ascii="Times New Roman" w:hAnsi="Times New Roman" w:cs="Times New Roman"/>
-          <w:sz w:val="28"/>
-          <w:szCs w:val="28"/>
-        </w:rPr>
-        <w:t>useAuthStore.ts</w:t>
-      </w:r>
-      <w:proofErr w:type="spellEnd"/>
-      <w:r>
-        <w:rPr>
-          <w:rFonts w:ascii="Times New Roman" w:hAnsi="Times New Roman" w:cs="Times New Roman"/>
-          <w:sz w:val="28"/>
-          <w:szCs w:val="28"/>
-        </w:rPr>
-        <w:t xml:space="preserve"> and verify these two helper functions exist at the top:</w:t>
+        <w:t>We already wrote the cookie helpers in useAuthStore.ts. But let me make sure they are correctly implemented. Open apps/web/store/useAuthStore.ts and verify these two helper functions exist at the top:</w:t>
       </w:r>
     </w:p>
     <w:p>
@@ -619,96 +465,24 @@
           <w:sz w:val="28"/>
           <w:szCs w:val="28"/>
         </w:rPr>
-        <w:t xml:space="preserve">│  </w:t>
-      </w:r>
-      <w:proofErr w:type="spellStart"/>
-      <w:r>
-        <w:rPr>
-          <w:rFonts w:ascii="Times New Roman" w:hAnsi="Times New Roman" w:cs="Times New Roman"/>
-          <w:sz w:val="28"/>
-          <w:szCs w:val="28"/>
-        </w:rPr>
-        <w:t>localStorage</w:t>
-      </w:r>
-      <w:proofErr w:type="spellEnd"/>
-      <w:r>
-        <w:rPr>
-          <w:rFonts w:ascii="Times New Roman" w:hAnsi="Times New Roman" w:cs="Times New Roman"/>
-          <w:sz w:val="28"/>
-          <w:szCs w:val="28"/>
-        </w:rPr>
-        <w:t>['</w:t>
-      </w:r>
-      <w:proofErr w:type="spellStart"/>
-      <w:r>
-        <w:rPr>
-          <w:rFonts w:ascii="Times New Roman" w:hAnsi="Times New Roman" w:cs="Times New Roman"/>
-          <w:sz w:val="28"/>
-          <w:szCs w:val="28"/>
-        </w:rPr>
-        <w:t>spendwise_token</w:t>
-      </w:r>
-      <w:proofErr w:type="spellEnd"/>
-      <w:r>
-        <w:rPr>
-          <w:rFonts w:ascii="Times New Roman" w:hAnsi="Times New Roman" w:cs="Times New Roman"/>
-          <w:sz w:val="28"/>
-          <w:szCs w:val="28"/>
-        </w:rPr>
-        <w:t>'] = "</w:t>
-      </w:r>
-      <w:proofErr w:type="spellStart"/>
-      <w:r>
-        <w:rPr>
-          <w:rFonts w:ascii="Times New Roman" w:hAnsi="Times New Roman" w:cs="Times New Roman"/>
-          <w:sz w:val="28"/>
-          <w:szCs w:val="28"/>
-        </w:rPr>
-        <w:t>eyJ</w:t>
-      </w:r>
-      <w:proofErr w:type="spellEnd"/>
-      <w:r>
-        <w:rPr>
-          <w:rFonts w:ascii="Times New Roman" w:hAnsi="Times New Roman" w:cs="Times New Roman"/>
-          <w:sz w:val="28"/>
-          <w:szCs w:val="28"/>
-        </w:rPr>
-        <w:t xml:space="preserve">..."     </w:t>
-      </w:r>
-    </w:p>
-    <w:p>
-      <w:pPr>
-        <w:rPr>
-          <w:rFonts w:ascii="Times New Roman" w:hAnsi="Times New Roman" w:cs="Times New Roman"/>
-          <w:sz w:val="28"/>
-          <w:szCs w:val="28"/>
-        </w:rPr>
-      </w:pPr>
-      <w:r>
-        <w:rPr>
-          <w:rFonts w:ascii="Times New Roman" w:hAnsi="Times New Roman" w:cs="Times New Roman"/>
-          <w:sz w:val="28"/>
-          <w:szCs w:val="28"/>
-        </w:rPr>
-        <w:t>│  → Used by: Axios interceptor (</w:t>
-      </w:r>
-      <w:proofErr w:type="spellStart"/>
-      <w:r>
-        <w:rPr>
-          <w:rFonts w:ascii="Times New Roman" w:hAnsi="Times New Roman" w:cs="Times New Roman"/>
-          <w:sz w:val="28"/>
-          <w:szCs w:val="28"/>
-        </w:rPr>
-        <w:t>api.ts</w:t>
-      </w:r>
-      <w:proofErr w:type="spellEnd"/>
-      <w:r>
-        <w:rPr>
-          <w:rFonts w:ascii="Times New Roman" w:hAnsi="Times New Roman" w:cs="Times New Roman"/>
-          <w:sz w:val="28"/>
-          <w:szCs w:val="28"/>
-        </w:rPr>
-        <w:t xml:space="preserve">)          </w:t>
+        <w:t xml:space="preserve">│  localStorage['spendwise_token'] = "eyJ..."     </w:t>
+      </w:r>
+    </w:p>
+    <w:p>
+      <w:pPr>
+        <w:rPr>
+          <w:rFonts w:ascii="Times New Roman" w:hAnsi="Times New Roman" w:cs="Times New Roman"/>
+          <w:sz w:val="28"/>
+          <w:szCs w:val="28"/>
+        </w:rPr>
+      </w:pPr>
+      <w:r>
+        <w:rPr>
+          <w:rFonts w:ascii="Times New Roman" w:hAnsi="Times New Roman" w:cs="Times New Roman"/>
+          <w:sz w:val="28"/>
+          <w:szCs w:val="28"/>
+        </w:rPr>
+        <w:t xml:space="preserve">│  → Used by: Axios interceptor (api.ts)          </w:t>
       </w:r>
     </w:p>
     <w:p>
@@ -785,78 +559,24 @@
           <w:sz w:val="28"/>
           <w:szCs w:val="28"/>
         </w:rPr>
-        <w:t>│  Cookie['</w:t>
-      </w:r>
-      <w:proofErr w:type="spellStart"/>
-      <w:r>
-        <w:rPr>
-          <w:rFonts w:ascii="Times New Roman" w:hAnsi="Times New Roman" w:cs="Times New Roman"/>
-          <w:sz w:val="28"/>
-          <w:szCs w:val="28"/>
-        </w:rPr>
-        <w:t>spendwise_token</w:t>
-      </w:r>
-      <w:proofErr w:type="spellEnd"/>
-      <w:r>
-        <w:rPr>
-          <w:rFonts w:ascii="Times New Roman" w:hAnsi="Times New Roman" w:cs="Times New Roman"/>
-          <w:sz w:val="28"/>
-          <w:szCs w:val="28"/>
-        </w:rPr>
-        <w:t>'] = "</w:t>
-      </w:r>
-      <w:proofErr w:type="spellStart"/>
-      <w:r>
-        <w:rPr>
-          <w:rFonts w:ascii="Times New Roman" w:hAnsi="Times New Roman" w:cs="Times New Roman"/>
-          <w:sz w:val="28"/>
-          <w:szCs w:val="28"/>
-        </w:rPr>
-        <w:t>eyJ</w:t>
-      </w:r>
-      <w:proofErr w:type="spellEnd"/>
-      <w:r>
-        <w:rPr>
-          <w:rFonts w:ascii="Times New Roman" w:hAnsi="Times New Roman" w:cs="Times New Roman"/>
-          <w:sz w:val="28"/>
-          <w:szCs w:val="28"/>
-        </w:rPr>
-        <w:t xml:space="preserve">..."           </w:t>
-      </w:r>
-    </w:p>
-    <w:p>
-      <w:pPr>
-        <w:rPr>
-          <w:rFonts w:ascii="Times New Roman" w:hAnsi="Times New Roman" w:cs="Times New Roman"/>
-          <w:sz w:val="28"/>
-          <w:szCs w:val="28"/>
-        </w:rPr>
-      </w:pPr>
-      <w:r>
-        <w:rPr>
-          <w:rFonts w:ascii="Times New Roman" w:hAnsi="Times New Roman" w:cs="Times New Roman"/>
-          <w:sz w:val="28"/>
-          <w:szCs w:val="28"/>
-        </w:rPr>
-        <w:t xml:space="preserve">│  → Used by: </w:t>
-      </w:r>
-      <w:proofErr w:type="spellStart"/>
-      <w:r>
-        <w:rPr>
-          <w:rFonts w:ascii="Times New Roman" w:hAnsi="Times New Roman" w:cs="Times New Roman"/>
-          <w:sz w:val="28"/>
-          <w:szCs w:val="28"/>
-        </w:rPr>
-        <w:t>middleware.ts</w:t>
-      </w:r>
-      <w:proofErr w:type="spellEnd"/>
-      <w:r>
-        <w:rPr>
-          <w:rFonts w:ascii="Times New Roman" w:hAnsi="Times New Roman" w:cs="Times New Roman"/>
-          <w:sz w:val="28"/>
-          <w:szCs w:val="28"/>
-        </w:rPr>
-        <w:t xml:space="preserve">                       </w:t>
+        <w:t xml:space="preserve">│  Cookie['spendwise_token'] = "eyJ..."           </w:t>
+      </w:r>
+    </w:p>
+    <w:p>
+      <w:pPr>
+        <w:rPr>
+          <w:rFonts w:ascii="Times New Roman" w:hAnsi="Times New Roman" w:cs="Times New Roman"/>
+          <w:sz w:val="28"/>
+          <w:szCs w:val="28"/>
+        </w:rPr>
+      </w:pPr>
+      <w:r>
+        <w:rPr>
+          <w:rFonts w:ascii="Times New Roman" w:hAnsi="Times New Roman" w:cs="Times New Roman"/>
+          <w:sz w:val="28"/>
+          <w:szCs w:val="28"/>
+        </w:rPr>
+        <w:t xml:space="preserve">│  → Used by: middleware.ts                       </w:t>
       </w:r>
     </w:p>
     <w:p>
@@ -1089,27 +809,7 @@
           <w:sz w:val="28"/>
           <w:szCs w:val="28"/>
         </w:rPr>
-        <w:t xml:space="preserve">Claude </w:t>
-      </w:r>
-      <w:proofErr w:type="spellStart"/>
-      <w:r>
-        <w:rPr>
-          <w:rFonts w:ascii="Times New Roman" w:hAnsi="Times New Roman" w:cs="Times New Roman"/>
-          <w:color w:val="00B0F0"/>
-          <w:sz w:val="28"/>
-          <w:szCs w:val="28"/>
-        </w:rPr>
-        <w:t>api</w:t>
-      </w:r>
-      <w:proofErr w:type="spellEnd"/>
-      <w:r>
-        <w:rPr>
-          <w:rFonts w:ascii="Times New Roman" w:hAnsi="Times New Roman" w:cs="Times New Roman"/>
-          <w:color w:val="00B0F0"/>
-          <w:sz w:val="28"/>
-          <w:szCs w:val="28"/>
-        </w:rPr>
-        <w:t xml:space="preserve"> key= ‘sk-9fb5a0dea035427c9f362adcf1ed5187’</w:t>
+        <w:t>Claude api key= ‘sk-9fb5a0dea035427c9f362adcf1ed5187’</w:t>
       </w:r>
     </w:p>
     <w:p>
@@ -1269,25 +969,7 @@
           <w:sz w:val="28"/>
           <w:szCs w:val="28"/>
         </w:rPr>
-        <w:t xml:space="preserve">    Run all test cases: </w:t>
-      </w:r>
-      <w:proofErr w:type="spellStart"/>
-      <w:r>
-        <w:rPr>
-          <w:rFonts w:ascii="Times New Roman" w:hAnsi="Times New Roman" w:cs="Times New Roman"/>
-          <w:sz w:val="28"/>
-          <w:szCs w:val="28"/>
-        </w:rPr>
-        <w:t>npm</w:t>
-      </w:r>
-      <w:proofErr w:type="spellEnd"/>
-      <w:r>
-        <w:rPr>
-          <w:rFonts w:ascii="Times New Roman" w:hAnsi="Times New Roman" w:cs="Times New Roman"/>
-          <w:sz w:val="28"/>
-          <w:szCs w:val="28"/>
-        </w:rPr>
-        <w:t xml:space="preserve"> run test</w:t>
+        <w:t xml:space="preserve">    Run all test cases: npm run test</w:t>
       </w:r>
     </w:p>
     <w:p>
@@ -1339,7 +1021,6 @@
         </w:rPr>
         <w:t xml:space="preserve">              </w:t>
       </w:r>
-      <w:proofErr w:type="spellStart"/>
       <w:r>
         <w:rPr>
           <w:rFonts w:ascii="Times New Roman" w:hAnsi="Times New Roman" w:cs="Times New Roman"/>
@@ -1354,27 +1035,8 @@
           <w:sz w:val="28"/>
           <w:szCs w:val="28"/>
         </w:rPr>
-        <w:t>pm</w:t>
-      </w:r>
-      <w:proofErr w:type="spellEnd"/>
-      <w:r>
-        <w:rPr>
-          <w:rFonts w:ascii="Times New Roman" w:hAnsi="Times New Roman" w:cs="Times New Roman"/>
-          <w:sz w:val="28"/>
-          <w:szCs w:val="28"/>
-        </w:rPr>
-        <w:t xml:space="preserve"> run </w:t>
-      </w:r>
-      <w:proofErr w:type="spellStart"/>
-      <w:r>
-        <w:rPr>
-          <w:rFonts w:ascii="Times New Roman" w:hAnsi="Times New Roman" w:cs="Times New Roman"/>
-          <w:sz w:val="28"/>
-          <w:szCs w:val="28"/>
-        </w:rPr>
-        <w:t>test:coverage</w:t>
-      </w:r>
-      <w:proofErr w:type="spellEnd"/>
+        <w:t>pm run test:coverage</w:t>
+      </w:r>
     </w:p>
     <w:p>
       <w:pPr>
@@ -1485,9 +1147,17 @@
           <w:sz w:val="28"/>
           <w:szCs w:val="28"/>
         </w:rPr>
-        <w:t xml:space="preserve">in </w:t>
-      </w:r>
-      <w:proofErr w:type="spellStart"/>
+        <w:t>in Dockerfile</w:t>
+      </w:r>
+    </w:p>
+    <w:p>
+      <w:pPr>
+        <w:rPr>
+          <w:rFonts w:ascii="Times New Roman" w:hAnsi="Times New Roman" w:cs="Times New Roman"/>
+          <w:sz w:val="28"/>
+          <w:szCs w:val="28"/>
+        </w:rPr>
+      </w:pPr>
       <w:r>
         <w:rPr>
           <w:rFonts w:ascii="Times New Roman" w:hAnsi="Times New Roman" w:cs="Times New Roman"/>
@@ -1496,9 +1166,59 @@
           <w:sz w:val="28"/>
           <w:szCs w:val="28"/>
         </w:rPr>
-        <w:t>Dockerfile</w:t>
-      </w:r>
-      <w:proofErr w:type="spellEnd"/>
+        <w:t>multi-stage builds:</w:t>
+      </w:r>
+      <w:r>
+        <w:rPr>
+          <w:rFonts w:ascii="Times New Roman" w:hAnsi="Times New Roman" w:cs="Times New Roman"/>
+          <w:sz w:val="28"/>
+          <w:szCs w:val="28"/>
+        </w:rPr>
+        <w:t xml:space="preserve"> </w:t>
+      </w:r>
+    </w:p>
+    <w:p>
+      <w:pPr>
+        <w:rPr>
+          <w:rFonts w:ascii="Times New Roman" w:hAnsi="Times New Roman" w:cs="Times New Roman"/>
+          <w:sz w:val="28"/>
+          <w:szCs w:val="28"/>
+        </w:rPr>
+      </w:pPr>
+      <w:r>
+        <w:rPr>
+          <w:rFonts w:ascii="Times New Roman" w:hAnsi="Times New Roman" w:cs="Times New Roman"/>
+          <w:sz w:val="28"/>
+          <w:szCs w:val="28"/>
+        </w:rPr>
+        <w:t xml:space="preserve">Stage 1 has everything needed to BUILD the app (TypeScript compiler, all packages). </w:t>
+      </w:r>
+    </w:p>
+    <w:p>
+      <w:pPr>
+        <w:rPr>
+          <w:rFonts w:ascii="Times New Roman" w:hAnsi="Times New Roman" w:cs="Times New Roman"/>
+          <w:sz w:val="28"/>
+          <w:szCs w:val="28"/>
+        </w:rPr>
+      </w:pPr>
+      <w:r>
+        <w:rPr>
+          <w:rFonts w:ascii="Times New Roman" w:hAnsi="Times New Roman" w:cs="Times New Roman"/>
+          <w:sz w:val="28"/>
+          <w:szCs w:val="28"/>
+        </w:rPr>
+        <w:t>Stage 2 only copies the final compiled result. This is exactly how professional companies ship Node.js apps — smaller image, faster deploys, fewer security vulnerabilities since dev tools aren't shipped.</w:t>
+      </w:r>
+    </w:p>
+    <w:p>
+      <w:pPr>
+        <w:rPr>
+          <w:rFonts w:ascii="Times New Roman" w:hAnsi="Times New Roman" w:cs="Times New Roman"/>
+          <w:sz w:val="28"/>
+          <w:szCs w:val="28"/>
+        </w:rPr>
+      </w:pPr>
     </w:p>
     <w:p>
       <w:pPr>
@@ -1516,69 +1236,25 @@
           <w:sz w:val="28"/>
           <w:szCs w:val="28"/>
         </w:rPr>
-        <w:t>multi-stage builds:</w:t>
-      </w:r>
-      <w:r>
-        <w:rPr>
-          <w:rFonts w:ascii="Times New Roman" w:hAnsi="Times New Roman" w:cs="Times New Roman"/>
-          <w:sz w:val="28"/>
-          <w:szCs w:val="28"/>
-        </w:rPr>
-        <w:t xml:space="preserve"> </w:t>
-      </w:r>
-    </w:p>
-    <w:p>
-      <w:pPr>
-        <w:rPr>
-          <w:rFonts w:ascii="Times New Roman" w:hAnsi="Times New Roman" w:cs="Times New Roman"/>
-          <w:sz w:val="28"/>
-          <w:szCs w:val="28"/>
-        </w:rPr>
-      </w:pPr>
-      <w:r>
-        <w:rPr>
-          <w:rFonts w:ascii="Times New Roman" w:hAnsi="Times New Roman" w:cs="Times New Roman"/>
-          <w:sz w:val="28"/>
-          <w:szCs w:val="28"/>
-        </w:rPr>
-        <w:t xml:space="preserve">Stage 1 has everything needed to BUILD the app (TypeScript compiler, all packages). </w:t>
-      </w:r>
-    </w:p>
-    <w:p>
-      <w:pPr>
-        <w:rPr>
-          <w:rFonts w:ascii="Times New Roman" w:hAnsi="Times New Roman" w:cs="Times New Roman"/>
-          <w:sz w:val="28"/>
-          <w:szCs w:val="28"/>
-        </w:rPr>
-      </w:pPr>
-      <w:r>
-        <w:rPr>
-          <w:rFonts w:ascii="Times New Roman" w:hAnsi="Times New Roman" w:cs="Times New Roman"/>
-          <w:sz w:val="28"/>
-          <w:szCs w:val="28"/>
-        </w:rPr>
-        <w:t>Stage 2 only copies the final compiled result. This is exactly how professional companies ship Node.js apps — smaller image, faster deploys, fewer security vulnerabilities since dev tools aren't shipped.</w:t>
-      </w:r>
-    </w:p>
-    <w:p>
-      <w:pPr>
-        <w:rPr>
-          <w:rFonts w:ascii="Times New Roman" w:hAnsi="Times New Roman" w:cs="Times New Roman"/>
-          <w:sz w:val="28"/>
-          <w:szCs w:val="28"/>
-        </w:rPr>
-      </w:pPr>
-    </w:p>
-    <w:p>
-      <w:pPr>
-        <w:rPr>
-          <w:rFonts w:ascii="Times New Roman" w:hAnsi="Times New Roman" w:cs="Times New Roman"/>
-          <w:sz w:val="28"/>
-          <w:szCs w:val="28"/>
-        </w:rPr>
-      </w:pPr>
-      <w:proofErr w:type="spellStart"/>
+        <w:lastRenderedPageBreak/>
+        <w:t xml:space="preserve">Dockerfile = </w:t>
+      </w:r>
+      <w:r>
+        <w:rPr>
+          <w:rFonts w:ascii="Times New Roman" w:hAnsi="Times New Roman" w:cs="Times New Roman"/>
+          <w:sz w:val="28"/>
+          <w:szCs w:val="28"/>
+        </w:rPr>
+        <w:t>tells Docker how to build ONE container.</w:t>
+      </w:r>
+      <w:r>
+        <w:rPr>
+          <w:rFonts w:ascii="Times New Roman" w:hAnsi="Times New Roman" w:cs="Times New Roman"/>
+          <w:sz w:val="28"/>
+          <w:szCs w:val="28"/>
+        </w:rPr>
+        <w:br/>
+      </w:r>
       <w:r>
         <w:rPr>
           <w:rFonts w:ascii="Times New Roman" w:hAnsi="Times New Roman" w:cs="Times New Roman"/>
@@ -1587,67 +1263,7 @@
           <w:sz w:val="28"/>
           <w:szCs w:val="28"/>
         </w:rPr>
-        <w:lastRenderedPageBreak/>
-        <w:t>Dockerfile</w:t>
-      </w:r>
-      <w:proofErr w:type="spellEnd"/>
-      <w:r>
-        <w:rPr>
-          <w:rFonts w:ascii="Times New Roman" w:hAnsi="Times New Roman" w:cs="Times New Roman"/>
-          <w:b/>
-          <w:bCs/>
-          <w:sz w:val="28"/>
-          <w:szCs w:val="28"/>
-        </w:rPr>
-        <w:t xml:space="preserve"> = </w:t>
-      </w:r>
-      <w:r>
-        <w:rPr>
-          <w:rFonts w:ascii="Times New Roman" w:hAnsi="Times New Roman" w:cs="Times New Roman"/>
-          <w:sz w:val="28"/>
-          <w:szCs w:val="28"/>
-        </w:rPr>
-        <w:t>tells Docker how to build ONE container.</w:t>
-      </w:r>
-      <w:r>
-        <w:rPr>
-          <w:rFonts w:ascii="Times New Roman" w:hAnsi="Times New Roman" w:cs="Times New Roman"/>
-          <w:sz w:val="28"/>
-          <w:szCs w:val="28"/>
-        </w:rPr>
-        <w:br/>
-      </w:r>
-      <w:r>
-        <w:rPr>
-          <w:rFonts w:ascii="Times New Roman" w:hAnsi="Times New Roman" w:cs="Times New Roman"/>
-          <w:b/>
-          <w:bCs/>
-          <w:sz w:val="28"/>
-          <w:szCs w:val="28"/>
-        </w:rPr>
-        <w:t>docker-</w:t>
-      </w:r>
-      <w:proofErr w:type="spellStart"/>
-      <w:r>
-        <w:rPr>
-          <w:rFonts w:ascii="Times New Roman" w:hAnsi="Times New Roman" w:cs="Times New Roman"/>
-          <w:b/>
-          <w:bCs/>
-          <w:sz w:val="28"/>
-          <w:szCs w:val="28"/>
-        </w:rPr>
-        <w:t>compose.yml</w:t>
-      </w:r>
-      <w:proofErr w:type="spellEnd"/>
-      <w:r>
-        <w:rPr>
-          <w:rFonts w:ascii="Times New Roman" w:hAnsi="Times New Roman" w:cs="Times New Roman"/>
-          <w:b/>
-          <w:bCs/>
-          <w:sz w:val="28"/>
-          <w:szCs w:val="28"/>
-        </w:rPr>
-        <w:t xml:space="preserve"> = </w:t>
+        <w:t xml:space="preserve">docker-compose.yml = </w:t>
       </w:r>
       <w:r>
         <w:rPr>
@@ -1706,25 +1322,7 @@
           <w:sz w:val="28"/>
           <w:szCs w:val="28"/>
         </w:rPr>
-        <w:t>New-Item -ItemType File -Name "docker-</w:t>
-      </w:r>
-      <w:proofErr w:type="spellStart"/>
-      <w:r>
-        <w:rPr>
-          <w:rFonts w:ascii="Times New Roman" w:hAnsi="Times New Roman" w:cs="Times New Roman"/>
-          <w:sz w:val="28"/>
-          <w:szCs w:val="28"/>
-        </w:rPr>
-        <w:t>compose.yml</w:t>
-      </w:r>
-      <w:proofErr w:type="spellEnd"/>
-      <w:r>
-        <w:rPr>
-          <w:rFonts w:ascii="Times New Roman" w:hAnsi="Times New Roman" w:cs="Times New Roman"/>
-          <w:sz w:val="28"/>
-          <w:szCs w:val="28"/>
-        </w:rPr>
-        <w:t>"</w:t>
+        <w:t>New-Item -ItemType File -Name "docker-compose.yml"</w:t>
       </w:r>
     </w:p>
     <w:p>
@@ -2707,6 +2305,100 @@
           <w:szCs w:val="28"/>
         </w:rPr>
       </w:pPr>
+    </w:p>
+    <w:p>
+      <w:pPr>
+        <w:rPr>
+          <w:rFonts w:ascii="Times New Roman" w:hAnsi="Times New Roman" w:cs="Times New Roman"/>
+          <w:sz w:val="28"/>
+          <w:szCs w:val="28"/>
+        </w:rPr>
+      </w:pPr>
+    </w:p>
+    <w:p>
+      <w:pPr>
+        <w:rPr>
+          <w:rFonts w:ascii="Times New Roman" w:hAnsi="Times New Roman" w:cs="Times New Roman"/>
+          <w:sz w:val="28"/>
+          <w:szCs w:val="28"/>
+        </w:rPr>
+      </w:pPr>
+    </w:p>
+    <w:p>
+      <w:pPr>
+        <w:rPr>
+          <w:rFonts w:ascii="Times New Roman" w:hAnsi="Times New Roman" w:cs="Times New Roman"/>
+          <w:sz w:val="28"/>
+          <w:szCs w:val="28"/>
+        </w:rPr>
+      </w:pPr>
+    </w:p>
+    <w:p>
+      <w:pPr>
+        <w:rPr>
+          <w:rFonts w:ascii="Times New Roman" w:hAnsi="Times New Roman" w:cs="Times New Roman"/>
+          <w:sz w:val="28"/>
+          <w:szCs w:val="28"/>
+        </w:rPr>
+      </w:pPr>
+    </w:p>
+    <w:p>
+      <w:pPr>
+        <w:rPr>
+          <w:rFonts w:ascii="Times New Roman" w:hAnsi="Times New Roman" w:cs="Times New Roman"/>
+          <w:sz w:val="28"/>
+          <w:szCs w:val="28"/>
+        </w:rPr>
+      </w:pPr>
+      <w:r>
+        <w:rPr>
+          <w:rFonts w:ascii="Times New Roman" w:hAnsi="Times New Roman" w:cs="Times New Roman"/>
+          <w:sz w:val="28"/>
+          <w:szCs w:val="28"/>
+        </w:rPr>
+        <w:t xml:space="preserve">brother when i run my spendwise project , i got this error..PS D:\spendwise\apps\web&gt; npm run dev &gt; web@0.1.0 dev &gt; next dev ▲ Next.js 16.2.4 (Turbopack) - Local: http://localhost:3000 - Network: http://172.22.32.1:3000 - Environments: .env.local </w:t>
+      </w:r>
+      <w:r>
+        <w:rPr>
+          <w:rFonts w:ascii="Segoe UI Symbol" w:hAnsi="Segoe UI Symbol" w:cs="Segoe UI Symbol"/>
+          <w:sz w:val="28"/>
+          <w:szCs w:val="28"/>
+        </w:rPr>
+        <w:t>✓</w:t>
+      </w:r>
+      <w:r>
+        <w:rPr>
+          <w:rFonts w:ascii="Times New Roman" w:hAnsi="Times New Roman" w:cs="Times New Roman"/>
+          <w:sz w:val="28"/>
+          <w:szCs w:val="28"/>
+        </w:rPr>
+        <w:t xml:space="preserve"> Ready in 6.5s </w:t>
+      </w:r>
+      <w:r>
+        <w:rPr>
+          <w:rFonts w:ascii="Segoe UI Symbol" w:hAnsi="Segoe UI Symbol" w:cs="Segoe UI Symbol"/>
+          <w:sz w:val="28"/>
+          <w:szCs w:val="28"/>
+        </w:rPr>
+        <w:t>⚠</w:t>
+      </w:r>
+      <w:r>
+        <w:rPr>
+          <w:rFonts w:ascii="Times New Roman" w:hAnsi="Times New Roman" w:cs="Times New Roman"/>
+          <w:sz w:val="28"/>
+          <w:szCs w:val="28"/>
+        </w:rPr>
+        <w:t xml:space="preserve"> Slow filesystem detected. The benchmark took 504ms. If D:\spendwise\apps/web/.next/dev is a network drive, consider moving it to a local folder. See more: https://nextjs.org/docs/app/guides/local-development ○ Compiling / ... GET / 200 in 20.3s (next.js: 18.0s, proxy.ts: 1303ms, application-code: 1092ms) [browser] Uncaught Error: Hydration failed because the server rendered text didn't match the client. As a result this tree will be regenerated on the client. This can happen if a SSR-ed Client Component used: - A server/client branch `if (typeof window !== 'undefined')`. - Variable input such as `Date.now()` or `Math.random()` which changes each time it's called. - Date formatting in a user's locale which doesn't match the server. - External changing data without sending a snapshot of it along with the HTML. - Invalid HTML tag nesting. It can also happen if the client has a browser extension installed which messes with the HTML before React loaded. https://react.dev/link/hydration-mismatch ... &lt;HTTPAccessFallbackBoundary notFound={{...}} forbidden={undefined} unauthorized={undefined}&gt; &lt;HTTPAccessFallbackErrorBoundary pathname="/" notFound={{...}} forbidden={undefined} unauthorized={undefined} ...&gt; &lt;RedirectBoundary&gt; &lt;RedirectErrorBoundary router={{...}}&gt; &lt;InnerLayoutRouter url="/" tree={[...]} params={{}} cacheNode={{rsc:{...}, ...}} segmentPath={[...]} ...&gt; &lt;SegmentViewNode type="page" pagePath="page.tsx"&gt; &lt;SegmentTrieNode&gt; &lt;LandingPage&gt; &lt;div style={{...}}&gt; &lt;MarketingNavbar&gt; &lt;header style={{position:"...", ...}}&gt; &lt;div style={{maxWidth:"...", ...}}&gt; &lt;LinkComponent&gt; &lt;nav style={{display:"flex", ...}}&gt; &lt;a&gt; &lt;a&gt; &lt;LinkComponent href="/dashboard" className="btn btn-pr..."&gt; &lt;a + className="btn btn-primary btn-sm" - className={null} ref={function} onClick={function onClick} onMouseEnter={function onMouseEnter} onTouchStart={function onTouchStart} + href="/dashboard" - href="/login" - style={{font-size:"13px",color:"var(--ink-...",text-decoration-line:"none", ...}} &gt; + Go to Dashboard - Sign in ... ... ... at &lt;unknown&gt; (https://react.dev/link/hydration-mismatch) at a (&lt;anonymous&gt;) at MarketingNavbar (components/marketing/MarketingNavbar.tsx:43:25) at </w:t>
+      </w:r>
+      <w:r>
+        <w:rPr>
+          <w:rFonts w:ascii="Times New Roman" w:hAnsi="Times New Roman" w:cs="Times New Roman"/>
+          <w:sz w:val="28"/>
+          <w:szCs w:val="28"/>
+        </w:rPr>
+        <w:lastRenderedPageBreak/>
+        <w:t>LandingPage (app\page.tsx:17:7) GET /dashboard 200 in 610ms (next.js: 174ms, proxy.ts: 200ms, application-code: 237ms) GET /login 200 in 737ms (next.js: 202ms, proxy.ts: 15ms, application-code: 520ms) GET /login 200 in 498ms (next.js: 53ms, proxy.ts: 64ms, application-code: 381ms) GET /register 200 in 592ms (next.js: 224ms, proxy.ts: 14ms, application-code: 354ms) GET /register 200 in 197ms (next.js: 29ms, proxy.ts: 31ms, application-code: 136ms) GET /login 200 in 317ms (next.js: 98ms, proxy.ts: 10ms, application-code: 209ms)................why this happen and can you fix this and make sure pages links correctly after adding landing page</w:t>
+      </w:r>
     </w:p>
     <w:sectPr>
       <w:pgSz w:w="12240" w:h="15840"/>

</xml_diff>

<commit_message>
add Google OAuth sign-in with Identity Services properly
</commit_message>
<xml_diff>
--- a/Spendwise Important Points.docx
+++ b/Spendwise Important Points.docx
@@ -2398,6 +2398,92 @@
         </w:rPr>
         <w:lastRenderedPageBreak/>
         <w:t>LandingPage (app\page.tsx:17:7) GET /dashboard 200 in 610ms (next.js: 174ms, proxy.ts: 200ms, application-code: 237ms) GET /login 200 in 737ms (next.js: 202ms, proxy.ts: 15ms, application-code: 520ms) GET /login 200 in 498ms (next.js: 53ms, proxy.ts: 64ms, application-code: 381ms) GET /register 200 in 592ms (next.js: 224ms, proxy.ts: 14ms, application-code: 354ms) GET /register 200 in 197ms (next.js: 29ms, proxy.ts: 31ms, application-code: 136ms) GET /login 200 in 317ms (next.js: 98ms, proxy.ts: 10ms, application-code: 209ms)................why this happen and can you fix this and make sure pages links correctly after adding landing page</w:t>
+      </w:r>
+    </w:p>
+    <w:p>
+      <w:pPr>
+        <w:rPr>
+          <w:rFonts w:ascii="Times New Roman" w:hAnsi="Times New Roman" w:cs="Times New Roman"/>
+          <w:sz w:val="28"/>
+          <w:szCs w:val="28"/>
+        </w:rPr>
+      </w:pPr>
+    </w:p>
+    <w:p>
+      <w:pPr>
+        <w:rPr>
+          <w:rFonts w:ascii="Times New Roman" w:hAnsi="Times New Roman" w:cs="Times New Roman"/>
+          <w:sz w:val="28"/>
+          <w:szCs w:val="28"/>
+        </w:rPr>
+      </w:pPr>
+    </w:p>
+    <w:p>
+      <w:pPr>
+        <w:rPr>
+          <w:rFonts w:ascii="Times New Roman" w:hAnsi="Times New Roman" w:cs="Times New Roman"/>
+          <w:sz w:val="28"/>
+          <w:szCs w:val="28"/>
+        </w:rPr>
+      </w:pPr>
+    </w:p>
+    <w:p>
+      <w:pPr>
+        <w:rPr>
+          <w:rFonts w:ascii="Times New Roman" w:hAnsi="Times New Roman" w:cs="Times New Roman"/>
+          <w:sz w:val="28"/>
+          <w:szCs w:val="28"/>
+        </w:rPr>
+      </w:pPr>
+      <w:r>
+        <w:rPr>
+          <w:rFonts w:ascii="Times New Roman" w:hAnsi="Times New Roman" w:cs="Times New Roman"/>
+          <w:sz w:val="28"/>
+          <w:szCs w:val="28"/>
+        </w:rPr>
+        <w:t xml:space="preserve">client_ID: </w:t>
+      </w:r>
+      <w:r>
+        <w:rPr>
+          <w:rFonts w:ascii="Times New Roman" w:hAnsi="Times New Roman" w:cs="Times New Roman"/>
+          <w:sz w:val="28"/>
+          <w:szCs w:val="28"/>
+        </w:rPr>
+        <w:t>55857934200-p181kbldbld5be2lpmou291rdekjb9hb.apps.googleusercontent.com</w:t>
+      </w:r>
+    </w:p>
+    <w:p>
+      <w:pPr>
+        <w:rPr>
+          <w:rFonts w:ascii="Times New Roman" w:hAnsi="Times New Roman" w:cs="Times New Roman"/>
+          <w:sz w:val="28"/>
+          <w:szCs w:val="28"/>
+        </w:rPr>
+      </w:pPr>
+    </w:p>
+    <w:p>
+      <w:pPr>
+        <w:rPr>
+          <w:rFonts w:ascii="Times New Roman" w:hAnsi="Times New Roman" w:cs="Times New Roman"/>
+          <w:sz w:val="28"/>
+          <w:szCs w:val="28"/>
+        </w:rPr>
+      </w:pPr>
+      <w:r>
+        <w:rPr>
+          <w:rFonts w:ascii="Times New Roman" w:hAnsi="Times New Roman" w:cs="Times New Roman"/>
+          <w:sz w:val="28"/>
+          <w:szCs w:val="28"/>
+        </w:rPr>
+        <w:t xml:space="preserve">client_secret: </w:t>
+      </w:r>
+      <w:r>
+        <w:rPr>
+          <w:rFonts w:ascii="Times New Roman" w:hAnsi="Times New Roman" w:cs="Times New Roman"/>
+          <w:sz w:val="28"/>
+          <w:szCs w:val="28"/>
+        </w:rPr>
+        <w:t>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</w:t>
       </w:r>
     </w:p>
     <w:sectPr>
@@ -3286,6 +3372,7 @@
   <w:style w:type="character" w:default="1" w:styleId="DefaultParagraphFont">
     <w:name w:val="Default Paragraph Font"/>
     <w:uiPriority w:val="1"/>
+    <w:semiHidden/>
     <w:unhideWhenUsed/>
   </w:style>
   <w:style w:type="table" w:default="1" w:styleId="TableNormal">

</xml_diff>